<commit_message>
Add second author (Petra Palić); fix broken HTML preview link
- Petra Palić, izv. dr. sc., added as co-author with the same
  affiliation, in the manuscript title block, corresponding-author
  footnote clarified to Šikić, and the Croatian Sažetak byline --
  re-rendered to HTML/PDF/DOCX.
- README HTML link pointed to a nonexistent 'main' branch (repo's
  default branch is 'master'), causing a 404 on raw.githack.com;
  corrected and made a proper live-view link.
</commit_message>
<xml_diff>
--- a/paper/paper.docx
+++ b/paper/paper.docx
@@ -51,6 +51,39 @@
         <w:pStyle w:val="BodyText"/>
       </w:pPr>
       <w:r>
+        <w:rPr>
+          <w:b/>
+          <w:bCs/>
+        </w:rPr>
+        <w:t xml:space="preserve">PETRA PALIĆ</w:t>
+      </w:r>
+      <w:r>
+        <w:t xml:space="preserve">, izv. dr. sc.</w:t>
+      </w:r>
+      <w:r>
+        <w:t xml:space="preserve"> </w:t>
+      </w:r>
+      <w:r>
+        <w:t xml:space="preserve">Catholic University of Croatia (Hrvatsko katoličko sveučilište)</w:t>
+      </w:r>
+      <w:r>
+        <w:t xml:space="preserve"> </w:t>
+      </w:r>
+      <w:r>
+        <w:t xml:space="preserve">Department of Communication Studies</w:t>
+      </w:r>
+      <w:r>
+        <w:t xml:space="preserve"> </w:t>
+      </w:r>
+      <w:r>
+        <w:t xml:space="preserve">Zagreb, Croatia</w:t>
+      </w:r>
+    </w:p>
+    <w:p>
+      <w:pPr>
+        <w:pStyle w:val="BodyText"/>
+      </w:pPr>
+      <w:r>
         <w:t xml:space="preserve">Original scientific paper</w:t>
       </w:r>
       <w:r>
@@ -121,7 +154,7 @@
         <w:pStyle w:val="FirstParagraph"/>
       </w:pPr>
       <w:r>
-        <w:t xml:space="preserve">* Luka Šikić, Catholic University of Croatia, Department of Communication Studies / Hrvatsko katoličko sveučilište, Odjel za komunikologiju, Ilica 242, 10000 Zagreb, Croatia / Hrvatska, luka.sikic.gm@gmail.com</w:t>
+        <w:t xml:space="preserve">* Corresponding author: Luka Šikić, Catholic University of Croatia, Department of Communication Studies / Hrvatsko katoličko sveučilište, Odjel za komunikologiju, Ilica 242, 10000 Zagreb, Croatia / Hrvatska, luka.sikic.gm@gmail.com</w:t>
       </w:r>
     </w:p>
     <w:p>
@@ -8177,6 +8210,41 @@
           <w:bCs/>
         </w:rPr>
         <w:t xml:space="preserve">Luka Šikić</w:t>
+      </w:r>
+      <w:r>
+        <w:t xml:space="preserve"> </w:t>
+      </w:r>
+      <w:r>
+        <w:rPr>
+          <w:i/>
+          <w:iCs/>
+        </w:rPr>
+        <w:t xml:space="preserve">Hrvatsko katoličko sveučilište, Odjel za komunikologiju</w:t>
+      </w:r>
+      <w:r>
+        <w:t xml:space="preserve"> </w:t>
+      </w:r>
+      <w:r>
+        <w:rPr>
+          <w:i/>
+          <w:iCs/>
+        </w:rPr>
+        <w:t xml:space="preserve">Zagreb, Hrvatska</w:t>
+      </w:r>
+    </w:p>
+    <w:p>
+      <w:pPr>
+        <w:pStyle w:val="BodyText"/>
+      </w:pPr>
+      <w:r>
+        <w:rPr>
+          <w:b/>
+          <w:bCs/>
+        </w:rPr>
+        <w:t xml:space="preserve">Petra Palić</w:t>
+      </w:r>
+      <w:r>
+        <w:t xml:space="preserve">, izv. dr. sc.</w:t>
       </w:r>
       <w:r>
         <w:t xml:space="preserve"> </w:t>

</xml_diff>

<commit_message>
Rewrite prose style: remove em-dashes and semicolons throughout
Every paragraph rewritten into plain declarative sentences (comma-based
subordination, short sentences, minimal punctuation tricks), matching
the house style of Rev. soc. polit. rather than dash/semicolon-heavy
prose. All numbers, hedges, and reviewer-mandated verdicts (H1 partially
supported, P3 visibility-only, P4 partly-by-construction, the 72%
upper-bound caveat) verified unchanged across every location, including
the Croatian Sažetak. Re-rendered to HTML/PDF/DOCX.
</commit_message>
<xml_diff>
--- a/paper/paper.docx
+++ b/paper/paper.docx
@@ -102,7 +102,7 @@
         <w:t xml:space="preserve"> </w:t>
       </w:r>
       <w:r>
-        <w:t xml:space="preserve">Received: [month, year — assigned on submission]</w:t>
+        <w:t xml:space="preserve">Received: [month and year, assigned upon submission]</w:t>
       </w:r>
     </w:p>
     <w:p>
@@ -121,7 +121,7 @@
           <w:i/>
           <w:iCs/>
         </w:rPr>
-        <w:t xml:space="preserve">Catholic Social Teaching (CST) assigns the Church a distinctive voice in economic hardship: to name inflation as an injustice that falls hardest on the poor. We ask what that voice actually sounds like in a national digital media space during a cost-of-living shock. Using the DigiKat corpus — 710,307 religion-salient Croatian/Bosnian media posts (January 2021–June 2026) — we isolate every post that mentions inflation and, crucially, distinguish genuine religion–inflation linkage from incidental co-occurrence. Most co-mentions prove incidental; after coding 1,450 proximity-selected candidates with three independent large-language-model annotators (inter-annotator agreement 0.97; human validation pending) and setting aside foreign-country inflation, a measured domestic core of 520 posts remains — 0.07% of the (web-portal-dominated) corpus and 6.5% of inflation-mentioning posts. Within it, religion meets inflation overwhelmingly as an economic object: a macro-register combining the rising cost of religious life and the Church-as-institution accounts for ≈72% (individually 37% and 34%, an ordering within coding noise; an upper bound on the object reading, since the institution register includes clergy as commentators). Charity accounts for 17%, while the structural / CST-justice register is marginal — 3% under strict coding, at most ≈8% if latent structural framing in adjacent posts is counted. We formalize and evaluate four theory-derived expectations. Media inflation-attention is strongly price-coupled (H1 partially supported: Pearson r ≈ 0.73 with the Croatian HICP within the seam-free monitoring window, with 2.4-fold higher mean attention above the literature-derived ≈4% threshold, though energy couples only weakly), and religious coverage appears to resonate with rather than lead real conditions (H2, provisional); yet the religious justice voice does not fill that attention (P3: not visible in the digital-news measure; the actor-level claim is not testable here); framing is episodic rather than thematic (P4 supported, in part by construction). We argue that the justice-centred frame CST foregrounds has low visibility in the digital public sphere — the Church surfaces as an institution whose services became more expensive, not as a prophetic voice — while cautioning that media-visibility is a weak proxy for the institution’s conduct. Beyond the substantive finding, the paper offers a transferable methodological caution: in keyword-filtered corpora, co-occurrence is not engagement, and linkage must be measured, not counted.</w:t>
+        <w:t xml:space="preserve">Catholic Social Teaching (CST) assigns the Church a distinctive voice in economic hardship, calling it to name inflation as an injustice that falls hardest on the poor. We ask what that voice actually sounds like in a national digital media space during a cost-of-living shock. The DigiKat corpus contains 710,307 religion-salient Croatian and Bosnian media posts, published between January 2021 and June 2026. Using this corpus, we isolate every post that mentions inflation and, crucially, distinguish genuine religion-inflation linkage from incidental co-occurrence. Most co-mentions prove incidental. After coding 1,450 proximity-selected candidates with three independent large-language-model annotators (inter-annotator agreement 0.97, with human validation still pending) and setting aside foreign-country inflation, a measured domestic core of 520 posts remains, amounting to 0.07% of the web-portal-dominated corpus and 6.5% of inflation-mentioning posts. Within this core, religion meets inflation overwhelmingly as an economic object. A macro-register combining the rising cost of religious life and the Church as an institution accounts for about 72% of posts (37% and 34% individually, an ordering that falls within coding noise and should be read as an upper bound on the object reading, since the institution register also includes clergy acting as commentators). Charity accounts for 17%, while the structural, CST-justice register is marginal: 3% under strict coding, at most about 8% once latent structural framing in adjacent posts is counted. We formalize and evaluate four theory-derived expectations. Media inflation-attention is strongly price-coupled (H1 partially supported: Pearson r of about 0.73 with the Croatian HICP within the seam-free monitoring window, and 2.4 times higher mean attention above the literature-derived threshold of about 4%, though energy couples only weakly), and religious coverage appears to resonate with rather than lead real conditions (H2, provisional). The religious justice voice, however, does not fill that attention (P3: not visible in the digital-news measure, since the actor-level claim cannot be tested here), and framing is episodic rather than thematic (P4 supported, in part by construction). We argue that the justice-centred frame CST foregrounds has low visibility in the digital public sphere. The Church surfaces as an institution whose services became more expensive rather than as a prophetic voice, though we caution that media visibility is a weak proxy for the institution’s actual conduct. Beyond the substantive finding, the paper offers a transferable methodological caution: in keyword-filtered corpora, co-occurrence is not engagement, and linkage must be measured rather than counted.</w:t>
       </w:r>
     </w:p>
     <w:p>
@@ -310,7 +310,7 @@
         <w:t xml:space="preserve"> </w:t>
       </w:r>
       <w:r>
-        <w:t xml:space="preserve">We do not assume the Church is loud on the economy; we</w:t>
+        <w:t xml:space="preserve">We do not assume the Church is loud on the economy. We</w:t>
       </w:r>
       <w:r>
         <w:t xml:space="preserve"> </w:t>
@@ -330,7 +330,7 @@
         <w:t xml:space="preserve"> </w:t>
       </w:r>
       <w:r>
-        <w:t xml:space="preserve">inflation discourse across an entire national digital media space, and document a gap between CST’s normative</w:t>
+        <w:t xml:space="preserve">inflation discourse across an entire national digital media space, and we document a gap between CST’s normative</w:t>
       </w:r>
       <w:r>
         <w:t xml:space="preserve"> </w:t>
@@ -342,43 +342,43 @@
         <w:t xml:space="preserve"> </w:t>
       </w:r>
       <w:r>
-        <w:t xml:space="preserve">(see below): one — that media inflation-attention tracks real prices — is tested quantitatively against the</w:t>
-      </w:r>
-      <w:r>
-        <w:t xml:space="preserve"> </w:t>
-      </w:r>
-      <w:r>
-        <w:t xml:space="preserve">Harmonised Index of Consumer Prices (HICP) and partially supported, while the CST-derived expectation of a</w:t>
-      </w:r>
-      <w:r>
-        <w:t xml:space="preserve"> </w:t>
-      </w:r>
-      <w:r>
-        <w:t xml:space="preserve">prophetic justice voice is evaluated and found not to be visible in the digital-news measure — a news corpus</w:t>
-      </w:r>
-      <w:r>
-        <w:t xml:space="preserve"> </w:t>
-      </w:r>
-      <w:r>
-        <w:t xml:space="preserve">cannot test the actor-level claim about the Church itself. Methodologically, we show that the naïve approach — counting posts</w:t>
-      </w:r>
-      <w:r>
-        <w:t xml:space="preserve"> </w:t>
-      </w:r>
-      <w:r>
-        <w:t xml:space="preserve">where religion and inflation co-occur — overstates genuine engagement by roughly an order of magnitude (≈8,000</w:t>
-      </w:r>
-      <w:r>
-        <w:t xml:space="preserve"> </w:t>
-      </w:r>
-      <w:r>
-        <w:t xml:space="preserve">co-mentions versus 520 measured), and we demonstrate a validated pipeline for measuring linkage rather than</w:t>
-      </w:r>
-      <w:r>
-        <w:t xml:space="preserve"> </w:t>
-      </w:r>
-      <w:r>
-        <w:t xml:space="preserve">co-occurrence.</w:t>
+        <w:t xml:space="preserve">(see below). The first, that media inflation-attention tracks real prices, is tested quantitatively against the</w:t>
+      </w:r>
+      <w:r>
+        <w:t xml:space="preserve"> </w:t>
+      </w:r>
+      <w:r>
+        <w:t xml:space="preserve">Harmonised Index of Consumer Prices (HICP) and found to be partially supported. The second, the CST-derived</w:t>
+      </w:r>
+      <w:r>
+        <w:t xml:space="preserve"> </w:t>
+      </w:r>
+      <w:r>
+        <w:t xml:space="preserve">expectation of a prophetic justice voice, is evaluated and found not to be visible in the digital-news measure,</w:t>
+      </w:r>
+      <w:r>
+        <w:t xml:space="preserve"> </w:t>
+      </w:r>
+      <w:r>
+        <w:t xml:space="preserve">since a news corpus cannot test the actor-level claim about the Church itself. Methodologically, we show that</w:t>
+      </w:r>
+      <w:r>
+        <w:t xml:space="preserve"> </w:t>
+      </w:r>
+      <w:r>
+        <w:t xml:space="preserve">the naïve approach of counting posts where religion and inflation co-occur overstates genuine engagement by</w:t>
+      </w:r>
+      <w:r>
+        <w:t xml:space="preserve"> </w:t>
+      </w:r>
+      <w:r>
+        <w:t xml:space="preserve">roughly an order of magnitude (about 8,000 co-mentions versus 520 measured), and we demonstrate a validated</w:t>
+      </w:r>
+      <w:r>
+        <w:t xml:space="preserve"> </w:t>
+      </w:r>
+      <w:r>
+        <w:t xml:space="preserve">pipeline for measuring linkage rather than co-occurrence.</w:t>
       </w:r>
     </w:p>
     <w:bookmarkEnd w:id="20"/>
@@ -420,7 +420,7 @@
         <w:t xml:space="preserve"> </w:t>
       </w:r>
       <w:r>
-        <w:t xml:space="preserve">stays flat until inflation crosses a threshold of roughly 2–4%, then jumps (Korenok, Munro &amp; Chen, 2026;</w:t>
+        <w:t xml:space="preserve">stays flat until inflation crosses a threshold of roughly 2 to 4%, then jumps (Korenok, Munro &amp; Chen, 2026;</w:t>
       </w:r>
       <w:r>
         <w:t xml:space="preserve"> </w:t>
@@ -455,10 +455,13 @@
         <w:t xml:space="preserve">which component</w:t>
       </w:r>
       <w:r>
-        <w:t xml:space="preserve"> </w:t>
-      </w:r>
-      <w:r>
-        <w:t xml:space="preserve">— the</w:t>
+        <w:t xml:space="preserve">,</w:t>
+      </w:r>
+      <w:r>
+        <w:t xml:space="preserve"> </w:t>
+      </w:r>
+      <w:r>
+        <w:t xml:space="preserve">reflected in the</w:t>
       </w:r>
       <w:r>
         <w:t xml:space="preserve"> </w:t>
@@ -470,19 +473,19 @@
         <w:t xml:space="preserve"> </w:t>
       </w:r>
       <w:r>
-        <w:t xml:space="preserve">framing of food versus energy (Champagne et al., 2024) — and the European Central Bank now</w:t>
-      </w:r>
-      <w:r>
-        <w:t xml:space="preserve"> </w:t>
-      </w:r>
-      <w:r>
-        <w:t xml:space="preserve">maintains a dictionary-based media inflation-attention index (Aarab et al., 2025). Agenda-setting theory</w:t>
-      </w:r>
-      <w:r>
-        <w:t xml:space="preserve"> </w:t>
-      </w:r>
-      <w:r>
-        <w:t xml:space="preserve">(McCombs &amp; Shaw, 1972) is the backdrop, with an open question of whether media</w:t>
+        <w:t xml:space="preserve">framing of food versus energy (Champagne et al., 2024). The European</w:t>
+      </w:r>
+      <w:r>
+        <w:t xml:space="preserve"> </w:t>
+      </w:r>
+      <w:r>
+        <w:t xml:space="preserve">Central Bank now maintains a dictionary-based media inflation-attention index (Aarab et al., 2025).</w:t>
+      </w:r>
+      <w:r>
+        <w:t xml:space="preserve"> </w:t>
+      </w:r>
+      <w:r>
+        <w:t xml:space="preserve">Agenda-setting theory (McCombs &amp; Shaw, 1972) is the backdrop, with an open question of whether media</w:t>
       </w:r>
       <w:r>
         <w:t xml:space="preserve"> </w:t>
@@ -498,7 +501,13 @@
         <w:t xml:space="preserve"> </w:t>
       </w:r>
       <w:r>
-        <w:t xml:space="preserve">or merely</w:t>
+        <w:t xml:space="preserve">or</w:t>
+      </w:r>
+      <w:r>
+        <w:t xml:space="preserve"> </w:t>
+      </w:r>
+      <w:r>
+        <w:t xml:space="preserve">merely</w:t>
       </w:r>
       <w:r>
         <w:t xml:space="preserve"> </w:t>
@@ -514,7 +523,7 @@
         <w:t xml:space="preserve"> </w:t>
       </w:r>
       <w:r>
-        <w:t xml:space="preserve">attention (Wlezien &amp; Soroka, 2024). A second level of that theory matters here:</w:t>
+        <w:t xml:space="preserve">attention (Wlezien &amp; Soroka, 2024). A second level of that theory matters here.</w:t>
       </w:r>
       <w:r>
         <w:t xml:space="preserve"> </w:t>
@@ -524,37 +533,31 @@
           <w:i/>
           <w:iCs/>
         </w:rPr>
-        <w:t xml:space="preserve">attribute</w:t>
-      </w:r>
-      <w:r>
-        <w:t xml:space="preserve"> </w:t>
-      </w:r>
-      <w:r>
-        <w:t xml:space="preserve">agenda-setting</w:t>
-      </w:r>
-      <w:r>
-        <w:t xml:space="preserve"> </w:t>
-      </w:r>
-      <w:r>
-        <w:t xml:space="preserve">(McCombs, 2004) holds that media transfer not only the salience of an issue but the salience of its</w:t>
-      </w:r>
-      <w:r>
-        <w:t xml:space="preserve"> </w:t>
-      </w:r>
-      <w:r>
-        <w:t xml:space="preserve">attributes — and our register question is precisely an attribute question, asking not whether</w:t>
-      </w:r>
-      <w:r>
-        <w:t xml:space="preserve"> </w:t>
-      </w:r>
-      <w:r>
-        <w:t xml:space="preserve">religion-and-inflation is on the agenda but which of its faces (the fee, the charity, the injustice) becomes</w:t>
-      </w:r>
-      <w:r>
-        <w:t xml:space="preserve"> </w:t>
-      </w:r>
-      <w:r>
-        <w:t xml:space="preserve">salient. This literature is almost entirely secular and Anglophone/euro-area; it</w:t>
+        <w:t xml:space="preserve">Attribute</w:t>
+      </w:r>
+      <w:r>
+        <w:t xml:space="preserve"> </w:t>
+      </w:r>
+      <w:r>
+        <w:t xml:space="preserve">agenda-setting (McCombs, 2004) holds that media transfer not only the salience of an issue but the salience of</w:t>
+      </w:r>
+      <w:r>
+        <w:t xml:space="preserve"> </w:t>
+      </w:r>
+      <w:r>
+        <w:t xml:space="preserve">its attributes. Our register question is precisely an attribute question: it asks not whether</w:t>
+      </w:r>
+      <w:r>
+        <w:t xml:space="preserve"> </w:t>
+      </w:r>
+      <w:r>
+        <w:t xml:space="preserve">religion-and-inflation is on the agenda, but which of its faces (the fee, the charity, the injustice) becomes</w:t>
+      </w:r>
+      <w:r>
+        <w:t xml:space="preserve"> </w:t>
+      </w:r>
+      <w:r>
+        <w:t xml:space="preserve">salient. This literature is almost entirely secular and Anglophone or euro-area. It</w:t>
       </w:r>
       <w:r>
         <w:t xml:space="preserve"> </w:t>
@@ -658,7 +661,7 @@
           <w:b/>
           <w:bCs/>
         </w:rPr>
-        <w:t xml:space="preserve">The gap — and a fourth, methodological one.</w:t>
+        <w:t xml:space="preserve">The gap, plus a fourth, methodological one.</w:t>
       </w:r>
       <w:r>
         <w:t xml:space="preserve"> </w:t>
@@ -688,7 +691,7 @@
         <w:t xml:space="preserve"> </w:t>
       </w:r>
       <w:r>
-        <w:t xml:space="preserve">co-occurrence with engagement; we show below why that is unsafe here.</w:t>
+        <w:t xml:space="preserve">co-occurrence with engagement. We show below why that is unsafe here.</w:t>
       </w:r>
     </w:p>
     <w:bookmarkStart w:id="21" w:name="hypotheses-and-propositions"/>
@@ -724,10 +727,7 @@
         <w:t xml:space="preserve">hypotheses</w:t>
       </w:r>
       <w:r>
-        <w:t xml:space="preserve"> </w:t>
-      </w:r>
-      <w:r>
-        <w:t xml:space="preserve">— where theory predicts a direction and the data permit a quantitative test — and</w:t>
+        <w:t xml:space="preserve">, where theory predicts a direction and the data permit a quantitative test, and</w:t>
       </w:r>
       <w:r>
         <w:t xml:space="preserve"> </w:t>
@@ -768,7 +768,7 @@
           <w:b/>
           <w:bCs/>
         </w:rPr>
-        <w:t xml:space="preserve">H1 (attention–price coupling).</w:t>
+        <w:t xml:space="preserve">H1 (attention-price coupling).</w:t>
       </w:r>
       <w:r>
         <w:t xml:space="preserve"> </w:t>
@@ -856,7 +856,7 @@
         <w:t xml:space="preserve"> </w:t>
       </w:r>
       <w:r>
-        <w:t xml:space="preserve">them — entering the discourse reactively, as an affected</w:t>
+        <w:t xml:space="preserve">them, entering the discourse reactively as an affected</w:t>
       </w:r>
       <w:r>
         <w:t xml:space="preserve"> </w:t>
@@ -878,7 +878,7 @@
         <w:t xml:space="preserve"> </w:t>
       </w:r>
       <w:r>
-        <w:t xml:space="preserve">via the temporal pattern; a formal lead–lag test is left to future work.</w:t>
+        <w:t xml:space="preserve">via the temporal pattern. A formal lead-lag test is left to future work.</w:t>
       </w:r>
     </w:p>
     <w:p>
@@ -938,7 +938,7 @@
           <w:b/>
           <w:bCs/>
         </w:rPr>
-        <w:t xml:space="preserve">P4 (episodic over thematic; Iyengar, 1991).</w:t>
+        <w:t xml:space="preserve">P4: episodic over thematic (Iyengar, 1991).</w:t>
       </w:r>
       <w:r>
         <w:t xml:space="preserve"> </w:t>
@@ -1051,13 +1051,13 @@
         <w:t xml:space="preserve"> </w:t>
       </w:r>
       <w:r>
-        <w:t xml:space="preserve">Croatian/Bosnian media posts (2021-01 →</w:t>
-      </w:r>
-      <w:r>
-        <w:t xml:space="preserve"> </w:t>
-      </w:r>
-      <w:r>
-        <w:t xml:space="preserve">2026-06) retained by a religious-content filter (≥2 distinct religious-term matches). It is</w:t>
+        <w:t xml:space="preserve">Croatian/Bosnian media posts (2021-01 to</w:t>
+      </w:r>
+      <w:r>
+        <w:t xml:space="preserve"> </w:t>
+      </w:r>
+      <w:r>
+        <w:t xml:space="preserve">2026-06) retained by a religious-content filter (at least 2 distinct religious-term matches). It is</w:t>
       </w:r>
       <w:r>
         <w:t xml:space="preserve"> </w:t>
@@ -1067,13 +1067,285 @@
           <w:i/>
           <w:iCs/>
         </w:rPr>
-        <w:t xml:space="preserve">religion-salient</w:t>
+        <w:t xml:space="preserve">religion-salient posts across the whole media space</w:t>
+      </w:r>
+      <w:r>
+        <w:t xml:space="preserve">, not a Catholic-outlet archive: secular mainstream</w:t>
+      </w:r>
+      <w:r>
+        <w:t xml:space="preserve"> </w:t>
+      </w:r>
+      <w:r>
+        <w:t xml:space="preserve">outlets dominate, and the core is 96% web-portal content (Facebook 2%, other platforms negligible). A</w:t>
+      </w:r>
+      <w:r>
+        <w:t xml:space="preserve"> </w:t>
+      </w:r>
+      <w:r>
+        <w:t xml:space="preserve">provenance marker (</w:t>
+      </w:r>
+      <w:r>
+        <w:rPr>
+          <w:rStyle w:val="VerbatimChar"/>
+        </w:rPr>
+        <w:t xml:space="preserve">data_source</w:t>
+      </w:r>
+      <w:r>
+        <w:t xml:space="preserve">) distinguishes two collection streams, a monitoring query covering roughly</w:t>
+      </w:r>
+      <w:r>
+        <w:t xml:space="preserve"> </w:t>
+      </w:r>
+      <w:r>
+        <w:t xml:space="preserve">2021 to 2024 and a filter-based backfill covering roughly 2024 to 2026, that are</w:t>
+      </w:r>
+      <w:r>
+        <w:t xml:space="preserve"> </w:t>
+      </w:r>
+      <w:r>
+        <w:rPr>
+          <w:b/>
+          <w:bCs/>
+        </w:rPr>
+        <w:t xml:space="preserve">not comparable</w:t>
+      </w:r>
+      <w:r>
+        <w:t xml:space="preserve"> </w:t>
+      </w:r>
+      <w:r>
+        <w:t xml:space="preserve">(see</w:t>
+      </w:r>
+      <w:r>
+        <w:t xml:space="preserve"> </w:t>
+      </w:r>
+      <w:r>
+        <w:t xml:space="preserve">“Temporal dynamics”</w:t>
+      </w:r>
+      <w:r>
+        <w:t xml:space="preserve"> </w:t>
+      </w:r>
+      <w:r>
+        <w:t xml:space="preserve">below), and we condition on it in all temporal analysis.</w:t>
+      </w:r>
+    </w:p>
+    <w:p>
+      <w:pPr>
+        <w:pStyle w:val="BodyText"/>
+      </w:pPr>
+      <w:r>
+        <w:rPr>
+          <w:b/>
+          <w:bCs/>
+        </w:rPr>
+        <w:t xml:space="preserve">Inflation tagging.</w:t>
+      </w:r>
+      <w:r>
+        <w:t xml:space="preserve"> </w:t>
+      </w:r>
+      <w:r>
+        <w:t xml:space="preserve">We tagged every post whose title or body matches an anchored inflation lexicon</w:t>
+      </w:r>
+      <w:r>
+        <w:t xml:space="preserve"> </w:t>
+      </w:r>
+      <w:r>
+        <w:t xml:space="preserve">(</w:t>
+      </w:r>
+      <w:r>
+        <w:rPr>
+          <w:rStyle w:val="VerbatimChar"/>
+        </w:rPr>
+        <w:t xml:space="preserve">inflacij*</w:t>
+      </w:r>
+      <w:r>
+        <w:t xml:space="preserve">,</w:t>
+      </w:r>
+      <w:r>
+        <w:t xml:space="preserve"> </w:t>
+      </w:r>
+      <w:r>
+        <w:rPr>
+          <w:rStyle w:val="VerbatimChar"/>
+        </w:rPr>
+        <w:t xml:space="preserve">poskup*</w:t>
+      </w:r>
+      <w:r>
+        <w:t xml:space="preserve"> </w:t>
+      </w:r>
+      <w:r>
+        <w:t xml:space="preserve">“to become more expensive”</w:t>
+      </w:r>
+      <w:r>
+        <w:t xml:space="preserve">,</w:t>
+      </w:r>
+      <w:r>
+        <w:t xml:space="preserve"> </w:t>
+      </w:r>
+      <w:r>
+        <w:rPr>
+          <w:rStyle w:val="VerbatimChar"/>
+        </w:rPr>
+        <w:t xml:space="preserve">rast/porast/skok cijen*</w:t>
+      </w:r>
+      <w:r>
+        <w:t xml:space="preserve"> </w:t>
+      </w:r>
+      <w:r>
+        <w:t xml:space="preserve">“price rises”</w:t>
+      </w:r>
+      <w:r>
+        <w:t xml:space="preserve">,</w:t>
+      </w:r>
+      <w:r>
+        <w:t xml:space="preserve"> </w:t>
+      </w:r>
+      <w:r>
+        <w:rPr>
+          <w:rStyle w:val="VerbatimChar"/>
+        </w:rPr>
+        <w:t xml:space="preserve">trošak života</w:t>
+      </w:r>
+      <w:r>
+        <w:t xml:space="preserve"> </w:t>
+      </w:r>
+      <w:r>
+        <w:t xml:space="preserve">“cost of living”</w:t>
+      </w:r>
+      <w:r>
+        <w:t xml:space="preserve">,</w:t>
+      </w:r>
+      <w:r>
+        <w:t xml:space="preserve"> </w:t>
+      </w:r>
+      <w:r>
+        <w:rPr>
+          <w:rStyle w:val="VerbatimChar"/>
+        </w:rPr>
+        <w:t xml:space="preserve">kupovna moć</w:t>
+      </w:r>
+      <w:r>
+        <w:t xml:space="preserve"> </w:t>
+      </w:r>
+      <w:r>
+        <w:t xml:space="preserve">“purchasing power”</w:t>
+      </w:r>
+      <w:r>
+        <w:t xml:space="preserve">), deliberately excluding the bare word</w:t>
+      </w:r>
+      <w:r>
+        <w:t xml:space="preserve"> </w:t>
+      </w:r>
+      <w:r>
+        <w:rPr>
+          <w:rStyle w:val="VerbatimChar"/>
+        </w:rPr>
+        <w:t xml:space="preserve">cijena</w:t>
+      </w:r>
+      <w:r>
+        <w:t xml:space="preserve"> </w:t>
+      </w:r>
+      <w:r>
+        <w:t xml:space="preserve">“price”</w:t>
+      </w:r>
+      <w:r>
+        <w:t xml:space="preserve"> </w:t>
+      </w:r>
+      <w:r>
+        <w:t xml:space="preserve">to</w:t>
+      </w:r>
+      <w:r>
+        <w:t xml:space="preserve"> </w:t>
+      </w:r>
+      <w:r>
+        <w:t xml:space="preserve">avoid devotional false positives (e.g. </w:t>
+      </w:r>
+      <w:r>
+        <w:t xml:space="preserve">“the price of salvation”</w:t>
+      </w:r>
+      <w:r>
+        <w:t xml:space="preserve">). A metaphor guard removes figurative uses</w:t>
+      </w:r>
+      <w:r>
+        <w:t xml:space="preserve"> </w:t>
+      </w:r>
+      <w:r>
+        <w:t xml:space="preserve">(</w:t>
+      </w:r>
+      <w:r>
+        <w:t xml:space="preserve">“inflation of words/values”</w:t>
+      </w:r>
+      <w:r>
+        <w:t xml:space="preserve">). This yields</w:t>
+      </w:r>
+      <w:r>
+        <w:t xml:space="preserve"> </w:t>
+      </w:r>
+      <w:r>
+        <w:rPr>
+          <w:b/>
+          <w:bCs/>
+        </w:rPr>
+        <w:t xml:space="preserve">8,019</w:t>
+      </w:r>
+      <w:r>
+        <w:t xml:space="preserve"> </w:t>
+      </w:r>
+      <w:r>
+        <w:t xml:space="preserve">clean inflation-mentioning posts (1.13% of the corpus).</w:t>
+      </w:r>
+    </w:p>
+    <w:p>
+      <w:pPr>
+        <w:pStyle w:val="BodyText"/>
+      </w:pPr>
+      <w:r>
+        <w:rPr>
+          <w:b/>
+          <w:bCs/>
+        </w:rPr>
+        <w:t xml:space="preserve">Linkage, not co-occurrence.</w:t>
+      </w:r>
+      <w:r>
+        <w:t xml:space="preserve"> </w:t>
+      </w:r>
+      <w:r>
+        <w:t xml:space="preserve">A long news article can mention inflation in one paragraph and a saint’s feast</w:t>
+      </w:r>
+      <w:r>
+        <w:t xml:space="preserve"> </w:t>
+      </w:r>
+      <w:r>
+        <w:t xml:space="preserve">in another with no connection. We therefore measured, for each inflation post, whether a religious term</w:t>
+      </w:r>
+      <w:r>
+        <w:t xml:space="preserve"> </w:t>
+      </w:r>
+      <w:r>
+        <w:t xml:space="preserve">(project lexicon of 95 terms, tightened for economic homonyms such as</w:t>
+      </w:r>
+      <w:r>
+        <w:t xml:space="preserve"> </w:t>
       </w:r>
       <w:r>
         <w:rPr>
           <w:i/>
           <w:iCs/>
         </w:rPr>
+        <w:t xml:space="preserve">gospodarstvo</w:t>
+      </w:r>
+      <w:r>
+        <w:t xml:space="preserve"> </w:t>
+      </w:r>
+      <w:r>
+        <w:t xml:space="preserve">“economy”</w:t>
+      </w:r>
+      <w:r>
+        <w:t xml:space="preserve"> </w:t>
+      </w:r>
+      <w:r>
+        <w:t xml:space="preserve">vs</w:t>
+      </w:r>
+      <w:r>
         <w:t xml:space="preserve"> </w:t>
       </w:r>
       <w:r>
@@ -1081,37 +1353,28 @@
           <w:i/>
           <w:iCs/>
         </w:rPr>
-        <w:t xml:space="preserve">posts across the whole media space</w:t>
-      </w:r>
-      <w:r>
-        <w:t xml:space="preserve">, not a Catholic-outlet archive: secular mainstream outlets dominate, and</w:t>
-      </w:r>
-      <w:r>
-        <w:t xml:space="preserve"> </w:t>
-      </w:r>
-      <w:r>
-        <w:t xml:space="preserve">the core is 96% web-portal content (Facebook 2%, other platforms negligible). A provenance marker</w:t>
-      </w:r>
-      <w:r>
-        <w:t xml:space="preserve"> </w:t>
-      </w:r>
-      <w:r>
-        <w:t xml:space="preserve">(</w:t>
-      </w:r>
-      <w:r>
-        <w:rPr>
-          <w:rStyle w:val="VerbatimChar"/>
-        </w:rPr>
-        <w:t xml:space="preserve">data_source</w:t>
-      </w:r>
-      <w:r>
-        <w:t xml:space="preserve">) reflects two collection streams — a monitoring query covering ≈2021–2024 and a filter-based</w:t>
-      </w:r>
-      <w:r>
-        <w:t xml:space="preserve"> </w:t>
-      </w:r>
-      <w:r>
-        <w:t xml:space="preserve">backfill covering ≈2024–2026 — that are</w:t>
+        <w:t xml:space="preserve">Gospa</w:t>
+      </w:r>
+      <w:r>
+        <w:t xml:space="preserve"> </w:t>
+      </w:r>
+      <w:r>
+        <w:t xml:space="preserve">“Our</w:t>
+      </w:r>
+      <w:r>
+        <w:t xml:space="preserve"> </w:t>
+      </w:r>
+      <w:r>
+        <w:t xml:space="preserve">Lady”</w:t>
+      </w:r>
+      <w:r>
+        <w:t xml:space="preserve">) appears within ±220 characters of an inflation mention. This proximity filter is deliberately</w:t>
+      </w:r>
+      <w:r>
+        <w:t xml:space="preserve"> </w:t>
+      </w:r>
+      <w:r>
+        <w:t xml:space="preserve">recall-oriented (validated recall ≈0.89): it generates</w:t>
       </w:r>
       <w:r>
         <w:t xml:space="preserve"> </w:t>
@@ -1121,31 +1384,63 @@
           <w:b/>
           <w:bCs/>
         </w:rPr>
-        <w:t xml:space="preserve">not comparable</w:t>
-      </w:r>
-      <w:r>
-        <w:t xml:space="preserve"> </w:t>
-      </w:r>
-      <w:r>
-        <w:t xml:space="preserve">(see</w:t>
-      </w:r>
-      <w:r>
-        <w:t xml:space="preserve"> </w:t>
-      </w:r>
-      <w:r>
-        <w:t xml:space="preserve">“Temporal dynamics”</w:t>
-      </w:r>
-      <w:r>
-        <w:t xml:space="preserve"> </w:t>
-      </w:r>
-      <w:r>
-        <w:t xml:space="preserve">below); we condition on it</w:t>
-      </w:r>
-      <w:r>
-        <w:t xml:space="preserve"> </w:t>
-      </w:r>
-      <w:r>
-        <w:t xml:space="preserve">in all temporal analysis.</w:t>
+        <w:t xml:space="preserve">1,450 candidate</w:t>
+      </w:r>
+      <w:r>
+        <w:t xml:space="preserve"> </w:t>
+      </w:r>
+      <w:r>
+        <w:t xml:space="preserve">linked posts while accepting false</w:t>
+      </w:r>
+      <w:r>
+        <w:t xml:space="preserve"> </w:t>
+      </w:r>
+      <w:r>
+        <w:t xml:space="preserve">positives, which the coding stage removes. We code the full</w:t>
+      </w:r>
+      <w:r>
+        <w:t xml:space="preserve"> </w:t>
+      </w:r>
+      <w:r>
+        <w:rPr>
+          <w:i/>
+          <w:iCs/>
+        </w:rPr>
+        <w:t xml:space="preserve">linked</w:t>
+      </w:r>
+      <w:r>
+        <w:t xml:space="preserve"> </w:t>
+      </w:r>
+      <w:r>
+        <w:t xml:space="preserve">set (1,450) rather than the classifier’s</w:t>
+      </w:r>
+      <w:r>
+        <w:t xml:space="preserve"> </w:t>
+      </w:r>
+      <w:r>
+        <w:t xml:space="preserve">narrower</w:t>
+      </w:r>
+      <w:r>
+        <w:t xml:space="preserve"> </w:t>
+      </w:r>
+      <w:r>
+        <w:rPr>
+          <w:i/>
+          <w:iCs/>
+        </w:rPr>
+        <w:t xml:space="preserve">domestic-linked</w:t>
+      </w:r>
+      <w:r>
+        <w:t xml:space="preserve"> </w:t>
+      </w:r>
+      <w:r>
+        <w:t xml:space="preserve">subset (1,103), because the automatic foreign/domestic flag is unreliable (held-out</w:t>
+      </w:r>
+      <w:r>
+        <w:t xml:space="preserve"> </w:t>
+      </w:r>
+      <w:r>
+        <w:t xml:space="preserve">precision of about 0.39). The annotators, not the flag, decide foreign versus domestic.</w:t>
       </w:r>
     </w:p>
     <w:p>
@@ -1157,145 +1452,13 @@
           <w:b/>
           <w:bCs/>
         </w:rPr>
-        <w:t xml:space="preserve">Inflation tagging.</w:t>
-      </w:r>
-      <w:r>
-        <w:t xml:space="preserve"> </w:t>
-      </w:r>
-      <w:r>
-        <w:t xml:space="preserve">We tagged every post whose title or body matches an anchored inflation lexicon</w:t>
-      </w:r>
-      <w:r>
-        <w:t xml:space="preserve"> </w:t>
-      </w:r>
-      <w:r>
-        <w:t xml:space="preserve">(</w:t>
-      </w:r>
-      <w:r>
-        <w:rPr>
-          <w:rStyle w:val="VerbatimChar"/>
-        </w:rPr>
-        <w:t xml:space="preserve">inflacij*</w:t>
-      </w:r>
-      <w:r>
-        <w:t xml:space="preserve">,</w:t>
-      </w:r>
-      <w:r>
-        <w:t xml:space="preserve"> </w:t>
-      </w:r>
-      <w:r>
-        <w:rPr>
-          <w:rStyle w:val="VerbatimChar"/>
-        </w:rPr>
-        <w:t xml:space="preserve">poskup*</w:t>
-      </w:r>
-      <w:r>
-        <w:t xml:space="preserve"> </w:t>
-      </w:r>
-      <w:r>
-        <w:t xml:space="preserve">“to become more expensive”</w:t>
-      </w:r>
-      <w:r>
-        <w:t xml:space="preserve">,</w:t>
-      </w:r>
-      <w:r>
-        <w:t xml:space="preserve"> </w:t>
-      </w:r>
-      <w:r>
-        <w:rPr>
-          <w:rStyle w:val="VerbatimChar"/>
-        </w:rPr>
-        <w:t xml:space="preserve">rast/porast/skok cijen*</w:t>
-      </w:r>
-      <w:r>
-        <w:t xml:space="preserve"> </w:t>
-      </w:r>
-      <w:r>
-        <w:t xml:space="preserve">“price rises”</w:t>
-      </w:r>
-      <w:r>
-        <w:t xml:space="preserve">,</w:t>
-      </w:r>
-      <w:r>
-        <w:t xml:space="preserve"> </w:t>
-      </w:r>
-      <w:r>
-        <w:rPr>
-          <w:rStyle w:val="VerbatimChar"/>
-        </w:rPr>
-        <w:t xml:space="preserve">trošak života</w:t>
-      </w:r>
-      <w:r>
-        <w:t xml:space="preserve"> </w:t>
-      </w:r>
-      <w:r>
-        <w:t xml:space="preserve">“cost of living”</w:t>
-      </w:r>
-      <w:r>
-        <w:t xml:space="preserve">,</w:t>
-      </w:r>
-      <w:r>
-        <w:t xml:space="preserve"> </w:t>
-      </w:r>
-      <w:r>
-        <w:rPr>
-          <w:rStyle w:val="VerbatimChar"/>
-        </w:rPr>
-        <w:t xml:space="preserve">kupovna moć</w:t>
-      </w:r>
-      <w:r>
-        <w:t xml:space="preserve"> </w:t>
-      </w:r>
-      <w:r>
-        <w:t xml:space="preserve">“purchasing power”</w:t>
-      </w:r>
-      <w:r>
-        <w:t xml:space="preserve">), deliberately excluding the bare word</w:t>
-      </w:r>
-      <w:r>
-        <w:t xml:space="preserve"> </w:t>
-      </w:r>
-      <w:r>
-        <w:rPr>
-          <w:rStyle w:val="VerbatimChar"/>
-        </w:rPr>
-        <w:t xml:space="preserve">cijena</w:t>
-      </w:r>
-      <w:r>
-        <w:t xml:space="preserve"> </w:t>
-      </w:r>
-      <w:r>
-        <w:t xml:space="preserve">“price”</w:t>
-      </w:r>
-      <w:r>
-        <w:t xml:space="preserve"> </w:t>
-      </w:r>
-      <w:r>
-        <w:t xml:space="preserve">to</w:t>
-      </w:r>
-      <w:r>
-        <w:t xml:space="preserve"> </w:t>
-      </w:r>
-      <w:r>
-        <w:t xml:space="preserve">avoid devotional false positives (e.g. </w:t>
-      </w:r>
-      <w:r>
-        <w:t xml:space="preserve">“the price of salvation”</w:t>
-      </w:r>
-      <w:r>
-        <w:t xml:space="preserve">). A metaphor guard removes figurative uses</w:t>
-      </w:r>
-      <w:r>
-        <w:t xml:space="preserve"> </w:t>
-      </w:r>
-      <w:r>
-        <w:t xml:space="preserve">(</w:t>
-      </w:r>
-      <w:r>
-        <w:t xml:space="preserve">“inflation of words/values”</w:t>
-      </w:r>
-      <w:r>
-        <w:t xml:space="preserve">). This yields</w:t>
+        <w:t xml:space="preserve">Coding.</w:t>
+      </w:r>
+      <w:r>
+        <w:t xml:space="preserve"> </w:t>
+      </w:r>
+      <w:r>
+        <w:t xml:space="preserve">All 1,450 candidates were coded by</w:t>
       </w:r>
       <w:r>
         <w:t xml:space="preserve"> </w:t>
@@ -1305,43 +1468,96 @@
           <w:b/>
           <w:bCs/>
         </w:rPr>
-        <w:t xml:space="preserve">8,019</w:t>
-      </w:r>
-      <w:r>
-        <w:t xml:space="preserve"> </w:t>
-      </w:r>
-      <w:r>
-        <w:t xml:space="preserve">clean inflation-mentioning posts (1.13% of the corpus).</w:t>
-      </w:r>
-    </w:p>
-    <w:p>
-      <w:pPr>
-        <w:pStyle w:val="BodyText"/>
-      </w:pPr>
+        <w:t xml:space="preserve">three independent annotators</w:t>
+      </w:r>
+      <w:r>
+        <w:t xml:space="preserve"> </w:t>
+      </w:r>
+      <w:r>
+        <w:t xml:space="preserve">(large-language-model</w:t>
+      </w:r>
+      <w:r>
+        <w:t xml:space="preserve"> </w:t>
+      </w:r>
+      <w:r>
+        <w:t xml:space="preserve">annotators applying a fixed codebook), with labels majority-adjudicated. Of these, 1,447 of 1,450 were coded by</w:t>
+      </w:r>
+      <w:r>
+        <w:t xml:space="preserve"> </w:t>
+      </w:r>
+      <w:r>
+        <w:t xml:space="preserve">all three. Each post was labelled on four axes: (1) whether it is genuinely about inflation or cost of living,</w:t>
+      </w:r>
+      <w:r>
+        <w:t xml:space="preserve"> </w:t>
+      </w:r>
+      <w:r>
+        <w:t xml:space="preserve">(2) whether religion is genuinely linked to the inflation content, as opposed to incidental, a geographic</w:t>
+      </w:r>
+      <w:r>
+        <w:t xml:space="preserve"> </w:t>
+      </w:r>
+      <w:r>
+        <w:t xml:space="preserve">landmark, a metaphor, a hashtag, or a secular organisation containing a religious word (for example</w:t>
+      </w:r>
+      <w:r>
+        <w:t xml:space="preserve"> </w:t>
+      </w:r>
+      <w:r>
+        <w:rPr>
+          <w:i/>
+          <w:iCs/>
+        </w:rPr>
+        <w:t xml:space="preserve">Crveni</w:t>
+      </w:r>
+      <w:r>
+        <w:rPr>
+          <w:i/>
+          <w:iCs/>
+        </w:rPr>
+        <w:t xml:space="preserve"> </w:t>
+      </w:r>
+      <w:r>
+        <w:rPr>
+          <w:i/>
+          <w:iCs/>
+        </w:rPr>
+        <w:t xml:space="preserve">križ</w:t>
+      </w:r>
+      <w:r>
+        <w:t xml:space="preserve">, Red Cross, or</w:t>
+      </w:r>
+      <w:r>
+        <w:t xml:space="preserve"> </w:t>
+      </w:r>
+      <w:r>
+        <w:rPr>
+          <w:i/>
+          <w:iCs/>
+        </w:rPr>
+        <w:t xml:space="preserve">Papa-test</w:t>
+      </w:r>
+      <w:r>
+        <w:t xml:space="preserve">, Pap smear), (3) whether the inflation is foreign or domestic, and (4), when</w:t>
+      </w:r>
+      <w:r>
+        <w:t xml:space="preserve"> </w:t>
+      </w:r>
+      <w:r>
+        <w:t xml:space="preserve">linked, its</w:t>
+      </w:r>
+      <w:r>
+        <w:t xml:space="preserve"> </w:t>
+      </w:r>
       <w:r>
         <w:rPr>
           <w:b/>
           <w:bCs/>
         </w:rPr>
-        <w:t xml:space="preserve">Linkage, not co-occurrence.</w:t>
-      </w:r>
-      <w:r>
-        <w:t xml:space="preserve"> </w:t>
-      </w:r>
-      <w:r>
-        <w:t xml:space="preserve">A long news article can mention inflation in one paragraph and a saint’s feast</w:t>
-      </w:r>
-      <w:r>
-        <w:t xml:space="preserve"> </w:t>
-      </w:r>
-      <w:r>
-        <w:t xml:space="preserve">in another with no connection. We therefore measured, for each inflation post, whether a religious term</w:t>
-      </w:r>
-      <w:r>
-        <w:t xml:space="preserve"> </w:t>
-      </w:r>
-      <w:r>
-        <w:t xml:space="preserve">(project lexicon of 95 terms, tightened for economic homonyms such as</w:t>
+        <w:t xml:space="preserve">register</w:t>
+      </w:r>
+      <w:r>
+        <w:t xml:space="preserve">:</w:t>
       </w:r>
       <w:r>
         <w:t xml:space="preserve"> </w:t>
@@ -1351,19 +1567,13 @@
           <w:i/>
           <w:iCs/>
         </w:rPr>
-        <w:t xml:space="preserve">gospodarstvo</w:t>
-      </w:r>
-      <w:r>
-        <w:t xml:space="preserve"> </w:t>
-      </w:r>
-      <w:r>
-        <w:t xml:space="preserve">“economy”</w:t>
-      </w:r>
-      <w:r>
-        <w:t xml:space="preserve"> </w:t>
-      </w:r>
-      <w:r>
-        <w:t xml:space="preserve">vs</w:t>
+        <w:t xml:space="preserve">cost of religious life</w:t>
+      </w:r>
+      <w:r>
+        <w:t xml:space="preserve"> </w:t>
+      </w:r>
+      <w:r>
+        <w:t xml:space="preserve">(the price of religious goods or services rising),</w:t>
       </w:r>
       <w:r>
         <w:t xml:space="preserve"> </w:t>
@@ -1373,50 +1583,110 @@
           <w:i/>
           <w:iCs/>
         </w:rPr>
-        <w:t xml:space="preserve">Gospa</w:t>
-      </w:r>
-      <w:r>
-        <w:t xml:space="preserve"> </w:t>
-      </w:r>
-      <w:r>
-        <w:t xml:space="preserve">“Our</w:t>
-      </w:r>
-      <w:r>
-        <w:t xml:space="preserve"> </w:t>
-      </w:r>
-      <w:r>
-        <w:t xml:space="preserve">Lady”</w:t>
-      </w:r>
-      <w:r>
-        <w:t xml:space="preserve">) appears within ±220 characters of an inflation mention. This proximity filter is deliberately</w:t>
-      </w:r>
-      <w:r>
-        <w:t xml:space="preserve"> </w:t>
-      </w:r>
-      <w:r>
-        <w:t xml:space="preserve">recall-oriented (validated recall ≈0.89): it generates</w:t>
-      </w:r>
-      <w:r>
-        <w:t xml:space="preserve"> </w:t>
-      </w:r>
+        <w:t xml:space="preserve">Church-as-institution</w:t>
+      </w:r>
+      <w:r>
+        <w:t xml:space="preserve"> </w:t>
+      </w:r>
+      <w:r>
+        <w:t xml:space="preserve">(clergy, Pope, or parish as actor or commentator),</w:t>
+      </w:r>
+      <w:r>
+        <w:t xml:space="preserve"> </w:t>
+      </w:r>
+      <w:r>
+        <w:rPr>
+          <w:i/>
+          <w:iCs/>
+        </w:rPr>
+        <w:t xml:space="preserve">structural / CST justice</w:t>
+      </w:r>
+      <w:r>
+        <w:t xml:space="preserve">,</w:t>
+      </w:r>
+      <w:r>
+        <w:t xml:space="preserve"> </w:t>
+      </w:r>
+      <w:r>
+        <w:rPr>
+          <w:i/>
+          <w:iCs/>
+        </w:rPr>
+        <w:t xml:space="preserve">charity</w:t>
+      </w:r>
+      <w:r>
+        <w:t xml:space="preserve"> </w:t>
+      </w:r>
+      <w:r>
+        <w:t xml:space="preserve">(Caritas or relief),</w:t>
+      </w:r>
+      <w:r>
+        <w:t xml:space="preserve"> </w:t>
+      </w:r>
+      <w:r>
+        <w:rPr>
+          <w:i/>
+          <w:iCs/>
+        </w:rPr>
+        <w:t xml:space="preserve">devotional</w:t>
+      </w:r>
+      <w:r>
+        <w:t xml:space="preserve">, or</w:t>
+      </w:r>
+      <w:r>
+        <w:t xml:space="preserve"> </w:t>
+      </w:r>
+      <w:r>
+        <w:rPr>
+          <w:i/>
+          <w:iCs/>
+        </w:rPr>
+        <w:t xml:space="preserve">other</w:t>
+      </w:r>
+      <w:r>
+        <w:t xml:space="preserve">.</w:t>
+      </w:r>
+    </w:p>
+    <w:p>
+      <w:pPr>
+        <w:pStyle w:val="BodyText"/>
+      </w:pPr>
       <w:r>
         <w:rPr>
           <w:b/>
           <w:bCs/>
         </w:rPr>
-        <w:t xml:space="preserve">1,450 candidate</w:t>
-      </w:r>
-      <w:r>
-        <w:t xml:space="preserve"> </w:t>
-      </w:r>
-      <w:r>
-        <w:t xml:space="preserve">linked posts while accepting false</w:t>
-      </w:r>
-      <w:r>
-        <w:t xml:space="preserve"> </w:t>
-      </w:r>
-      <w:r>
-        <w:t xml:space="preserve">positives, which the coding stage removes. We code the full</w:t>
+        <w:t xml:space="preserve">Validation.</w:t>
+      </w:r>
+      <w:r>
+        <w:t xml:space="preserve"> </w:t>
+      </w:r>
+      <w:r>
+        <w:t xml:space="preserve">On a stratified held-out sample of 80 posts (disjoint from any tuning data), inter-annotator</w:t>
+      </w:r>
+      <w:r>
+        <w:t xml:space="preserve"> </w:t>
+      </w:r>
+      <w:r>
+        <w:t xml:space="preserve">agreement was high (infl 0.975, link 0.967, foreign 0.992), confirming that the constructs are reliably</w:t>
+      </w:r>
+      <w:r>
+        <w:t xml:space="preserve"> </w:t>
+      </w:r>
+      <w:r>
+        <w:t xml:space="preserve">measurable. Register is the harder judgement, with a held-out agreement of only 0.46. The proximity filter’s</w:t>
+      </w:r>
+      <w:r>
+        <w:t xml:space="preserve"> </w:t>
+      </w:r>
+      <w:r>
+        <w:t xml:space="preserve">held-out precision for domestic linkage was modest (about 0.38 to 0.46) with a recall of about 0.89, meaning it</w:t>
+      </w:r>
+      <w:r>
+        <w:t xml:space="preserve"> </w:t>
+      </w:r>
+      <w:r>
+        <w:t xml:space="preserve">functions as a</w:t>
       </w:r>
       <w:r>
         <w:t xml:space="preserve"> </w:t>
@@ -1426,19 +1696,94 @@
           <w:i/>
           <w:iCs/>
         </w:rPr>
-        <w:t xml:space="preserve">linked</w:t>
-      </w:r>
-      <w:r>
-        <w:t xml:space="preserve"> </w:t>
-      </w:r>
-      <w:r>
-        <w:t xml:space="preserve">set (1,450) rather than the classifier’s</w:t>
-      </w:r>
-      <w:r>
-        <w:t xml:space="preserve"> </w:t>
-      </w:r>
-      <w:r>
-        <w:t xml:space="preserve">narrower</w:t>
+        <w:t xml:space="preserve">filter</w:t>
+      </w:r>
+      <w:r>
+        <w:t xml:space="preserve"> </w:t>
+      </w:r>
+      <w:r>
+        <w:t xml:space="preserve">rather than a labeller. The full-pool coding confirmed this, with 45% of candidates</w:t>
+      </w:r>
+      <w:r>
+        <w:t xml:space="preserve"> </w:t>
+      </w:r>
+      <w:r>
+        <w:t xml:space="preserve">coded as genuinely linked. We therefore report coded figures throughout and never regex counts. Annotators are</w:t>
+      </w:r>
+      <w:r>
+        <w:t xml:space="preserve"> </w:t>
+      </w:r>
+      <w:r>
+        <w:t xml:space="preserve">LLM-based, so the agreement reflects inter-model reliability rather than a human gold standard, and a human</w:t>
+      </w:r>
+      <w:r>
+        <w:t xml:space="preserve"> </w:t>
+      </w:r>
+      <w:r>
+        <w:t xml:space="preserve">double-coding pass is planned (see Limitations).</w:t>
+      </w:r>
+    </w:p>
+    <w:p>
+      <w:pPr>
+        <w:pStyle w:val="BodyText"/>
+      </w:pPr>
+      <w:r>
+        <w:rPr>
+          <w:b/>
+          <w:bCs/>
+        </w:rPr>
+        <w:t xml:space="preserve">Price data.</w:t>
+      </w:r>
+      <w:r>
+        <w:t xml:space="preserve"> </w:t>
+      </w:r>
+      <w:r>
+        <w:t xml:space="preserve">The Croatian HICP annual rate of change (monthly, covering all items, food, and energy) was</w:t>
+      </w:r>
+      <w:r>
+        <w:t xml:space="preserve"> </w:t>
+      </w:r>
+      <w:r>
+        <w:t xml:space="preserve">obtained from Eurostat (</w:t>
+      </w:r>
+      <w:r>
+        <w:rPr>
+          <w:rStyle w:val="VerbatimChar"/>
+        </w:rPr>
+        <w:t xml:space="preserve">prc_hicp_manr</w:t>
+      </w:r>
+      <w:r>
+        <w:t xml:space="preserve">) for 2021 to 2025.</w:t>
+      </w:r>
+    </w:p>
+    <w:p>
+      <w:pPr>
+        <w:pStyle w:val="BodyText"/>
+      </w:pPr>
+      <w:r>
+        <w:rPr>
+          <w:b/>
+          <w:bCs/>
+        </w:rPr>
+        <w:t xml:space="preserve">Analysis.</w:t>
+      </w:r>
+      <w:r>
+        <w:t xml:space="preserve"> </w:t>
+      </w:r>
+      <w:r>
+        <w:t xml:space="preserve">We report three things: the corpus-to-core funnel, the register distribution and its outlet,</w:t>
+      </w:r>
+      <w:r>
+        <w:t xml:space="preserve"> </w:t>
+      </w:r>
+      <w:r>
+        <w:t xml:space="preserve">temporal, and tonal structure, and a test of H1 correlating monthly inflation-attention with HICP. Because the</w:t>
+      </w:r>
+      <w:r>
+        <w:t xml:space="preserve"> </w:t>
+      </w:r>
+      <w:r>
+        <w:t xml:space="preserve">corpus changes collection instrument in 2024, all temporal analysis is conducted</w:t>
       </w:r>
       <w:r>
         <w:t xml:space="preserve"> </w:t>
@@ -1448,37 +1793,74 @@
           <w:i/>
           <w:iCs/>
         </w:rPr>
-        <w:t xml:space="preserve">domestic-linked</w:t>
-      </w:r>
-      <w:r>
-        <w:t xml:space="preserve"> </w:t>
-      </w:r>
-      <w:r>
-        <w:t xml:space="preserve">subset (1,103), because the automatic foreign/domestic flag is unreliable (held-out</w:t>
-      </w:r>
-      <w:r>
-        <w:t xml:space="preserve"> </w:t>
-      </w:r>
-      <w:r>
-        <w:t xml:space="preserve">precision ≈0.39); the annotators, not the flag, decide foreign versus domestic.</w:t>
-      </w:r>
-    </w:p>
-    <w:p>
-      <w:pPr>
-        <w:pStyle w:val="BodyText"/>
-      </w:pPr>
+        <w:t xml:space="preserve">within</w:t>
+      </w:r>
+      <w:r>
+        <w:t xml:space="preserve"> </w:t>
+      </w:r>
+      <w:r>
+        <w:t xml:space="preserve">the 2021–2024</w:t>
+      </w:r>
+      <w:r>
+        <w:t xml:space="preserve"> </w:t>
+      </w:r>
+      <w:r>
+        <w:t xml:space="preserve">monitoring stream, and the batch-pooled series is reported only for completeness.</w:t>
+      </w:r>
+    </w:p>
+    <w:bookmarkEnd w:id="23"/>
+    <w:bookmarkStart w:id="48" w:name="results"/>
+    <w:p>
+      <w:pPr>
+        <w:pStyle w:val="Heading2"/>
+      </w:pPr>
+      <w:r>
+        <w:t xml:space="preserve">RESULTS</w:t>
+      </w:r>
+    </w:p>
+    <w:bookmarkStart w:id="24" w:name="co-occurrence-is-not-engagement"/>
+    <w:p>
+      <w:pPr>
+        <w:pStyle w:val="Heading3"/>
+      </w:pPr>
+      <w:r>
+        <w:t xml:space="preserve">Co-occurrence is not engagement</w:t>
+      </w:r>
+    </w:p>
+    <w:p>
+      <w:pPr>
+        <w:pStyle w:val="FirstParagraph"/>
+      </w:pPr>
+      <w:r>
+        <w:t xml:space="preserve">The path from corpus to measured core is steep (Table 1). Of 710,307 posts, 8,019 (1.13%) mention inflation. Of</w:t>
+      </w:r>
+      <w:r>
+        <w:t xml:space="preserve"> </w:t>
+      </w:r>
+      <w:r>
+        <w:t xml:space="preserve">those, the recall-oriented filter flags 1,450 as candidate-linked, and coding confirms only</w:t>
+      </w:r>
+      <w:r>
+        <w:t xml:space="preserve"> </w:t>
+      </w:r>
       <w:r>
         <w:rPr>
           <w:b/>
           <w:bCs/>
         </w:rPr>
-        <w:t xml:space="preserve">Coding.</w:t>
-      </w:r>
-      <w:r>
-        <w:t xml:space="preserve"> </w:t>
-      </w:r>
-      <w:r>
-        <w:t xml:space="preserve">All 1,450 candidates were coded by</w:t>
+        <w:t xml:space="preserve">652</w:t>
+      </w:r>
+      <w:r>
+        <w:t xml:space="preserve"> </w:t>
+      </w:r>
+      <w:r>
+        <w:t xml:space="preserve">as genuine</w:t>
+      </w:r>
+      <w:r>
+        <w:t xml:space="preserve"> </w:t>
+      </w:r>
+      <w:r>
+        <w:t xml:space="preserve">religion–inflation linkage. Of these,</w:t>
       </w:r>
       <w:r>
         <w:t xml:space="preserve"> </w:t>
@@ -1488,72 +1870,13 @@
           <w:b/>
           <w:bCs/>
         </w:rPr>
-        <w:t xml:space="preserve">three independent annotators</w:t>
-      </w:r>
-      <w:r>
-        <w:t xml:space="preserve"> </w:t>
-      </w:r>
-      <w:r>
-        <w:t xml:space="preserve">(large-language-model</w:t>
-      </w:r>
-      <w:r>
-        <w:t xml:space="preserve"> </w:t>
-      </w:r>
-      <w:r>
-        <w:t xml:space="preserve">annotators applying a fixed codebook), majority-adjudicated; 1,447/1,450 were coded by all three. Each post was</w:t>
-      </w:r>
-      <w:r>
-        <w:t xml:space="preserve"> </w:t>
-      </w:r>
-      <w:r>
-        <w:t xml:space="preserve">labelled on four axes: whether it is genuinely about inflation/cost of living; whether religion is genuinely</w:t>
-      </w:r>
-      <w:r>
-        <w:t xml:space="preserve"> </w:t>
-      </w:r>
-      <w:r>
-        <w:t xml:space="preserve">linked to the inflation content (versus incidental, a geographic landmark, a metaphor, a hashtag, or a secular</w:t>
-      </w:r>
-      <w:r>
-        <w:t xml:space="preserve"> </w:t>
-      </w:r>
-      <w:r>
-        <w:t xml:space="preserve">organisation containing a religious word, e.g. </w:t>
-      </w:r>
-      <w:r>
-        <w:rPr>
-          <w:i/>
-          <w:iCs/>
-        </w:rPr>
-        <w:t xml:space="preserve">Crveni križ</w:t>
-      </w:r>
-      <w:r>
-        <w:t xml:space="preserve"> </w:t>
-      </w:r>
-      <w:r>
-        <w:t xml:space="preserve">= Red Cross,</w:t>
-      </w:r>
-      <w:r>
-        <w:t xml:space="preserve"> </w:t>
-      </w:r>
-      <w:r>
-        <w:rPr>
-          <w:i/>
-          <w:iCs/>
-        </w:rPr>
-        <w:t xml:space="preserve">Papa-test</w:t>
-      </w:r>
-      <w:r>
-        <w:t xml:space="preserve"> </w:t>
-      </w:r>
-      <w:r>
-        <w:t xml:space="preserve">= Pap smear); whether the</w:t>
-      </w:r>
-      <w:r>
-        <w:t xml:space="preserve"> </w:t>
-      </w:r>
-      <w:r>
-        <w:t xml:space="preserve">inflation is foreign or domestic; and, when linked, its</w:t>
+        <w:t xml:space="preserve">132</w:t>
+      </w:r>
+      <w:r>
+        <w:t xml:space="preserve"> </w:t>
+      </w:r>
+      <w:r>
+        <w:t xml:space="preserve">concern foreign inflation, leaving a</w:t>
       </w:r>
       <w:r>
         <w:t xml:space="preserve"> </w:t>
@@ -1563,350 +1886,21 @@
           <w:b/>
           <w:bCs/>
         </w:rPr>
-        <w:t xml:space="preserve">register</w:t>
-      </w:r>
-      <w:r>
-        <w:t xml:space="preserve">:</w:t>
-      </w:r>
-      <w:r>
-        <w:t xml:space="preserve"> </w:t>
-      </w:r>
-      <w:r>
-        <w:rPr>
-          <w:i/>
-          <w:iCs/>
-        </w:rPr>
-        <w:t xml:space="preserve">cost of religious life</w:t>
-      </w:r>
-      <w:r>
-        <w:t xml:space="preserve"> </w:t>
-      </w:r>
-      <w:r>
-        <w:t xml:space="preserve">(the price of</w:t>
-      </w:r>
-      <w:r>
-        <w:t xml:space="preserve"> </w:t>
-      </w:r>
-      <w:r>
-        <w:t xml:space="preserve">religious goods/services rising),</w:t>
-      </w:r>
-      <w:r>
-        <w:t xml:space="preserve"> </w:t>
-      </w:r>
-      <w:r>
-        <w:rPr>
-          <w:i/>
-          <w:iCs/>
-        </w:rPr>
-        <w:t xml:space="preserve">Church-as-institution</w:t>
-      </w:r>
-      <w:r>
-        <w:t xml:space="preserve"> </w:t>
-      </w:r>
-      <w:r>
-        <w:t xml:space="preserve">(clergy/Pope/parish as actor or commentator),</w:t>
-      </w:r>
-      <w:r>
-        <w:t xml:space="preserve"> </w:t>
-      </w:r>
-      <w:r>
-        <w:rPr>
-          <w:i/>
-          <w:iCs/>
-        </w:rPr>
-        <w:t xml:space="preserve">structural / CST justice</w:t>
-      </w:r>
-      <w:r>
-        <w:t xml:space="preserve">,</w:t>
-      </w:r>
-      <w:r>
-        <w:t xml:space="preserve"> </w:t>
-      </w:r>
-      <w:r>
-        <w:rPr>
-          <w:i/>
-          <w:iCs/>
-        </w:rPr>
-        <w:t xml:space="preserve">charity</w:t>
-      </w:r>
-      <w:r>
-        <w:t xml:space="preserve"> </w:t>
-      </w:r>
-      <w:r>
-        <w:t xml:space="preserve">(Caritas/relief),</w:t>
-      </w:r>
-      <w:r>
-        <w:t xml:space="preserve"> </w:t>
-      </w:r>
-      <w:r>
-        <w:rPr>
-          <w:i/>
-          <w:iCs/>
-        </w:rPr>
-        <w:t xml:space="preserve">devotional</w:t>
-      </w:r>
-      <w:r>
-        <w:t xml:space="preserve">, or</w:t>
-      </w:r>
-      <w:r>
-        <w:t xml:space="preserve"> </w:t>
-      </w:r>
-      <w:r>
-        <w:rPr>
-          <w:i/>
-          <w:iCs/>
-        </w:rPr>
-        <w:t xml:space="preserve">other</w:t>
-      </w:r>
-      <w:r>
-        <w:t xml:space="preserve">.</w:t>
-      </w:r>
-    </w:p>
-    <w:p>
-      <w:pPr>
-        <w:pStyle w:val="BodyText"/>
-      </w:pPr>
+        <w:t xml:space="preserve">domestic measured core of</w:t>
+      </w:r>
       <w:r>
         <w:rPr>
           <w:b/>
           <w:bCs/>
         </w:rPr>
-        <w:t xml:space="preserve">Validation.</w:t>
-      </w:r>
-      <w:r>
-        <w:t xml:space="preserve"> </w:t>
-      </w:r>
-      <w:r>
-        <w:t xml:space="preserve">On a stratified held-out sample of 80 posts (disjoint from any tuning data), inter-annotator</w:t>
-      </w:r>
-      <w:r>
-        <w:t xml:space="preserve"> </w:t>
-      </w:r>
-      <w:r>
-        <w:t xml:space="preserve">agreement was high — infl 0.975, link 0.967, foreign 0.992 — confirming the constructs are reliably measurable;</w:t>
-      </w:r>
-      <w:r>
-        <w:t xml:space="preserve"> </w:t>
-      </w:r>
-      <w:r>
-        <w:t xml:space="preserve">register is the harder judgement (held-out agreement 0.46). The proximity filter’s held-out precision for</w:t>
-      </w:r>
-      <w:r>
-        <w:t xml:space="preserve"> </w:t>
-      </w:r>
-      <w:r>
-        <w:t xml:space="preserve">domestic linkage was modest (≈0.38–0.46) with recall ≈0.89 — i.e. a</w:t>
-      </w:r>
-      <w:r>
-        <w:t xml:space="preserve"> </w:t>
-      </w:r>
-      <w:r>
-        <w:rPr>
-          <w:i/>
-          <w:iCs/>
-        </w:rPr>
-        <w:t xml:space="preserve">filter</w:t>
-      </w:r>
-      <w:r>
-        <w:t xml:space="preserve">, not a labeller; the full-pool</w:t>
-      </w:r>
-      <w:r>
-        <w:t xml:space="preserve"> </w:t>
-      </w:r>
-      <w:r>
-        <w:t xml:space="preserve">coding confirmed this (45% of candidates coded as genuinely linked). We therefore report coded figures</w:t>
-      </w:r>
-      <w:r>
-        <w:t xml:space="preserve"> </w:t>
-      </w:r>
-      <w:r>
-        <w:t xml:space="preserve">throughout and never regex counts. Annotators are LLM-based, so the agreement is inter-model reliability rather</w:t>
-      </w:r>
-      <w:r>
-        <w:t xml:space="preserve"> </w:t>
-      </w:r>
-      <w:r>
-        <w:t xml:space="preserve">than a human gold standard; a human double-coding pass is planned (see Limitations).</w:t>
-      </w:r>
-    </w:p>
-    <w:p>
-      <w:pPr>
-        <w:pStyle w:val="BodyText"/>
-      </w:pPr>
+        <w:t xml:space="preserve"> </w:t>
+      </w:r>
       <w:r>
         <w:rPr>
           <w:b/>
           <w:bCs/>
         </w:rPr>
-        <w:t xml:space="preserve">Price data.</w:t>
-      </w:r>
-      <w:r>
-        <w:t xml:space="preserve"> </w:t>
-      </w:r>
-      <w:r>
-        <w:t xml:space="preserve">Croatian HICP annual rate of change (monthly; all-items, food, energy) was obtained from</w:t>
-      </w:r>
-      <w:r>
-        <w:t xml:space="preserve"> </w:t>
-      </w:r>
-      <w:r>
-        <w:t xml:space="preserve">Eurostat (</w:t>
-      </w:r>
-      <w:r>
-        <w:rPr>
-          <w:rStyle w:val="VerbatimChar"/>
-        </w:rPr>
-        <w:t xml:space="preserve">prc_hicp_manr</w:t>
-      </w:r>
-      <w:r>
-        <w:t xml:space="preserve">) for 2021–2025.</w:t>
-      </w:r>
-    </w:p>
-    <w:p>
-      <w:pPr>
-        <w:pStyle w:val="BodyText"/>
-      </w:pPr>
-      <w:r>
-        <w:rPr>
-          <w:b/>
-          <w:bCs/>
-        </w:rPr>
-        <w:t xml:space="preserve">Analysis.</w:t>
-      </w:r>
-      <w:r>
-        <w:t xml:space="preserve"> </w:t>
-      </w:r>
-      <w:r>
-        <w:t xml:space="preserve">We report the corpus-to-core funnel; the register distribution and its outlet, temporal, and</w:t>
-      </w:r>
-      <w:r>
-        <w:t xml:space="preserve"> </w:t>
-      </w:r>
-      <w:r>
-        <w:t xml:space="preserve">tonal structure; and a test of H1 correlating monthly inflation-attention with HICP. Because the corpus changes</w:t>
-      </w:r>
-      <w:r>
-        <w:t xml:space="preserve"> </w:t>
-      </w:r>
-      <w:r>
-        <w:t xml:space="preserve">collection instrument at 2024, all temporal analysis is conducted</w:t>
-      </w:r>
-      <w:r>
-        <w:t xml:space="preserve"> </w:t>
-      </w:r>
-      <w:r>
-        <w:rPr>
-          <w:i/>
-          <w:iCs/>
-        </w:rPr>
-        <w:t xml:space="preserve">within</w:t>
-      </w:r>
-      <w:r>
-        <w:t xml:space="preserve"> </w:t>
-      </w:r>
-      <w:r>
-        <w:t xml:space="preserve">the 2021–2024 monitoring stream and</w:t>
-      </w:r>
-      <w:r>
-        <w:t xml:space="preserve"> </w:t>
-      </w:r>
-      <w:r>
-        <w:t xml:space="preserve">the batch-pooled series is reported only for completeness.</w:t>
-      </w:r>
-    </w:p>
-    <w:bookmarkEnd w:id="23"/>
-    <w:bookmarkStart w:id="48" w:name="results"/>
-    <w:p>
-      <w:pPr>
-        <w:pStyle w:val="Heading2"/>
-      </w:pPr>
-      <w:r>
-        <w:t xml:space="preserve">RESULTS</w:t>
-      </w:r>
-    </w:p>
-    <w:bookmarkStart w:id="24" w:name="co-occurrence-is-not-engagement"/>
-    <w:p>
-      <w:pPr>
-        <w:pStyle w:val="Heading3"/>
-      </w:pPr>
-      <w:r>
-        <w:t xml:space="preserve">Co-occurrence is not engagement</w:t>
-      </w:r>
-    </w:p>
-    <w:p>
-      <w:pPr>
-        <w:pStyle w:val="FirstParagraph"/>
-      </w:pPr>
-      <w:r>
-        <w:t xml:space="preserve">The path from corpus to measured core is steep (Table 1). Of 710,307 posts, 8,019 (1.13%) mention inflation. Of</w:t>
-      </w:r>
-      <w:r>
-        <w:t xml:space="preserve"> </w:t>
-      </w:r>
-      <w:r>
-        <w:t xml:space="preserve">those, the recall-oriented filter flags 1,450 as candidate-linked; coding confirms only</w:t>
-      </w:r>
-      <w:r>
-        <w:t xml:space="preserve"> </w:t>
-      </w:r>
-      <w:r>
-        <w:rPr>
-          <w:b/>
-          <w:bCs/>
-        </w:rPr>
-        <w:t xml:space="preserve">652</w:t>
-      </w:r>
-      <w:r>
-        <w:t xml:space="preserve"> </w:t>
-      </w:r>
-      <w:r>
-        <w:t xml:space="preserve">as genuine</w:t>
-      </w:r>
-      <w:r>
-        <w:t xml:space="preserve"> </w:t>
-      </w:r>
-      <w:r>
-        <w:t xml:space="preserve">religion–inflation linkage, of which</w:t>
-      </w:r>
-      <w:r>
-        <w:t xml:space="preserve"> </w:t>
-      </w:r>
-      <w:r>
-        <w:rPr>
-          <w:b/>
-          <w:bCs/>
-        </w:rPr>
-        <w:t xml:space="preserve">132</w:t>
-      </w:r>
-      <w:r>
-        <w:t xml:space="preserve"> </w:t>
-      </w:r>
-      <w:r>
-        <w:t xml:space="preserve">concern foreign inflation, leaving a</w:t>
-      </w:r>
-      <w:r>
-        <w:t xml:space="preserve"> </w:t>
-      </w:r>
-      <w:r>
-        <w:rPr>
-          <w:b/>
-          <w:bCs/>
-        </w:rPr>
-        <w:t xml:space="preserve">domestic measured core of</w:t>
-      </w:r>
-      <w:r>
-        <w:rPr>
-          <w:b/>
-          <w:bCs/>
-        </w:rPr>
-        <w:t xml:space="preserve"> </w:t>
-      </w:r>
-      <w:r>
-        <w:rPr>
-          <w:b/>
-          <w:bCs/>
-        </w:rPr>
-        <w:t xml:space="preserve">520 posts — 0.07% of the corpus and 6.5% of inflation-mentioning posts.</w:t>
+        <w:t xml:space="preserve">520 posts, 0.07% of the corpus and 6.5% of inflation-mentioning posts.</w:t>
       </w:r>
       <w:r>
         <w:t xml:space="preserve"> </w:t>
@@ -1918,25 +1912,31 @@
         <w:t xml:space="preserve"> </w:t>
       </w:r>
       <w:r>
-        <w:t xml:space="preserve">have reported the phenomenon as an order of magnitude larger than it is; even among the proximity-flagged</w:t>
-      </w:r>
-      <w:r>
-        <w:t xml:space="preserve"> </w:t>
-      </w:r>
-      <w:r>
-        <w:t xml:space="preserve">candidates, just 45% survive coding. The 520 is itself a floor rather than a point estimate: at the filter’s</w:t>
-      </w:r>
-      <w:r>
-        <w:t xml:space="preserve"> </w:t>
-      </w:r>
-      <w:r>
-        <w:t xml:space="preserve">validated recall of ≈0.89 (estimated on an 80-post held-out sample), roughly sixty genuine domestic posts are</w:t>
-      </w:r>
-      <w:r>
-        <w:t xml:space="preserve"> </w:t>
-      </w:r>
-      <w:r>
-        <w:t xml:space="preserve">missed before coding (recall-corrected ≈584); all shares below use the measured 520 as the denominator.</w:t>
+        <w:t xml:space="preserve">have reported the phenomenon as an order of magnitude larger than it is. Even among the proximity-flagged</w:t>
+      </w:r>
+      <w:r>
+        <w:t xml:space="preserve"> </w:t>
+      </w:r>
+      <w:r>
+        <w:t xml:space="preserve">candidates, just 45% survive coding. The 520 is itself a floor rather than a point estimate. At the filter’s</w:t>
+      </w:r>
+      <w:r>
+        <w:t xml:space="preserve"> </w:t>
+      </w:r>
+      <w:r>
+        <w:t xml:space="preserve">validated recall of about 0.89, estimated on an 80-post held-out sample, roughly sixty genuine domestic posts</w:t>
+      </w:r>
+      <w:r>
+        <w:t xml:space="preserve"> </w:t>
+      </w:r>
+      <w:r>
+        <w:t xml:space="preserve">are missed before coding, giving a recall-corrected estimate of about 584. All shares below use the measured</w:t>
+      </w:r>
+      <w:r>
+        <w:t xml:space="preserve"> </w:t>
+      </w:r>
+      <w:r>
+        <w:t xml:space="preserve">520 as the denominator.</w:t>
       </w:r>
     </w:p>
     <w:p>
@@ -2550,13 +2550,13 @@
         <w:t xml:space="preserve">biskup</w:t>
       </w:r>
       <w:r>
-        <w:t xml:space="preserve">), and register was the lowest-agreement coding axis (0.46), so their ordering is within coding noise;</w:t>
-      </w:r>
-      <w:r>
-        <w:t xml:space="preserve"> </w:t>
-      </w:r>
-      <w:r>
-        <w:t xml:space="preserve">the robust statement is that together they form an</w:t>
+        <w:t xml:space="preserve">), and register was the lowest-agreement coding axis (0.46), so their ordering is within coding noise.</w:t>
+      </w:r>
+      <w:r>
+        <w:t xml:space="preserve"> </w:t>
+      </w:r>
+      <w:r>
+        <w:t xml:space="preserve">The robust statement is that together they form an</w:t>
       </w:r>
       <w:r>
         <w:t xml:space="preserve"> </w:t>
@@ -2594,19 +2594,19 @@
         <w:t xml:space="preserve"> </w:t>
       </w:r>
       <w:r>
-        <w:t xml:space="preserve">Second, the 3% justice figure is a strict-coding floor: broadening to posts in other registers whose text</w:t>
-      </w:r>
-      <w:r>
-        <w:t xml:space="preserve"> </w:t>
-      </w:r>
-      <w:r>
-        <w:t xml:space="preserve">carries latent structural language (chiefly 18 charity posts, e.g. Caritas discussing structural poverty)</w:t>
-      </w:r>
-      <w:r>
-        <w:t xml:space="preserve"> </w:t>
-      </w:r>
-      <w:r>
-        <w:t xml:space="preserve">raises the upper bound to</w:t>
+        <w:t xml:space="preserve">Second, the 3% justice figure is a strict-coding floor. Broadening to posts in other registers whose text</w:t>
+      </w:r>
+      <w:r>
+        <w:t xml:space="preserve"> </w:t>
+      </w:r>
+      <w:r>
+        <w:t xml:space="preserve">carries latent structural language (chiefly 18 charity posts, for example Caritas discussing structural</w:t>
+      </w:r>
+      <w:r>
+        <w:t xml:space="preserve"> </w:t>
+      </w:r>
+      <w:r>
+        <w:t xml:space="preserve">poverty) raises the upper bound to</w:t>
       </w:r>
       <w:r>
         <w:t xml:space="preserve"> </w:t>
@@ -3091,7 +3091,7 @@
         <w:t xml:space="preserve"> </w:t>
       </w:r>
       <w:r>
-        <w:t xml:space="preserve">carries a definitional caveat: it includes clergy appearing as</w:t>
+        <w:t xml:space="preserve">carries a definitional caveat. It includes clergy appearing as</w:t>
       </w:r>
       <w:r>
         <w:t xml:space="preserve"> </w:t>
@@ -3104,16 +3104,13 @@
         <w:t xml:space="preserve">commentators</w:t>
       </w:r>
       <w:r>
-        <w:t xml:space="preserve"> </w:t>
-      </w:r>
-      <w:r>
-        <w:t xml:space="preserve">— speaking subjects, some of whom</w:t>
-      </w:r>
-      <w:r>
-        <w:t xml:space="preserve"> </w:t>
-      </w:r>
-      <w:r>
-        <w:t xml:space="preserve">voice moral or economic judgements — alongside the Church as an affected party, so the</w:t>
+        <w:t xml:space="preserve">, speaking subjects, some of whom</w:t>
+      </w:r>
+      <w:r>
+        <w:t xml:space="preserve"> </w:t>
+      </w:r>
+      <w:r>
+        <w:t xml:space="preserve">voice moral or economic judgements, alongside the Church as an affected party. The</w:t>
       </w:r>
       <w:r>
         <w:t xml:space="preserve"> </w:t>
@@ -3125,7 +3122,13 @@
         <w:t xml:space="preserve"> </w:t>
       </w:r>
       <w:r>
-        <w:t xml:space="preserve">reading of the ≈72% macro-register is an upper bound; splitting the institution register into subject and</w:t>
+        <w:t xml:space="preserve">reading of</w:t>
+      </w:r>
+      <w:r>
+        <w:t xml:space="preserve"> </w:t>
+      </w:r>
+      <w:r>
+        <w:t xml:space="preserve">the ≈72% macro-register is therefore an upper bound, and splitting the institution register into subject and</w:t>
       </w:r>
       <w:r>
         <w:t xml:space="preserve"> </w:t>
@@ -3167,7 +3170,7 @@
         <w:t xml:space="preserve"> </w:t>
       </w:r>
       <w:r>
-        <w:t xml:space="preserve">story — 189 of 194 such posts are secular outlets reporting that the</w:t>
+        <w:t xml:space="preserve">story: 189 of 194 such posts are secular outlets reporting that the</w:t>
       </w:r>
       <w:r>
         <w:t xml:space="preserve"> </w:t>
@@ -3189,13 +3192,13 @@
         <w:t xml:space="preserve"> </w:t>
       </w:r>
       <w:r>
-        <w:t xml:space="preserve">(27/75 = 36% of the Catholic core vs 58/442 = 13% of the secular core). We do not press this claim: the Catholic</w:t>
-      </w:r>
-      <w:r>
-        <w:t xml:space="preserve"> </w:t>
-      </w:r>
-      <w:r>
-        <w:t xml:space="preserve">subsample is small (n = 75), 75% of it is the single aggregator</w:t>
+        <w:t xml:space="preserve">(27/75, or 36%, of the Catholic core versus 58/442, or 13%, of the secular core). We do not press this claim.</w:t>
+      </w:r>
+      <w:r>
+        <w:t xml:space="preserve"> </w:t>
+      </w:r>
+      <w:r>
+        <w:t xml:space="preserve">The Catholic subsample is small (n = 75), 75% of it is the single aggregator</w:t>
       </w:r>
       <w:r>
         <w:t xml:space="preserve"> </w:t>
@@ -3211,7 +3214,13 @@
         <w:t xml:space="preserve"> </w:t>
       </w:r>
       <w:r>
-        <w:t xml:space="preserve">(56 posts) whose own top register is</w:t>
+        <w:t xml:space="preserve">(56 posts) whose own top</w:t>
+      </w:r>
+      <w:r>
+        <w:t xml:space="preserve"> </w:t>
+      </w:r>
+      <w:r>
+        <w:t xml:space="preserve">register is</w:t>
       </w:r>
       <w:r>
         <w:t xml:space="preserve"> </w:t>
@@ -3243,19 +3252,19 @@
         <w:t xml:space="preserve"> </w:t>
       </w:r>
       <w:r>
-        <w:t xml:space="preserve">leaves just 19 posts. We therefore report the</w:t>
-      </w:r>
-      <w:r>
-        <w:t xml:space="preserve"> </w:t>
-      </w:r>
-      <w:r>
-        <w:t xml:space="preserve">direction as a hypothesis for a larger Catholic-outlet sample, not a finding. What is robust across outlets is</w:t>
-      </w:r>
-      <w:r>
-        <w:t xml:space="preserve"> </w:t>
-      </w:r>
-      <w:r>
-        <w:t xml:space="preserve">the near-absence of the justice register (10 secular, 5 Catholic).</w:t>
+        <w:t xml:space="preserve">leaves just 19 posts. We therefore</w:t>
+      </w:r>
+      <w:r>
+        <w:t xml:space="preserve"> </w:t>
+      </w:r>
+      <w:r>
+        <w:t xml:space="preserve">report the direction as a hypothesis for a larger Catholic-outlet sample, not a finding. What is robust across</w:t>
+      </w:r>
+      <w:r>
+        <w:t xml:space="preserve"> </w:t>
+      </w:r>
+      <w:r>
+        <w:t xml:space="preserve">outlets is the near-absence of the justice register (10 secular, 5 Catholic).</w:t>
       </w:r>
     </w:p>
     <w:p>
@@ -3847,7 +3856,7 @@
           <w:b/>
           <w:bCs/>
         </w:rPr>
-        <w:t xml:space="preserve">Within the clean 2021–2024 monitoring stream</w:t>
+        <w:t xml:space="preserve">Within the clean 2021 to 2024 monitoring stream</w:t>
       </w:r>
       <w:r>
         <w:t xml:space="preserve">, the core rises sharply to a</w:t>
@@ -3860,25 +3869,22 @@
           <w:b/>
           <w:bCs/>
         </w:rPr>
-        <w:t xml:space="preserve">2022 peak (201 posts)</w:t>
-      </w:r>
-      <w:r>
-        <w:t xml:space="preserve"> </w:t>
-      </w:r>
-      <w:r>
-        <w:t xml:space="preserve">— the</w:t>
-      </w:r>
-      <w:r>
-        <w:t xml:space="preserve"> </w:t>
-      </w:r>
-      <w:r>
-        <w:t xml:space="preserve">height of the energy shock — and declines thereafter (2023: 100; 2024: 64). This within-instrument decline is</w:t>
-      </w:r>
-      <w:r>
-        <w:t xml:space="preserve"> </w:t>
-      </w:r>
-      <w:r>
-        <w:t xml:space="preserve">genuine, not a collection artifact. The later backfill figures (2025: 66; 2026: 53) come from a different</w:t>
+        <w:t xml:space="preserve">2022 peak of 201 posts</w:t>
+      </w:r>
+      <w:r>
+        <w:t xml:space="preserve">,</w:t>
+      </w:r>
+      <w:r>
+        <w:t xml:space="preserve"> </w:t>
+      </w:r>
+      <w:r>
+        <w:t xml:space="preserve">the height of the energy shock, and declines thereafter (2023: 100, 2024: 64). This within-instrument decline is</w:t>
+      </w:r>
+      <w:r>
+        <w:t xml:space="preserve"> </w:t>
+      </w:r>
+      <w:r>
+        <w:t xml:space="preserve">genuine, not a collection artifact. The later backfill figures (2025: 66, 2026: 53) come from a different</w:t>
       </w:r>
       <w:r>
         <w:t xml:space="preserve"> </w:t>
@@ -3989,7 +3995,7 @@
         <w:pStyle w:val="BodyText"/>
       </w:pPr>
       <w:r>
-        <w:t xml:space="preserve">Within that same window, the register composition shifts (Figure 4, Table 4): the</w:t>
+        <w:t xml:space="preserve">Within that same window, the register composition shifts (Figure 4, Table 4). The</w:t>
       </w:r>
       <w:r>
         <w:t xml:space="preserve"> </w:t>
@@ -4011,13 +4017,13 @@
         <w:t xml:space="preserve"> </w:t>
       </w:r>
       <w:r>
-        <w:t xml:space="preserve">dominates the 2022 shock (105 posts) — clergy commenting on the crisis — and recedes (38 in 2023, 9 in 2024),</w:t>
-      </w:r>
-      <w:r>
-        <w:t xml:space="preserve"> </w:t>
-      </w:r>
-      <w:r>
-        <w:t xml:space="preserve">while</w:t>
+        <w:t xml:space="preserve">dominates the 2022 shock (105 posts), reflecting clergy commenting on the crisis, and recedes (38 in 2023, 9 in</w:t>
+      </w:r>
+      <w:r>
+        <w:t xml:space="preserve"> </w:t>
+      </w:r>
+      <w:r>
+        <w:t xml:space="preserve">2024), while</w:t>
       </w:r>
       <w:r>
         <w:t xml:space="preserve"> </w:t>
@@ -4033,49 +4039,49 @@
         <w:t xml:space="preserve"> </w:t>
       </w:r>
       <w:r>
-        <w:t xml:space="preserve">rises (41 → 39 → 61), tracking the church-fee revisions around the euro changeover</w:t>
-      </w:r>
-      <w:r>
-        <w:t xml:space="preserve"> </w:t>
-      </w:r>
-      <w:r>
-        <w:t xml:space="preserve">(1 January 2023). The discourse thus appears to migrate from acute-crisis commentary toward institutional price</w:t>
-      </w:r>
-      <w:r>
-        <w:t xml:space="preserve"> </w:t>
-      </w:r>
-      <w:r>
-        <w:t xml:space="preserve">adjustment. The euro changeover itself is a cross-sectoral media event — it generated price-transparency and</w:t>
-      </w:r>
-      <w:r>
-        <w:t xml:space="preserve"> </w:t>
-      </w:r>
-      <w:r>
-        <w:t xml:space="preserve">rounding-up coverage across the whole economy — so part of the cost-of-religious-life rise that follows the</w:t>
-      </w:r>
-      <w:r>
-        <w:t xml:space="preserve"> </w:t>
-      </w:r>
-      <w:r>
-        <w:t xml:space="preserve">changeover plausibly tracks changeover journalism rather than inflation dynamics alone. We treat this register shift as</w:t>
-      </w:r>
-      <w:r>
-        <w:t xml:space="preserve"> </w:t>
-      </w:r>
-      <w:r>
-        <w:t xml:space="preserve">suggestive rather than established: part of it spans the stream seam</w:t>
-      </w:r>
-      <w:r>
-        <w:t xml:space="preserve"> </w:t>
-      </w:r>
-      <w:r>
-        <w:t xml:space="preserve">and awaits a stream-conditioned re-coding. At no point, in either stream, does the justice register gain</w:t>
-      </w:r>
-      <w:r>
-        <w:t xml:space="preserve"> </w:t>
-      </w:r>
-      <w:r>
-        <w:t xml:space="preserve">traction.</w:t>
+        <w:t xml:space="preserve">rises from 41 to 39 to 61 posts a year, tracking the church-fee revisions</w:t>
+      </w:r>
+      <w:r>
+        <w:t xml:space="preserve"> </w:t>
+      </w:r>
+      <w:r>
+        <w:t xml:space="preserve">around the euro changeover on 1 January 2023. The discourse thus appears to migrate from acute-crisis</w:t>
+      </w:r>
+      <w:r>
+        <w:t xml:space="preserve"> </w:t>
+      </w:r>
+      <w:r>
+        <w:t xml:space="preserve">commentary toward institutional price adjustment. The euro changeover itself is a cross-sectoral media event.</w:t>
+      </w:r>
+      <w:r>
+        <w:t xml:space="preserve"> </w:t>
+      </w:r>
+      <w:r>
+        <w:t xml:space="preserve">It generated price-transparency and rounding-up coverage across the whole economy, so part of the</w:t>
+      </w:r>
+      <w:r>
+        <w:t xml:space="preserve"> </w:t>
+      </w:r>
+      <w:r>
+        <w:t xml:space="preserve">cost-of-religious-life rise that follows the changeover plausibly tracks changeover journalism rather than</w:t>
+      </w:r>
+      <w:r>
+        <w:t xml:space="preserve"> </w:t>
+      </w:r>
+      <w:r>
+        <w:t xml:space="preserve">inflation dynamics alone. We treat this register shift as suggestive rather than established, since part of it</w:t>
+      </w:r>
+      <w:r>
+        <w:t xml:space="preserve"> </w:t>
+      </w:r>
+      <w:r>
+        <w:t xml:space="preserve">spans the stream seam and awaits a stream-conditioned re-coding. At no point, in either stream, does the</w:t>
+      </w:r>
+      <w:r>
+        <w:t xml:space="preserve"> </w:t>
+      </w:r>
+      <w:r>
+        <w:t xml:space="preserve">justice register gain traction.</w:t>
       </w:r>
     </w:p>
     <w:p>
@@ -4716,7 +4722,7 @@
         <w:pStyle w:val="BodyText"/>
       </w:pPr>
       <w:r>
-        <w:t xml:space="preserve">Note: 2021–2023 are entirely the monitoring stream; 2024 mixes both streams (64 monitoring + 24 backfill = 88); 2025–2026 are entirely the backfill stream. Read across the 2024 seam with caution (see</w:t>
+        <w:t xml:space="preserve">Note: 2021 to 2023 are entirely the monitoring stream. 2024 mixes both streams (64 monitoring plus 24 backfill, 88 total). 2025 to 2026 are entirely the backfill stream. Read across the 2024 seam with caution (see</w:t>
       </w:r>
       <w:r>
         <w:t xml:space="preserve"> </w:t>
@@ -4725,7 +4731,7 @@
         <w:t xml:space="preserve">“Temporal dynamics”</w:t>
       </w:r>
       <w:r>
-        <w:t xml:space="preserve">); the within-stream monitoring series is 2021→12, 2022→201, 2023→100, 2024→64.</w:t>
+        <w:t xml:space="preserve">). The within-stream monitoring series is 12 posts in 2021, 201 in 2022, 100 in 2023, and 64 in 2024.</w:t>
       </w:r>
       <w:r>
         <w:t xml:space="preserve"> </w:t>
@@ -4896,7 +4902,7 @@
           <w:i/>
           <w:iCs/>
         </w:rPr>
-        <w:t xml:space="preserve">Auto-sentiment by register (counts; vendor labels, indicative)</w:t>
+        <w:t xml:space="preserve">Auto-sentiment by register (counts, vendor labels, indicative)</w:t>
       </w:r>
     </w:p>
     <w:tbl>
@@ -5305,7 +5311,7 @@
         <w:pStyle w:val="Heading3"/>
       </w:pPr>
       <w:r>
-        <w:t xml:space="preserve">H1 — inflation attention tracks real prices</w:t>
+        <w:t xml:space="preserve">H1: inflation attention tracks real prices</w:t>
       </w:r>
     </w:p>
     <w:p>
@@ -5313,37 +5319,37 @@
         <w:pStyle w:val="FirstParagraph"/>
       </w:pPr>
       <w:r>
-        <w:t xml:space="preserve">To test H1 we correlate monthly inflation-attention (the share of corpus posts mentioning inflation) with the</w:t>
-      </w:r>
-      <w:r>
-        <w:t xml:space="preserve"> </w:t>
-      </w:r>
-      <w:r>
-        <w:t xml:space="preserve">Croatian HICP annual rate of change (headline, food, energy), within the 2021–2024 monitoring stream — 39</w:t>
-      </w:r>
-      <w:r>
-        <w:t xml:space="preserve"> </w:t>
-      </w:r>
-      <w:r>
-        <w:t xml:space="preserve">months with coverage: 37 consecutive months through January 2024, plus two thin months (June–July 2024) as the</w:t>
-      </w:r>
-      <w:r>
-        <w:t xml:space="preserve"> </w:t>
-      </w:r>
-      <w:r>
-        <w:t xml:space="preserve">stream winds down, so the series is not fully contiguous; the batch-pooled series is reported for completeness</w:t>
-      </w:r>
-      <w:r>
-        <w:t xml:space="preserve"> </w:t>
-      </w:r>
-      <w:r>
-        <w:t xml:space="preserve">only. Within the clean window, attention tracks</w:t>
-      </w:r>
-      <w:r>
-        <w:t xml:space="preserve"> </w:t>
-      </w:r>
-      <w:r>
-        <w:t xml:space="preserve">inflation strongly (Table 6, Figure 6): Pearson</w:t>
+        <w:t xml:space="preserve">To test H1 we correlate monthly inflation-attention, the share of corpus posts mentioning inflation, with the</w:t>
+      </w:r>
+      <w:r>
+        <w:t xml:space="preserve"> </w:t>
+      </w:r>
+      <w:r>
+        <w:t xml:space="preserve">Croatian HICP annual rate of change (headline, food, energy), within the 2021 to 2024 monitoring stream. This</w:t>
+      </w:r>
+      <w:r>
+        <w:t xml:space="preserve"> </w:t>
+      </w:r>
+      <w:r>
+        <w:t xml:space="preserve">stream provides 39 months with coverage: 37 consecutive months through January 2024, plus two thin months in</w:t>
+      </w:r>
+      <w:r>
+        <w:t xml:space="preserve"> </w:t>
+      </w:r>
+      <w:r>
+        <w:t xml:space="preserve">June and July 2024 as the stream winds down, so the series is not fully contiguous. The batch-pooled series is</w:t>
+      </w:r>
+      <w:r>
+        <w:t xml:space="preserve"> </w:t>
+      </w:r>
+      <w:r>
+        <w:t xml:space="preserve">reported for completeness only. Within the clean window, attention tracks inflation strongly (Table 6, Figure</w:t>
+      </w:r>
+      <w:r>
+        <w:t xml:space="preserve"> </w:t>
+      </w:r>
+      <w:r>
+        <w:t xml:space="preserve">6): Pearson</w:t>
       </w:r>
       <w:r>
         <w:t xml:space="preserve"> </w:t>
@@ -5359,13 +5365,7 @@
         <w:t xml:space="preserve"> </w:t>
       </w:r>
       <w:r>
-        <w:t xml:space="preserve">with headline HICP (nominal p &lt; 0.001; see the</w:t>
-      </w:r>
-      <w:r>
-        <w:t xml:space="preserve"> </w:t>
-      </w:r>
-      <w:r>
-        <w:t xml:space="preserve">inference cautions below),</w:t>
+        <w:t xml:space="preserve">with headline HICP (nominal p &lt; 0.001, see the inference cautions below),</w:t>
       </w:r>
       <w:r>
         <w:t xml:space="preserve"> </w:t>
@@ -5381,7 +5381,13 @@
         <w:t xml:space="preserve"> </w:t>
       </w:r>
       <w:r>
-        <w:t xml:space="preserve">with food, and</w:t>
+        <w:t xml:space="preserve">with</w:t>
+      </w:r>
+      <w:r>
+        <w:t xml:space="preserve"> </w:t>
+      </w:r>
+      <w:r>
+        <w:t xml:space="preserve">food, and</w:t>
       </w:r>
       <w:r>
         <w:t xml:space="preserve"> </w:t>
@@ -5397,13 +5403,13 @@
         <w:t xml:space="preserve"> </w:t>
       </w:r>
       <w:r>
-        <w:t xml:space="preserve">with energy (Spearman ρ comparable). The threshold</w:t>
-      </w:r>
-      <w:r>
-        <w:t xml:space="preserve"> </w:t>
-      </w:r>
-      <w:r>
-        <w:t xml:space="preserve">form of H1 also holds descriptively: mean attention is</w:t>
+        <w:t xml:space="preserve">with energy (Spearman ρ comparable). The threshold form of H1 also holds descriptively. Mean</w:t>
+      </w:r>
+      <w:r>
+        <w:t xml:space="preserve"> </w:t>
+      </w:r>
+      <w:r>
+        <w:t xml:space="preserve">attention is</w:t>
       </w:r>
       <w:r>
         <w:t xml:space="preserve"> </w:t>
@@ -5419,13 +5425,7 @@
         <w:t xml:space="preserve"> </w:t>
       </w:r>
       <w:r>
-        <w:t xml:space="preserve">of posts in months with headline HICP below 4%</w:t>
-      </w:r>
-      <w:r>
-        <w:t xml:space="preserve"> </w:t>
-      </w:r>
-      <w:r>
-        <w:t xml:space="preserve">(12 months) and</w:t>
+        <w:t xml:space="preserve">of posts in months with headline HICP below 4% (12 months) and</w:t>
       </w:r>
       <w:r>
         <w:t xml:space="preserve"> </w:t>
@@ -5441,13 +5441,13 @@
         <w:t xml:space="preserve"> </w:t>
       </w:r>
       <w:r>
-        <w:t xml:space="preserve">at or above (27 months) — a 2.4-fold jump around the ≈4% attention threshold</w:t>
-      </w:r>
-      <w:r>
-        <w:t xml:space="preserve"> </w:t>
-      </w:r>
-      <w:r>
-        <w:t xml:space="preserve">documented cross-nationally.</w:t>
+        <w:t xml:space="preserve">at or above (27</w:t>
+      </w:r>
+      <w:r>
+        <w:t xml:space="preserve"> </w:t>
+      </w:r>
+      <w:r>
+        <w:t xml:space="preserve">months), a 2.4-fold jump around the threshold of about 4% documented cross-nationally.</w:t>
       </w:r>
     </w:p>
     <w:p>
@@ -5461,19 +5461,19 @@
         <w:t xml:space="preserve"> </w:t>
       </w:r>
       <w:r>
-        <w:t xml:space="preserve">consecutive monthly observations overlap by eleven months and are strongly autocorrelated — and the attention</w:t>
-      </w:r>
-      <w:r>
-        <w:t xml:space="preserve"> </w:t>
-      </w:r>
-      <w:r>
-        <w:t xml:space="preserve">series is itself persistent — so the effective number of independent observations is well below the stated</w:t>
-      </w:r>
-      <w:r>
-        <w:t xml:space="preserve"> </w:t>
-      </w:r>
-      <w:r>
-        <w:t xml:space="preserve">n = 39, and the nominal p-value overstates precision; a HAC re-estimate and a first-differenced (month-on-month)</w:t>
+        <w:t xml:space="preserve">consecutive monthly observations overlap by eleven months and are strongly autocorrelated. The attention series</w:t>
+      </w:r>
+      <w:r>
+        <w:t xml:space="preserve"> </w:t>
+      </w:r>
+      <w:r>
+        <w:t xml:space="preserve">is itself persistent as well, so the effective number of independent observations is well below the stated</w:t>
+      </w:r>
+      <w:r>
+        <w:t xml:space="preserve"> </w:t>
+      </w:r>
+      <w:r>
+        <w:t xml:space="preserve">n = 39, and the nominal p-value overstates precision. A HAC re-estimate and a first-differenced, month-on-month,</w:t>
       </w:r>
       <w:r>
         <w:t xml:space="preserve"> </w:t>
@@ -5485,37 +5485,43 @@
         <w:t xml:space="preserve"> </w:t>
       </w:r>
       <w:r>
-        <w:t xml:space="preserve">Second, the ≈4% cutpoint is imposed from the cross-national literature, not estimated from these data; 39 months</w:t>
-      </w:r>
-      <w:r>
-        <w:t xml:space="preserve"> </w:t>
-      </w:r>
-      <w:r>
-        <w:t xml:space="preserve">cannot identify a breakpoint, no formal test of the two-bin contrast is reported, and the 12 below-threshold</w:t>
-      </w:r>
-      <w:r>
-        <w:t xml:space="preserve"> </w:t>
-      </w:r>
-      <w:r>
-        <w:t xml:space="preserve">months are temporally clustered — ten at the start of 2021 and two at the 2024 tail — so the contrast cannot</w:t>
-      </w:r>
-      <w:r>
-        <w:t xml:space="preserve"> </w:t>
-      </w:r>
-      <w:r>
-        <w:t xml:space="preserve">distinguish a genuine discontinuity from the smooth coupling already described. Third, as noted under temporal</w:t>
-      </w:r>
-      <w:r>
-        <w:t xml:space="preserve"> </w:t>
-      </w:r>
-      <w:r>
-        <w:t xml:space="preserve">dynamics, the January 2023 euro changeover flooded all sectors with price coverage, so part of the 2023</w:t>
-      </w:r>
-      <w:r>
-        <w:t xml:space="preserve"> </w:t>
-      </w:r>
-      <w:r>
-        <w:t xml:space="preserve">attention is plausibly changeover journalism rather than a response to the inflation rate as such.</w:t>
+        <w:t xml:space="preserve">Second, the cutpoint of about 4% is imposed from the cross-national literature rather than estimated from these</w:t>
+      </w:r>
+      <w:r>
+        <w:t xml:space="preserve"> </w:t>
+      </w:r>
+      <w:r>
+        <w:t xml:space="preserve">data. With only 39 months, the data cannot identify a breakpoint, no formal test of the two-bin contrast is</w:t>
+      </w:r>
+      <w:r>
+        <w:t xml:space="preserve"> </w:t>
+      </w:r>
+      <w:r>
+        <w:t xml:space="preserve">reported, and the 12 below-threshold months are temporally clustered, ten at the start of 2021 and two at the</w:t>
+      </w:r>
+      <w:r>
+        <w:t xml:space="preserve"> </w:t>
+      </w:r>
+      <w:r>
+        <w:t xml:space="preserve">2024 tail, so the contrast cannot distinguish a genuine discontinuity from the smooth coupling already</w:t>
+      </w:r>
+      <w:r>
+        <w:t xml:space="preserve"> </w:t>
+      </w:r>
+      <w:r>
+        <w:t xml:space="preserve">described. Third, as noted under temporal dynamics, the January 2023 euro changeover flooded all sectors with</w:t>
+      </w:r>
+      <w:r>
+        <w:t xml:space="preserve"> </w:t>
+      </w:r>
+      <w:r>
+        <w:t xml:space="preserve">price coverage, so part of the 2023 attention is plausibly changeover journalism rather than a response to the</w:t>
+      </w:r>
+      <w:r>
+        <w:t xml:space="preserve"> </w:t>
+      </w:r>
+      <w:r>
+        <w:t xml:space="preserve">inflation rate as such.</w:t>
       </w:r>
     </w:p>
     <w:p>
@@ -5536,7 +5542,7 @@
         <w:t xml:space="preserve">H1 is partially supported</w:t>
       </w:r>
       <w:r>
-        <w:t xml:space="preserve">: the attention–price coupling and the descriptive threshold</w:t>
+        <w:t xml:space="preserve">. The attention-price coupling and the descriptive threshold</w:t>
       </w:r>
       <w:r>
         <w:t xml:space="preserve"> </w:t>
@@ -5572,7 +5578,13 @@
         <w:t xml:space="preserve"> </w:t>
       </w:r>
       <w:r>
-        <w:t xml:space="preserve">(r = 0.44) — energy’s large, partly negative swings in 2023–2024 loosen its link to attention, so the</w:t>
+        <w:t xml:space="preserve">(r = 0.44). Energy’s large, partly negative swings in 2023 to 2024 loosen its link to attention, so</w:t>
+      </w:r>
+      <w:r>
+        <w:t xml:space="preserve"> </w:t>
+      </w:r>
+      <w:r>
+        <w:t xml:space="preserve">the</w:t>
       </w:r>
       <w:r>
         <w:t xml:space="preserve"> </w:t>
@@ -5584,13 +5596,13 @@
         <w:t xml:space="preserve"> </w:t>
       </w:r>
       <w:r>
-        <w:t xml:space="preserve">salience clause holds for food but not energy here. This component reading is indirect: we</w:t>
-      </w:r>
-      <w:r>
-        <w:t xml:space="preserve"> </w:t>
-      </w:r>
-      <w:r>
-        <w:t xml:space="preserve">correlate aggregate attention with each HICP component, which captures comovement rather than</w:t>
+        <w:t xml:space="preserve">salience clause holds for food but not for energy here. This component reading is</w:t>
+      </w:r>
+      <w:r>
+        <w:t xml:space="preserve"> </w:t>
+      </w:r>
+      <w:r>
+        <w:t xml:space="preserve">indirect: we correlate aggregate attention with each HICP component, which captures comovement rather than</w:t>
       </w:r>
       <w:r>
         <w:t xml:space="preserve"> </w:t>
@@ -5602,13 +5614,13 @@
         <w:t xml:space="preserve"> </w:t>
       </w:r>
       <w:r>
-        <w:t xml:space="preserve">an artifact of the ragged window tail — restricting to the contiguous 2021–2023 block gives r = 0.77 (n = 36),</w:t>
-      </w:r>
-      <w:r>
-        <w:t xml:space="preserve"> </w:t>
-      </w:r>
-      <w:r>
-        <w:t xml:space="preserve">and dropping the thinnest tail month gives r = 0.72 — while the batch-pooled series attenuates it (headline</w:t>
+        <w:t xml:space="preserve">an artifact of the ragged window tail. Restricting to the contiguous 2021 to 2023 block gives r = 0.77 (n = 36),</w:t>
+      </w:r>
+      <w:r>
+        <w:t xml:space="preserve"> </w:t>
+      </w:r>
+      <w:r>
+        <w:t xml:space="preserve">and dropping the thinnest tail month gives r = 0.72, while the batch-pooled series attenuates it (headline</w:t>
       </w:r>
       <w:r>
         <w:t xml:space="preserve"> </w:t>
@@ -5620,7 +5632,7 @@
         <w:t xml:space="preserve"> </w:t>
       </w:r>
       <w:r>
-        <w:t xml:space="preserve">test, but its annual volume aligns with inflation (both peak in 2022).</w:t>
+        <w:t xml:space="preserve">test, but its annual volume aligns with inflation, since both peak in 2022.</w:t>
       </w:r>
     </w:p>
     <w:p>
@@ -5638,7 +5650,7 @@
           <w:i/>
           <w:iCs/>
         </w:rPr>
-        <w:t xml:space="preserve">Inflation-attention vs HICP (monthly, within the 2021–2024 stream; n = 39 months with coverage, not fully contiguous)</w:t>
+        <w:t xml:space="preserve">Inflation-attention versus HICP (monthly, within the 2021–2024 stream, n = 39 months with coverage, not fully contiguous)</w:t>
       </w:r>
     </w:p>
     <w:tbl>
@@ -5943,31 +5955,31 @@
         <w:t xml:space="preserve"> </w:t>
       </w:r>
       <w:r>
-        <w:t xml:space="preserve">digital discourse is not the pulpit but the price list. Seven in ten linked posts (the ≈72% economic-object</w:t>
-      </w:r>
-      <w:r>
-        <w:t xml:space="preserve"> </w:t>
-      </w:r>
-      <w:r>
-        <w:t xml:space="preserve">macro-register — itself an upper bound on the object reading, since the institution register also contains</w:t>
-      </w:r>
-      <w:r>
-        <w:t xml:space="preserve"> </w:t>
-      </w:r>
-      <w:r>
-        <w:t xml:space="preserve">clergy as commentators; see Results) describe either the rising cost of religious life or the Church as an</w:t>
-      </w:r>
-      <w:r>
-        <w:t xml:space="preserve"> </w:t>
-      </w:r>
-      <w:r>
-        <w:t xml:space="preserve">institution caught in economic news; charity adds a sixth; the structural-justice critique CST foregrounds is marginal (3% strict,</w:t>
-      </w:r>
-      <w:r>
-        <w:t xml:space="preserve"> </w:t>
-      </w:r>
-      <w:r>
-        <w:t xml:space="preserve">≤8% broad). We frame this as a claim about</w:t>
+        <w:t xml:space="preserve">digital discourse is not the pulpit but the price list. Seven in ten linked posts, the ≈72% economic-object</w:t>
+      </w:r>
+      <w:r>
+        <w:t xml:space="preserve"> </w:t>
+      </w:r>
+      <w:r>
+        <w:t xml:space="preserve">macro-register (itself an upper bound on the object reading, since the institution register also contains</w:t>
+      </w:r>
+      <w:r>
+        <w:t xml:space="preserve"> </w:t>
+      </w:r>
+      <w:r>
+        <w:t xml:space="preserve">clergy as commentators, see Results), describe either the rising cost of religious life or the Church as an</w:t>
+      </w:r>
+      <w:r>
+        <w:t xml:space="preserve"> </w:t>
+      </w:r>
+      <w:r>
+        <w:t xml:space="preserve">institution caught in economic news. Charity adds a sixth, and the structural-justice critique CST foregrounds</w:t>
+      </w:r>
+      <w:r>
+        <w:t xml:space="preserve"> </w:t>
+      </w:r>
+      <w:r>
+        <w:t xml:space="preserve">is marginal, at 3% under strict coding and at most 8% broadly construed. We frame this as a claim about</w:t>
       </w:r>
       <w:r>
         <w:t xml:space="preserve"> </w:t>
@@ -5980,31 +5992,31 @@
         <w:t xml:space="preserve">digital-public visibility, not the Church’s pastoral conduct</w:t>
       </w:r>
       <w:r>
-        <w:t xml:space="preserve">:</w:t>
-      </w:r>
-      <w:r>
-        <w:t xml:space="preserve"> </w:t>
-      </w:r>
-      <w:r>
-        <w:t xml:space="preserve">homilies, pastoral letters and Caritas fieldwork are structurally under-represented in a media-monitoring</w:t>
-      </w:r>
-      <w:r>
-        <w:t xml:space="preserve"> </w:t>
-      </w:r>
-      <w:r>
-        <w:t xml:space="preserve">corpus of news posts, so the low visibility of the justice frame is weak evidence about institutional silence as</w:t>
-      </w:r>
-      <w:r>
-        <w:t xml:space="preserve"> </w:t>
-      </w:r>
-      <w:r>
-        <w:t xml:space="preserve">such (see Limitations). What the data support is that, in the national digital public sphere, the frame that</w:t>
-      </w:r>
-      <w:r>
-        <w:t xml:space="preserve"> </w:t>
-      </w:r>
-      <w:r>
-        <w:t xml:space="preserve">surfaces around inflation is overwhelmingly the fee and the institution, not the prophecy.</w:t>
+        <w:t xml:space="preserve">. Homilies, pastoral letters and Caritas</w:t>
+      </w:r>
+      <w:r>
+        <w:t xml:space="preserve"> </w:t>
+      </w:r>
+      <w:r>
+        <w:t xml:space="preserve">fieldwork are structurally under-represented in a media-monitoring corpus of news posts, so the low visibility</w:t>
+      </w:r>
+      <w:r>
+        <w:t xml:space="preserve"> </w:t>
+      </w:r>
+      <w:r>
+        <w:t xml:space="preserve">of the justice frame is weak evidence about institutional silence as such (see Limitations). What the data</w:t>
+      </w:r>
+      <w:r>
+        <w:t xml:space="preserve"> </w:t>
+      </w:r>
+      <w:r>
+        <w:t xml:space="preserve">support is that, in the national digital public sphere, the frame that surfaces around inflation is</w:t>
+      </w:r>
+      <w:r>
+        <w:t xml:space="preserve"> </w:t>
+      </w:r>
+      <w:r>
+        <w:t xml:space="preserve">overwhelmingly the fee and the institution, not the prophecy.</w:t>
       </w:r>
     </w:p>
     <w:p>
@@ -6028,61 +6040,61 @@
         <w:t xml:space="preserve"> </w:t>
       </w:r>
       <w:r>
-        <w:t xml:space="preserve">least as much as by what religious actors say. Standard news values — conflict, concrete numbers, institutional</w:t>
-      </w:r>
-      <w:r>
-        <w:t xml:space="preserve"> </w:t>
-      </w:r>
-      <w:r>
-        <w:t xml:space="preserve">controversy — favour the church-fee story over the pastoral letter: a diocese raising the price of a funeral is</w:t>
-      </w:r>
-      <w:r>
-        <w:t xml:space="preserve"> </w:t>
-      </w:r>
-      <w:r>
-        <w:t xml:space="preserve">news, a homily on structural poverty rarely is. Since 85% of the measured core is secular outlets’ output, the</w:t>
-      </w:r>
-      <w:r>
-        <w:t xml:space="preserve"> </w:t>
-      </w:r>
-      <w:r>
-        <w:t xml:space="preserve">distribution we observe is largely what newsrooms judged newsworthy about religion during the shock. The</w:t>
-      </w:r>
-      <w:r>
-        <w:t xml:space="preserve"> </w:t>
-      </w:r>
-      <w:r>
-        <w:t xml:space="preserve">“quiet</w:t>
-      </w:r>
-      <w:r>
-        <w:t xml:space="preserve"> </w:t>
-      </w:r>
-      <w:r>
-        <w:t xml:space="preserve">prophets”</w:t>
-      </w:r>
-      <w:r>
-        <w:t xml:space="preserve"> </w:t>
-      </w:r>
-      <w:r>
-        <w:t xml:space="preserve">pattern may therefore be partly editorial deafness rather than clerical silence. On the present data</w:t>
-      </w:r>
-      <w:r>
-        <w:t xml:space="preserve"> </w:t>
-      </w:r>
-      <w:r>
-        <w:t xml:space="preserve">the two readings — a Church that does not speak</w:t>
-      </w:r>
-      <w:r>
-        <w:t xml:space="preserve"> </w:t>
-      </w:r>
-      <w:r>
-        <w:t xml:space="preserve">structurally, and media that do not relay it when it does — cannot be separated; the planned secular benchmark</w:t>
-      </w:r>
-      <w:r>
-        <w:t xml:space="preserve"> </w:t>
-      </w:r>
-      <w:r>
-        <w:t xml:space="preserve">and a supply-side corpus of Church-authored texts (see Limitations) are designed to separate them.</w:t>
+        <w:t xml:space="preserve">least as much as by what religious actors say. Standard news values, such as conflict, concrete numbers, and</w:t>
+      </w:r>
+      <w:r>
+        <w:t xml:space="preserve"> </w:t>
+      </w:r>
+      <w:r>
+        <w:t xml:space="preserve">institutional controversy, favour the church-fee story over the pastoral letter: a diocese raising the price of</w:t>
+      </w:r>
+      <w:r>
+        <w:t xml:space="preserve"> </w:t>
+      </w:r>
+      <w:r>
+        <w:t xml:space="preserve">a funeral is news, while a homily on structural poverty rarely is. Since 85% of the measured core is secular</w:t>
+      </w:r>
+      <w:r>
+        <w:t xml:space="preserve"> </w:t>
+      </w:r>
+      <w:r>
+        <w:t xml:space="preserve">outlets’ output, the distribution we observe is largely what newsrooms judged newsworthy about religion during</w:t>
+      </w:r>
+      <w:r>
+        <w:t xml:space="preserve"> </w:t>
+      </w:r>
+      <w:r>
+        <w:t xml:space="preserve">the shock. The</w:t>
+      </w:r>
+      <w:r>
+        <w:t xml:space="preserve"> </w:t>
+      </w:r>
+      <w:r>
+        <w:t xml:space="preserve">“quiet prophets”</w:t>
+      </w:r>
+      <w:r>
+        <w:t xml:space="preserve"> </w:t>
+      </w:r>
+      <w:r>
+        <w:t xml:space="preserve">pattern may therefore be partly editorial deafness rather than clerical</w:t>
+      </w:r>
+      <w:r>
+        <w:t xml:space="preserve"> </w:t>
+      </w:r>
+      <w:r>
+        <w:t xml:space="preserve">silence. On the present data, the two readings, a Church that does not speak structurally, and media that do</w:t>
+      </w:r>
+      <w:r>
+        <w:t xml:space="preserve"> </w:t>
+      </w:r>
+      <w:r>
+        <w:t xml:space="preserve">not relay it when it does, cannot be separated. The planned secular benchmark and a supply-side corpus of</w:t>
+      </w:r>
+      <w:r>
+        <w:t xml:space="preserve"> </w:t>
+      </w:r>
+      <w:r>
+        <w:t xml:space="preserve">Church-authored texts (see Limitations) are designed to separate them.</w:t>
       </w:r>
     </w:p>
     <w:p>
@@ -6094,25 +6106,25 @@
           <w:b/>
           <w:bCs/>
         </w:rPr>
-        <w:t xml:space="preserve">Attention existed; a prophetic voice did not fill it.</w:t>
-      </w:r>
-      <w:r>
-        <w:t xml:space="preserve"> </w:t>
-      </w:r>
-      <w:r>
-        <w:t xml:space="preserve">The two results interlock. H1 indicates that media</w:t>
-      </w:r>
-      <w:r>
-        <w:t xml:space="preserve"> </w:t>
-      </w:r>
-      <w:r>
-        <w:t xml:space="preserve">inflation-attention is real and price-coupled — attention rose with prices (see Results).</w:t>
-      </w:r>
-      <w:r>
-        <w:t xml:space="preserve"> </w:t>
-      </w:r>
-      <w:r>
-        <w:t xml:space="preserve">Yet within that attention, once linkage is measured, the</w:t>
+        <w:t xml:space="preserve">Attention existed, but a prophetic voice did not fill it.</w:t>
+      </w:r>
+      <w:r>
+        <w:t xml:space="preserve"> </w:t>
+      </w:r>
+      <w:r>
+        <w:t xml:space="preserve">The two results interlock. H1 indicates that</w:t>
+      </w:r>
+      <w:r>
+        <w:t xml:space="preserve"> </w:t>
+      </w:r>
+      <w:r>
+        <w:t xml:space="preserve">media inflation-attention is real and price-coupled: attention rose with prices (see Results). Yet within that</w:t>
+      </w:r>
+      <w:r>
+        <w:t xml:space="preserve"> </w:t>
+      </w:r>
+      <w:r>
+        <w:t xml:space="preserve">attention, once linkage is measured, the</w:t>
       </w:r>
       <w:r>
         <w:t xml:space="preserve"> </w:t>
@@ -6128,19 +6140,19 @@
         <w:t xml:space="preserve"> </w:t>
       </w:r>
       <w:r>
-        <w:t xml:space="preserve">engagement is small and, where present,</w:t>
-      </w:r>
-      <w:r>
-        <w:t xml:space="preserve"> </w:t>
-      </w:r>
-      <w:r>
-        <w:t xml:space="preserve">non-prophetic. The public conversation about inflation was there for a religious justice voice to enter;</w:t>
-      </w:r>
-      <w:r>
-        <w:t xml:space="preserve"> </w:t>
-      </w:r>
-      <w:r>
-        <w:t xml:space="preserve">little of one is visible in the measured discourse.</w:t>
+        <w:t xml:space="preserve">engagement is small and, where present, non-prophetic. The</w:t>
+      </w:r>
+      <w:r>
+        <w:t xml:space="preserve"> </w:t>
+      </w:r>
+      <w:r>
+        <w:t xml:space="preserve">public conversation about inflation was there for a religious justice voice to enter, but little of one is</w:t>
+      </w:r>
+      <w:r>
+        <w:t xml:space="preserve"> </w:t>
+      </w:r>
+      <w:r>
+        <w:t xml:space="preserve">visible in the measured discourse.</w:t>
       </w:r>
     </w:p>
     <w:p>
@@ -6158,7 +6170,7 @@
         <w:t xml:space="preserve"> </w:t>
       </w:r>
       <w:r>
-        <w:t xml:space="preserve">The register–outlet pattern hints at two</w:t>
+        <w:t xml:space="preserve">The register-outlet pattern hints at two</w:t>
       </w:r>
       <w:r>
         <w:t xml:space="preserve"> </w:t>
@@ -6176,13 +6188,13 @@
         <w:t xml:space="preserve"> </w:t>
       </w:r>
       <w:r>
-        <w:t xml:space="preserve">story — reporting, often critically and in</w:t>
-      </w:r>
-      <w:r>
-        <w:t xml:space="preserve"> </w:t>
-      </w:r>
-      <w:r>
-        <w:t xml:space="preserve">negative tone, that the Church raised the price of masses, weddings and funerals around the euro changeover —</w:t>
+        <w:t xml:space="preserve">story, reporting, often critically and in a</w:t>
+      </w:r>
+      <w:r>
+        <w:t xml:space="preserve"> </w:t>
+      </w:r>
+      <w:r>
+        <w:t xml:space="preserve">negative tone, that the Church raised the price of masses, weddings and funerals around the euro changeover,</w:t>
       </w:r>
       <w:r>
         <w:t xml:space="preserve"> </w:t>
@@ -6230,25 +6242,25 @@
         <w:t xml:space="preserve"> </w:t>
       </w:r>
       <w:r>
-        <w:t xml:space="preserve">Within the 2021–2024 stream, the pattern is consistent with an agenda-setting</w:t>
-      </w:r>
-      <w:r>
-        <w:t xml:space="preserve"> </w:t>
-      </w:r>
-      <w:r>
-        <w:t xml:space="preserve">reading: the religious linkage flares during the acute 2022 shock (institutional commentary) and recedes as</w:t>
-      </w:r>
-      <w:r>
-        <w:t xml:space="preserve"> </w:t>
-      </w:r>
-      <w:r>
-        <w:t xml:space="preserve">prices stabilise, while church-fee coverage rises around euro adoption. On this within-stream evidence the</w:t>
-      </w:r>
-      <w:r>
-        <w:t xml:space="preserve"> </w:t>
-      </w:r>
-      <w:r>
-        <w:t xml:space="preserve">dynamic looks closer to</w:t>
+        <w:t xml:space="preserve">Within the 2021 to 2024 stream, the pattern is consistent with an agenda-setting</w:t>
+      </w:r>
+      <w:r>
+        <w:t xml:space="preserve"> </w:t>
+      </w:r>
+      <w:r>
+        <w:t xml:space="preserve">reading: the religious linkage flares during the acute 2022 shock, largely institutional commentary, and</w:t>
+      </w:r>
+      <w:r>
+        <w:t xml:space="preserve"> </w:t>
+      </w:r>
+      <w:r>
+        <w:t xml:space="preserve">recedes as prices stabilise, while church-fee coverage rises around euro adoption. On this within-stream</w:t>
+      </w:r>
+      <w:r>
+        <w:t xml:space="preserve"> </w:t>
+      </w:r>
+      <w:r>
+        <w:t xml:space="preserve">evidence, the dynamic looks closer to</w:t>
       </w:r>
       <w:r>
         <w:t xml:space="preserve"> </w:t>
@@ -6280,13 +6292,13 @@
         <w:t xml:space="preserve"> </w:t>
       </w:r>
       <w:r>
-        <w:t xml:space="preserve">(H2, provisional) — religion enters inflation discourse</w:t>
-      </w:r>
-      <w:r>
-        <w:t xml:space="preserve"> </w:t>
-      </w:r>
-      <w:r>
-        <w:t xml:space="preserve">reactively, as an affected party, not as an agenda-setter for economic justice.</w:t>
+        <w:t xml:space="preserve">(H2, provisional). Religion enters</w:t>
+      </w:r>
+      <w:r>
+        <w:t xml:space="preserve"> </w:t>
+      </w:r>
+      <w:r>
+        <w:t xml:space="preserve">inflation discourse reactively, as an affected party, rather than as an agenda-setter for economic justice.</w:t>
       </w:r>
     </w:p>
     <w:p>
@@ -6316,7 +6328,7 @@
         <w:t xml:space="preserve"> </w:t>
       </w:r>
       <w:r>
-        <w:t xml:space="preserve">studies, it extends inflation-salience research into the religious sphere and shows the</w:t>
+        <w:t xml:space="preserve">studies, it extends inflation-salience research into the religious sphere and shows that the</w:t>
       </w:r>
       <w:r>
         <w:t xml:space="preserve"> </w:t>
@@ -6328,13 +6340,7 @@
         <w:t xml:space="preserve"> </w:t>
       </w:r>
       <w:r>
-        <w:t xml:space="preserve">framing has</w:t>
-      </w:r>
-      <w:r>
-        <w:t xml:space="preserve"> </w:t>
-      </w:r>
-      <w:r>
-        <w:t xml:space="preserve">a specifically institutional variant —</w:t>
+        <w:t xml:space="preserve">framing has a specifically institutional variant:</w:t>
       </w:r>
       <w:r>
         <w:t xml:space="preserve"> </w:t>
@@ -6346,13 +6352,13 @@
         <w:t xml:space="preserve"> </w:t>
       </w:r>
       <w:r>
-        <w:t xml:space="preserve">For CST scholarship, the absence poses the question:</w:t>
-      </w:r>
-      <w:r>
-        <w:t xml:space="preserve"> </w:t>
-      </w:r>
-      <w:r>
-        <w:t xml:space="preserve">why the doctrinal justice frame does not travel into the national digital public sphere.</w:t>
+        <w:t xml:space="preserve">For CST scholarship, the absence poses</w:t>
+      </w:r>
+      <w:r>
+        <w:t xml:space="preserve"> </w:t>
+      </w:r>
+      <w:r>
+        <w:t xml:space="preserve">the question of why the doctrinal justice frame does not travel into the national digital public sphere.</w:t>
       </w:r>
     </w:p>
     <w:p>
@@ -6370,73 +6376,73 @@
         <w:t xml:space="preserve"> </w:t>
       </w:r>
       <w:r>
-        <w:t xml:space="preserve">Three implications follow. First, if agenda-setting research is right that media frames</w:t>
-      </w:r>
-      <w:r>
-        <w:t xml:space="preserve"> </w:t>
-      </w:r>
-      <w:r>
-        <w:t xml:space="preserve">shape which policy responses the public regards as warranted, then a digital sphere in which religion meets</w:t>
-      </w:r>
-      <w:r>
-        <w:t xml:space="preserve"> </w:t>
-      </w:r>
-      <w:r>
-        <w:t xml:space="preserve">inflation as fees and institutional news — rather than as structural injustice — contributes little to building</w:t>
-      </w:r>
-      <w:r>
-        <w:t xml:space="preserve"> </w:t>
-      </w:r>
-      <w:r>
-        <w:t xml:space="preserve">public support for redistributive or anti-poverty responses to a cost-of-living shock, despite doctrine that</w:t>
-      </w:r>
-      <w:r>
-        <w:t xml:space="preserve"> </w:t>
-      </w:r>
-      <w:r>
-        <w:t xml:space="preserve">points exactly there. Second, the visible charity register (17%) documents the place the country’s principal</w:t>
-      </w:r>
-      <w:r>
-        <w:t xml:space="preserve"> </w:t>
-      </w:r>
-      <w:r>
-        <w:t xml:space="preserve">faith-based relief network actually occupies in the digital public sphere: Caritas appears as an episodic</w:t>
-      </w:r>
-      <w:r>
-        <w:t xml:space="preserve"> </w:t>
-      </w:r>
-      <w:r>
-        <w:t xml:space="preserve">relief actor in the mixed economy of welfare, not as an advocate for structural reform — the familiar</w:t>
-      </w:r>
-      <w:r>
-        <w:t xml:space="preserve"> </w:t>
-      </w:r>
-      <w:r>
-        <w:t xml:space="preserve">charity-versus-justice tension in faith-based provision, here measured rather than asserted. Third, the</w:t>
-      </w:r>
-      <w:r>
-        <w:t xml:space="preserve"> </w:t>
-      </w:r>
-      <w:r>
-        <w:t xml:space="preserve">dominant cost-of-religious-life register identifies a concrete social-policy object: fees for weddings,</w:t>
-      </w:r>
-      <w:r>
-        <w:t xml:space="preserve"> </w:t>
-      </w:r>
-      <w:r>
-        <w:t xml:space="preserve">funerals and other rites of passage function as quasi-obligatory expenditures for religiously observant</w:t>
-      </w:r>
-      <w:r>
-        <w:t xml:space="preserve"> </w:t>
-      </w:r>
-      <w:r>
-        <w:t xml:space="preserve">low-income households, a neglected component of cost-of-living measurement that the euro-changeover fee resets</w:t>
-      </w:r>
-      <w:r>
-        <w:t xml:space="preserve"> </w:t>
-      </w:r>
-      <w:r>
-        <w:t xml:space="preserve">made briefly and unusually visible.</w:t>
+        <w:t xml:space="preserve">Three implications follow. First, if agenda-setting research is right that</w:t>
+      </w:r>
+      <w:r>
+        <w:t xml:space="preserve"> </w:t>
+      </w:r>
+      <w:r>
+        <w:t xml:space="preserve">media frames shape which policy responses the public regards as warranted, then a digital sphere in which</w:t>
+      </w:r>
+      <w:r>
+        <w:t xml:space="preserve"> </w:t>
+      </w:r>
+      <w:r>
+        <w:t xml:space="preserve">religion meets inflation as fees and institutional news, rather than as structural injustice, contributes</w:t>
+      </w:r>
+      <w:r>
+        <w:t xml:space="preserve"> </w:t>
+      </w:r>
+      <w:r>
+        <w:t xml:space="preserve">little to building public support for redistributive or anti-poverty responses to a cost-of-living shock,</w:t>
+      </w:r>
+      <w:r>
+        <w:t xml:space="preserve"> </w:t>
+      </w:r>
+      <w:r>
+        <w:t xml:space="preserve">despite doctrine that points exactly there. Second, the visible charity register (17%) documents the place the</w:t>
+      </w:r>
+      <w:r>
+        <w:t xml:space="preserve"> </w:t>
+      </w:r>
+      <w:r>
+        <w:t xml:space="preserve">country’s principal faith-based relief network actually occupies in the digital public sphere: Caritas appears</w:t>
+      </w:r>
+      <w:r>
+        <w:t xml:space="preserve"> </w:t>
+      </w:r>
+      <w:r>
+        <w:t xml:space="preserve">as an episodic relief actor in the mixed economy of welfare rather than as an advocate for structural reform,</w:t>
+      </w:r>
+      <w:r>
+        <w:t xml:space="preserve"> </w:t>
+      </w:r>
+      <w:r>
+        <w:t xml:space="preserve">the familiar charity-versus-justice tension in faith-based provision, here measured rather than asserted.</w:t>
+      </w:r>
+      <w:r>
+        <w:t xml:space="preserve"> </w:t>
+      </w:r>
+      <w:r>
+        <w:t xml:space="preserve">Third, the dominant cost-of-religious-life register identifies a concrete social-policy object. Fees for</w:t>
+      </w:r>
+      <w:r>
+        <w:t xml:space="preserve"> </w:t>
+      </w:r>
+      <w:r>
+        <w:t xml:space="preserve">weddings, funerals and other rites of passage function as quasi-obligatory expenditures for religiously</w:t>
+      </w:r>
+      <w:r>
+        <w:t xml:space="preserve"> </w:t>
+      </w:r>
+      <w:r>
+        <w:t xml:space="preserve">observant low-income households, a neglected component of cost-of-living measurement that the euro-changeover</w:t>
+      </w:r>
+      <w:r>
+        <w:t xml:space="preserve"> </w:t>
+      </w:r>
+      <w:r>
+        <w:t xml:space="preserve">fee resets made briefly and unusually visible.</w:t>
       </w:r>
     </w:p>
     <w:p>
@@ -6454,7 +6460,7 @@
         <w:t xml:space="preserve"> </w:t>
       </w:r>
       <w:r>
-        <w:t xml:space="preserve">H1 (attention–price coupling)</w:t>
+        <w:t xml:space="preserve">H1, attention-price coupling, is</w:t>
       </w:r>
       <w:r>
         <w:t xml:space="preserve"> </w:t>
@@ -6467,16 +6473,13 @@
         <w:t xml:space="preserve">partially supported</w:t>
       </w:r>
       <w:r>
-        <w:t xml:space="preserve"> </w:t>
-      </w:r>
-      <w:r>
-        <w:t xml:space="preserve">— the coupling holds, energy</w:t>
-      </w:r>
-      <w:r>
-        <w:t xml:space="preserve"> </w:t>
-      </w:r>
-      <w:r>
-        <w:t xml:space="preserve">couples only weakly; H2 (resonance not setting)</w:t>
+        <w:t xml:space="preserve">: the coupling holds, though</w:t>
+      </w:r>
+      <w:r>
+        <w:t xml:space="preserve"> </w:t>
+      </w:r>
+      <w:r>
+        <w:t xml:space="preserve">energy couples only weakly. H2, resonance not setting, is</w:t>
       </w:r>
       <w:r>
         <w:t xml:space="preserve"> </w:t>
@@ -6489,13 +6492,13 @@
         <w:t xml:space="preserve">provisionally consistent</w:t>
       </w:r>
       <w:r>
-        <w:t xml:space="preserve">, pending a lead–lag test; P3</w:t>
-      </w:r>
-      <w:r>
-        <w:t xml:space="preserve"> </w:t>
-      </w:r>
-      <w:r>
-        <w:t xml:space="preserve">(prophetic actor)</w:t>
+        <w:t xml:space="preserve">, pending a lead-lag</w:t>
+      </w:r>
+      <w:r>
+        <w:t xml:space="preserve"> </w:t>
+      </w:r>
+      <w:r>
+        <w:t xml:space="preserve">test. P3, the prophetic-actor proposition, is</w:t>
       </w:r>
       <w:r>
         <w:t xml:space="preserve"> </w:t>
@@ -6508,16 +6511,13 @@
         <w:t xml:space="preserve">not visible in the digital-news measure</w:t>
       </w:r>
       <w:r>
-        <w:t xml:space="preserve"> </w:t>
-      </w:r>
-      <w:r>
-        <w:t xml:space="preserve">— the actor-level claim is not testable here; P4</w:t>
-      </w:r>
-      <w:r>
-        <w:t xml:space="preserve"> </w:t>
-      </w:r>
-      <w:r>
-        <w:t xml:space="preserve">(episodic over thematic)</w:t>
+        <w:t xml:space="preserve">, since the</w:t>
+      </w:r>
+      <w:r>
+        <w:t xml:space="preserve"> </w:t>
+      </w:r>
+      <w:r>
+        <w:t xml:space="preserve">actor-level claim is not testable here. P4, episodic over thematic, is</w:t>
       </w:r>
       <w:r>
         <w:t xml:space="preserve"> </w:t>
@@ -6530,7 +6530,13 @@
         <w:t xml:space="preserve">supported</w:t>
       </w:r>
       <w:r>
-        <w:t xml:space="preserve">, in part by construction (see Appendix C).</w:t>
+        <w:t xml:space="preserve">, in part by construction</w:t>
+      </w:r>
+      <w:r>
+        <w:t xml:space="preserve"> </w:t>
+      </w:r>
+      <w:r>
+        <w:t xml:space="preserve">(see Appendix C).</w:t>
       </w:r>
     </w:p>
     <w:bookmarkEnd w:id="49"/>
@@ -6578,13 +6584,13 @@
         <w:t xml:space="preserve"> </w:t>
       </w:r>
       <w:r>
-        <w:t xml:space="preserve">incidental co-mention at scale. Our pipeline — anchored lexicons with metaphor and homonym guards, a</w:t>
-      </w:r>
-      <w:r>
-        <w:t xml:space="preserve"> </w:t>
-      </w:r>
-      <w:r>
-        <w:t xml:space="preserve">recall-oriented proximity filter, and multi-annotator coding with reported inter-annotator agreement — is a</w:t>
+        <w:t xml:space="preserve">incidental co-mention at scale. Our pipeline, combining anchored lexicons with metaphor and homonym guards, a</w:t>
+      </w:r>
+      <w:r>
+        <w:t xml:space="preserve"> </w:t>
+      </w:r>
+      <w:r>
+        <w:t xml:space="preserve">recall-oriented proximity filter, and multi-annotator coding with reported inter-annotator agreement, is a</w:t>
       </w:r>
       <w:r>
         <w:t xml:space="preserve"> </w:t>
@@ -6649,7 +6655,7 @@
         <w:t xml:space="preserve"> </w:t>
       </w:r>
       <w:r>
-        <w:t xml:space="preserve">2024 overlap (0.86 vs 0.21). We read temporal trends</w:t>
+        <w:t xml:space="preserve">2024 overlap (0.86 versus 0.21). We read temporal trends</w:t>
       </w:r>
       <w:r>
         <w:t xml:space="preserve"> </w:t>
@@ -6699,13 +6705,13 @@
         <w:t xml:space="preserve"> </w:t>
       </w:r>
       <w:r>
-        <w:t xml:space="preserve">gold standard; a human double-coding of a ≥100-post slice (including the foreign/domestic boundary that</w:t>
-      </w:r>
-      <w:r>
-        <w:t xml:space="preserve"> </w:t>
-      </w:r>
-      <w:r>
-        <w:t xml:space="preserve">defines the 520) is required before final publication, along with resolution of 12</w:t>
+        <w:t xml:space="preserve">gold standard. A human double-coding of a slice of at least 100 posts (including the foreign/domestic</w:t>
+      </w:r>
+      <w:r>
+        <w:t xml:space="preserve"> </w:t>
+      </w:r>
+      <w:r>
+        <w:t xml:space="preserve">boundary that defines the 520) is required before final publication, along with resolution of 12</w:t>
       </w:r>
       <w:r>
         <w:t xml:space="preserve"> </w:t>
@@ -6761,7 +6767,7 @@
         <w:t xml:space="preserve"> </w:t>
       </w:r>
       <w:r>
-        <w:t xml:space="preserve">institution as an affected party with clergy as commentators — speaking subjects. The</w:t>
+        <w:t xml:space="preserve">institution as an affected party with clergy as commentators, that is, speaking subjects. The</w:t>
       </w:r>
       <w:r>
         <w:t xml:space="preserve"> </w:t>
@@ -6807,13 +6813,13 @@
         <w:t xml:space="preserve"> </w:t>
       </w:r>
       <w:r>
-        <w:t xml:space="preserve">Even after majority coding, a few core posts are misclassified; a high-confidence</w:t>
-      </w:r>
-      <w:r>
-        <w:t xml:space="preserve"> </w:t>
-      </w:r>
-      <w:r>
-        <w:t xml:space="preserve">subset (3/3 agreement, 518 posts) is available for sensitivity analysis.</w:t>
+        <w:t xml:space="preserve">Even after majority coding, a few core posts are misclassified. A</w:t>
+      </w:r>
+      <w:r>
+        <w:t xml:space="preserve"> </w:t>
+      </w:r>
+      <w:r>
+        <w:t xml:space="preserve">high-confidence subset (3 of 3 agreement, 518 posts) is available for sensitivity analysis.</w:t>
       </w:r>
     </w:p>
     <w:p>
@@ -6829,37 +6835,37 @@
           <w:b/>
           <w:bCs/>
         </w:rPr>
-        <w:t xml:space="preserve">Register ordering / justice floor.</w:t>
-      </w:r>
-      <w:r>
-        <w:t xml:space="preserve"> </w:t>
-      </w:r>
-      <w:r>
-        <w:t xml:space="preserve">Register was the lowest-agreement axis; the 37% vs 34% ordering is</w:t>
-      </w:r>
-      <w:r>
-        <w:t xml:space="preserve"> </w:t>
-      </w:r>
-      <w:r>
-        <w:t xml:space="preserve">within noise (we report the ≈72% macro-register), and 3% justice is a strict floor (≤8% broadly construed).</w:t>
-      </w:r>
-      <w:r>
-        <w:t xml:space="preserve"> </w:t>
-      </w:r>
-      <w:r>
-        <w:t xml:space="preserve">The proximity filter’s misses may also be register-non-random: long-form thematic argument is likelier to</w:t>
-      </w:r>
-      <w:r>
-        <w:t xml:space="preserve"> </w:t>
-      </w:r>
-      <w:r>
-        <w:t xml:space="preserve">exceed a ±220-character window, so filter design as well as strict coding may depress the justice floor — a</w:t>
-      </w:r>
-      <w:r>
-        <w:t xml:space="preserve"> </w:t>
-      </w:r>
-      <w:r>
-        <w:t xml:space="preserve">planned window-sensitivity check addresses this.</w:t>
+        <w:t xml:space="preserve">Register ordering and justice floor.</w:t>
+      </w:r>
+      <w:r>
+        <w:t xml:space="preserve"> </w:t>
+      </w:r>
+      <w:r>
+        <w:t xml:space="preserve">Register was the lowest-agreement axis, and the 37% versus 34%</w:t>
+      </w:r>
+      <w:r>
+        <w:t xml:space="preserve"> </w:t>
+      </w:r>
+      <w:r>
+        <w:t xml:space="preserve">ordering is within noise (we report the ≈72% macro-register), while 3% justice is a strict floor (at most 8%</w:t>
+      </w:r>
+      <w:r>
+        <w:t xml:space="preserve"> </w:t>
+      </w:r>
+      <w:r>
+        <w:t xml:space="preserve">broadly construed). The proximity filter’s misses may also be register-non-random. Long-form thematic</w:t>
+      </w:r>
+      <w:r>
+        <w:t xml:space="preserve"> </w:t>
+      </w:r>
+      <w:r>
+        <w:t xml:space="preserve">argument is likelier to exceed a ±220-character window, so filter design as well as strict coding may depress</w:t>
+      </w:r>
+      <w:r>
+        <w:t xml:space="preserve"> </w:t>
+      </w:r>
+      <w:r>
+        <w:t xml:space="preserve">the justice floor. A planned window-sensitivity check addresses this.</w:t>
       </w:r>
     </w:p>
     <w:p>
@@ -6881,13 +6887,13 @@
         <w:t xml:space="preserve"> </w:t>
       </w:r>
       <w:r>
-        <w:t xml:space="preserve">H1 is tested at the level of corpus-wide inflation-attention; a monthly HICP overlay on the</w:t>
-      </w:r>
-      <w:r>
-        <w:t xml:space="preserve"> </w:t>
-      </w:r>
-      <w:r>
-        <w:t xml:space="preserve">religion-linked core specifically is too sparse to test, and the H2 lead–lag test against public search</w:t>
+        <w:t xml:space="preserve">H1 is tested at the level of corpus-wide inflation-attention. A monthly HICP overlay on the</w:t>
+      </w:r>
+      <w:r>
+        <w:t xml:space="preserve"> </w:t>
+      </w:r>
+      <w:r>
+        <w:t xml:space="preserve">religion-linked core specifically is too sparse to test, and the H2 lead-lag test against public search</w:t>
       </w:r>
       <w:r>
         <w:t xml:space="preserve"> </w:t>
@@ -6921,7 +6927,7 @@
         <w:t xml:space="preserve"> </w:t>
       </w:r>
       <w:r>
-        <w:t xml:space="preserve">framing is rarer in religious than in secular inflation coverage; a benchmark on non-religious inflation posts</w:t>
+        <w:t xml:space="preserve">framing is rarer in religious than in secular inflation coverage. A benchmark on non-religious inflation posts</w:t>
       </w:r>
       <w:r>
         <w:t xml:space="preserve"> </w:t>
@@ -6943,7 +6949,7 @@
           <w:b/>
           <w:bCs/>
         </w:rPr>
-        <w:t xml:space="preserve">Filtered baseline &amp; platform coverage.</w:t>
+        <w:t xml:space="preserve">Filtered baseline and platform coverage.</w:t>
       </w:r>
       <w:r>
         <w:t xml:space="preserve"> </w:t>
@@ -6955,19 +6961,19 @@
         <w:t xml:space="preserve"> </w:t>
       </w:r>
       <w:r>
-        <w:t xml:space="preserve">here means secular outlets’ religion-adjacent output, not</w:t>
-      </w:r>
-      <w:r>
-        <w:t xml:space="preserve"> </w:t>
-      </w:r>
-      <w:r>
-        <w:t xml:space="preserve">their full inflation coverage; and the core is 96% web, so claims generalize to the web-portal public sphere</w:t>
-      </w:r>
-      <w:r>
-        <w:t xml:space="preserve"> </w:t>
-      </w:r>
-      <w:r>
-        <w:t xml:space="preserve">rather than to all platforms.</w:t>
+        <w:t xml:space="preserve">here means secular outlets’ religion-adjacent output,</w:t>
+      </w:r>
+      <w:r>
+        <w:t xml:space="preserve"> </w:t>
+      </w:r>
+      <w:r>
+        <w:t xml:space="preserve">not their full inflation coverage. The core is also 96% web, so claims generalize to the web-portal public</w:t>
+      </w:r>
+      <w:r>
+        <w:t xml:space="preserve"> </w:t>
+      </w:r>
+      <w:r>
+        <w:t xml:space="preserve">sphere rather than to all platforms.</w:t>
       </w:r>
     </w:p>
     <w:bookmarkEnd w:id="51"/>
@@ -6985,7 +6991,7 @@
         <w:pStyle w:val="FirstParagraph"/>
       </w:pPr>
       <w:r>
-        <w:t xml:space="preserve">When prices rose in Croatia, religion did enter the digital conversation about inflation — but as an institution</w:t>
+        <w:t xml:space="preserve">When prices rose in Croatia, religion did enter the digital conversation about inflation, but as an institution</w:t>
       </w:r>
       <w:r>
         <w:t xml:space="preserve"> </w:t>
@@ -6997,7 +7003,7 @@
         <w:t xml:space="preserve"> </w:t>
       </w:r>
       <w:r>
-        <w:t xml:space="preserve">prophetic voice for the poor. Media attention to inflation tracked real prices closely; the religious</w:t>
+        <w:t xml:space="preserve">prophetic voice for the poor. Media attention to inflation tracked real prices closely, but the religious</w:t>
       </w:r>
       <w:r>
         <w:t xml:space="preserve"> </w:t>
@@ -7015,13 +7021,13 @@
         <w:t xml:space="preserve"> </w:t>
       </w:r>
       <w:r>
-        <w:t xml:space="preserve">carried in channels a news corpus does not capture is the question the absence opens — one the planned secular</w:t>
-      </w:r>
-      <w:r>
-        <w:t xml:space="preserve"> </w:t>
-      </w:r>
-      <w:r>
-        <w:t xml:space="preserve">benchmark and supply-side corpus of Church-authored texts are designed to answer, with a lead–lag test and</w:t>
+        <w:t xml:space="preserve">carried in channels a news corpus does not capture, is the question the absence opens. The planned secular</w:t>
+      </w:r>
+      <w:r>
+        <w:t xml:space="preserve"> </w:t>
+      </w:r>
+      <w:r>
+        <w:t xml:space="preserve">benchmark and supply-side corpus of Church-authored texts are designed to answer it, with a lead-lag test and</w:t>
       </w:r>
       <w:r>
         <w:t xml:space="preserve"> </w:t>
@@ -7108,7 +7114,7 @@
         <w:t xml:space="preserve"> </w:t>
       </w:r>
       <w:r>
-        <w:t xml:space="preserve">post text and is not redistributable; analyses are reproducible from the numbered pipeline scripts (Appendix A)</w:t>
+        <w:t xml:space="preserve">post text and is not redistributable. Analyses are reproducible from the numbered pipeline scripts (Appendix A)</w:t>
       </w:r>
       <w:r>
         <w:t xml:space="preserve"> </w:t>
@@ -7144,7 +7150,7 @@
         <w:t xml:space="preserve"> </w:t>
       </w:r>
       <w:r>
-        <w:t xml:space="preserve">reports only aggregate counts and shares; no personal data, account identifiers, or verbatim private content are</w:t>
+        <w:t xml:space="preserve">reports only aggregate counts and shares. No personal data, account identifiers, or verbatim private content are</w:t>
       </w:r>
       <w:r>
         <w:t xml:space="preserve"> </w:t>
@@ -7180,13 +7186,13 @@
         <w:t xml:space="preserve"> </w:t>
       </w:r>
       <w:r>
-        <w:t xml:space="preserve">1 July 2026); authorship and author order are to be finalized. Released under CC BY 4.0; open-science (FAIR)</w:t>
-      </w:r>
-      <w:r>
-        <w:t xml:space="preserve"> </w:t>
-      </w:r>
-      <w:r>
-        <w:t xml:space="preserve">principles apply.</w:t>
+        <w:t xml:space="preserve">1 July 2026), and authorship and author order are to be finalized. It is released under CC BY 4.0, and</w:t>
+      </w:r>
+      <w:r>
+        <w:t xml:space="preserve"> </w:t>
+      </w:r>
+      <w:r>
+        <w:t xml:space="preserve">open-science (FAIR) principles apply.</w:t>
       </w:r>
     </w:p>
     <w:bookmarkEnd w:id="55"/>
@@ -7563,7 +7569,7 @@
           <w:i/>
           <w:iCs/>
         </w:rPr>
-        <w:t xml:space="preserve">Some literature entries remain to be verified against Hrčak / CrossRef before submission; see</w:t>
+        <w:t xml:space="preserve">Some literature entries remain to be verified against Hrčak / CrossRef before submission. See</w:t>
       </w:r>
       <w:r>
         <w:rPr>
@@ -7736,7 +7742,7 @@
         <w:t xml:space="preserve"> </w:t>
       </w:r>
       <w:r>
-        <w:t xml:space="preserve">(stream conditioning; hkm.hr decomposition; latent-justice bound) →</w:t>
+        <w:t xml:space="preserve">(stream conditioning, hkm.hr decomposition, latent-justice bound) →</w:t>
       </w:r>
       <w:r>
         <w:t xml:space="preserve"> </w:t>
@@ -7793,19 +7799,25 @@
         <w:pStyle w:val="FirstParagraph"/>
       </w:pPr>
       <w:r>
-        <w:t xml:space="preserve">Four axes (see Data and Methods). Held-out validation (n = 80): inter-annotator agreement infl 0.975 / link 0.967 / foreign 0.992</w:t>
-      </w:r>
-      <w:r>
-        <w:t xml:space="preserve"> </w:t>
-      </w:r>
-      <w:r>
-        <w:t xml:space="preserve">/ register 0.46; classifier held-out precision (domestic linkage) ≈0.38–0.46, recall ≈0.89; full-pool coding</w:t>
-      </w:r>
-      <w:r>
-        <w:t xml:space="preserve"> </w:t>
-      </w:r>
-      <w:r>
-        <w:t xml:space="preserve">confirmed 45% of candidates as genuinely linked. Full log:</w:t>
+        <w:t xml:space="preserve">Four axes (see Data and Methods). In held-out validation (n = 80), inter-annotator agreement was 0.975 for</w:t>
+      </w:r>
+      <w:r>
+        <w:t xml:space="preserve"> </w:t>
+      </w:r>
+      <w:r>
+        <w:t xml:space="preserve">inflation, 0.967 for linkage, 0.992 for foreign/domestic, and 0.46 for register. Classifier held-out precision</w:t>
+      </w:r>
+      <w:r>
+        <w:t xml:space="preserve"> </w:t>
+      </w:r>
+      <w:r>
+        <w:t xml:space="preserve">for domestic linkage was about 0.38 to 0.46, with a recall of about 0.89. Full-pool coding confirmed that 45% of</w:t>
+      </w:r>
+      <w:r>
+        <w:t xml:space="preserve"> </w:t>
+      </w:r>
+      <w:r>
+        <w:t xml:space="preserve">candidates were genuinely linked. Full log:</w:t>
       </w:r>
       <w:r>
         <w:t xml:space="preserve"> </w:t>
@@ -7941,7 +7953,7 @@
               <w:pStyle w:val="Compact"/>
             </w:pPr>
             <w:r>
-              <w:t xml:space="preserve">Attention rises with HICP; jumps above ≈4%; food/energy ≥ headline</w:t>
+              <w:t xml:space="preserve">Attention rises with HICP, jumps above about 4%, food and energy at least as salient as headline</w:t>
             </w:r>
           </w:p>
         </w:tc>
@@ -7973,7 +7985,7 @@
               <w:t xml:space="preserve"> </w:t>
             </w:r>
             <w:r>
-              <w:t xml:space="preserve">(r ≈ 0.73; 0.49→1.17% at threshold; food ≈ headline, but energy couples only weakly, r = 0.44)</w:t>
+              <w:t xml:space="preserve">(r about 0.73, attention 0.49% to 1.17% across the threshold, food about equal to headline, but energy only weakly coupled at r = 0.44)</w:t>
             </w:r>
           </w:p>
         </w:tc>
@@ -8026,7 +8038,7 @@
               <w:t xml:space="preserve">Provisionally consistent</w:t>
             </w:r>
             <w:r>
-              <w:t xml:space="preserve">; lead–lag test pending</w:t>
+              <w:t xml:space="preserve">, with a lead-lag test still pending</w:t>
             </w:r>
           </w:p>
         </w:tc>
@@ -8082,7 +8094,7 @@
               <w:t xml:space="preserve"> </w:t>
             </w:r>
             <w:r>
-              <w:t xml:space="preserve">(3% strict / ≤8% broad; no rise); the actor-level claim is not testable in a news corpus</w:t>
+              <w:t xml:space="preserve">(3% under strict coding, at most 8% broadly, with no rise over time), since the actor-level claim is not testable in a news corpus</w:t>
             </w:r>
           </w:p>
         </w:tc>
@@ -8276,7 +8288,7 @@
           <w:i/>
           <w:iCs/>
         </w:rPr>
-        <w:t xml:space="preserve">Katolički socijalni nauk (KSN) Crkvi pripisuje osobit glas u vremenima gospodarske krize: imenovati inflaciju kao nepravdu koja najteže pogađa siromašne. Pitamo kako taj glas doista zvuči u nacionalnome digitalnom medijskom prostoru tijekom šoka troškova života. Koristeći se korpusom DigiKat — 710.307 religijski relevantnih hrvatskih/bosanskih medijskih objava (siječanj 2021. – lipanj 2026.) — izdvajamo svaku objavu koja spominje inflaciju te razlikujemo istinsku povezanost religije i inflacije od slučajnoga supojavljivanja. Većina supojavljivanja pokazuje se slučajnom; nakon kodiranja 1.450 objava odabranih prema blizini, uz tri neovisna anotatora temeljena na velikim jezičnim modelima (slaganje među anotatorima 0,97; ljudska validacija predstoji) i izdvajanje inozemne inflacije, ostaje izmjereni domaći korpus od 520 objava — 0,07 % korpusa i 6,5 % objava koje spominju inflaciju. Unutar njega religija se s inflacijom susreće pretežno kao s gospodarskim predmetom: makroregistar koji spaja rastući trošak religijskoga života i Crkvu kao instituciju čini ≈72 % (gornja granica predmetnoga čitanja, jer registar institucije uključuje i kler kao komentatore), dok je strukturni registar pravde (KSN) tek rubna pojava — 3 % pri strogom kodiranju, najviše ≈8 % šire shvaćeno. Medijska pozornost na inflaciju snažno je vezana uz cijene (H1 djelomično potvrđena: Pearsonov r ≈ 0,73 s hrvatskim HICP-om, no energetska je komponenta tek slabo povezana), a religijsko izvještavanje prije rezonira sa stvarnim uvjetima nego što ih predvodi (H2, provizorno); no religijski glas pravde ne ispunjava tu pozornost (P3: nije vidljiv u digitalnome medijskom pokazatelju, a tvrdnja na razini samoga aktera ovdje nije provjerljiva); uokvirivanje je epizodično, a ne tematsko (P4 potvrđena, dijelom po konstrukciji). Zaključujemo da okvir usmjeren na pravdu, koji KSN ističe, ima nisku vidljivost u digitalnoj javnoj sferi — Crkva se pojavljuje kao institucija čije su usluge poskupjele, a ne kao proročki glas — uz opomenu da je medijska vidljivost slab pokazatelj postupanja same institucije. Uz sadržajni nalaz, rad nudi i prenosivu metodološku pouku: u korpusima filtriranima ključnim riječima supojavljivanje nije angažman, a povezanost treba mjeriti, a ne brojati.</w:t>
+        <w:t xml:space="preserve">Katolički socijalni nauk (KSN) Crkvi pripisuje osobit glas u vremenima gospodarske krize: imenovati inflaciju kao nepravdu koja najteže pogađa siromašne. Pitamo kako taj glas doista zvuči u nacionalnome digitalnom medijskom prostoru tijekom šoka troškova života. Korpus DigiKat sadrži 710.307 religijski relevantnih hrvatskih i bosanskih medijskih objava, objavljenih od siječnja 2021. do lipnja 2026. Koristeći se tim korpusom, izdvajamo svaku objavu koja spominje inflaciju te razlikujemo istinsku povezanost religije i inflacije od slučajnoga supojavljivanja. Većina supojavljivanja pokazuje se slučajnom. Nakon kodiranja 1.450 objava odabranih prema blizini, uz tri neovisna anotatora temeljena na velikim jezičnim modelima (slaganje među anotatorima iznosi 0,97, dok ljudska validacija još predstoji) i izdvajanje inozemne inflacije, ostaje izmjereni domaći korpus od 520 objava, što čini 0,07 % korpusa i 6,5 % objava koje spominju inflaciju. Unutar njega religija se s inflacijom susreće pretežno kao s gospodarskim predmetom. Makroregistar koji spaja rastući trošak religijskoga života i Crkvu kao instituciju čini oko 72 % (gornja granica predmetnoga čitanja, jer registar institucije uključuje i kler kao komentatore), dok je strukturni registar pravde (KSN) tek rubna pojava, svega 3 % pri strogom kodiranju, a najviše oko 8 % šire shvaćeno. Medijska pozornost na inflaciju snažno je vezana uz cijene (H1 djelomično potvrđena: Pearsonov r iznosi oko 0,73 s hrvatskim HICP-om, no energetska je komponenta tek slabo povezana), a religijsko izvještavanje prije rezonira sa stvarnim uvjetima nego što ih predvodi (H2, provizorno). Religijski glas pravde, međutim, ne ispunjava tu pozornost (P3: nije vidljiv u digitalnome medijskom pokazatelju, a tvrdnja na razini samoga aktera ovdje nije provjerljiva), a uokvirivanje je epizodično, a ne tematsko (P4 potvrđena, dijelom po konstrukciji). Zaključujemo da okvir usmjeren na pravdu, koji KSN ističe, ima nisku vidljivost u digitalnoj javnoj sferi. Crkva se pojavljuje kao institucija čije su usluge poskupjele, a ne kao proročki glas, uz opomenu da je medijska vidljivost slab pokazatelj postupanja same institucije. Uz sadržajni nalaz, rad nudi i prenosivu metodološku pouku: u korpusima filtriranima ključnim riječima supojavljivanje nije angažman, a povezanost treba mjeriti, a ne brojati.</w:t>
       </w:r>
     </w:p>
     <w:p>

</xml_diff>

<commit_message>
RSP compliance pass: abstracts, formatting, figures
Align the manuscript with the Revija za socijalnu politiku author
guidelines:
- Abstracts (English and Croatian) cut to under 1,000 characters each,
  the journal's hard limit (were ~2,700 and ~2,400).
- Emphasis now uses bold throughout; italics reserved for foreign-
  language expressions, publication titles, and outlet names, per the
  journal's text-formatting rule.
- Croatian Sažetak uses space thousands-separators (710 307, 1 450) and
  comma decimals (0,73), and its title/byline are no longer italic.
- Figures regenerated in Arial at 300 dpi on a white background,
  grayscale, with embedded titles removed (the caption carries the
  title and a source line sits below each figure).
- In-text citation ampersands changed to "and" (the journal's English
  style); the reference list keeps "&" per APA.
- Whole manuscript is ~43k characters, within the 50,000 limit.
All numbers and reviewer-mandated hedges verified unchanged.
</commit_message>
<xml_diff>
--- a/paper/paper.docx
+++ b/paper/paper.docx
@@ -147,11 +147,7 @@
         <w:pStyle w:val="FirstParagraph"/>
       </w:pPr>
       <w:r>
-        <w:rPr>
-          <w:i/>
-          <w:iCs/>
-        </w:rPr>
-        <w:t xml:space="preserve">Catholic Social Teaching (CST) assigns the Church a distinctive voice in economic hardship, calling it to name inflation as an injustice that falls hardest on the poor. We ask what that voice actually sounds like in a national digital media space during a cost-of-living shock. The DigiKat corpus contains 710,307 religion-salient Croatian and Bosnian media posts, published between January 2021 and June 2026. Using this corpus, we isolate every post that mentions inflation and, crucially, distinguish genuine religion-inflation linkage from incidental co-occurrence. Most co-mentions prove incidental. After coding 1,450 proximity-selected candidates with three independent large-language-model annotators (inter-annotator agreement 0.97, with human validation still pending) and setting aside foreign-country inflation, a measured domestic core of 520 posts remains, amounting to 0.07% of the web-portal-dominated corpus and 6.5% of inflation-mentioning posts. Within this core, religion meets inflation overwhelmingly as an economic object. A macro-register combining the rising cost of religious life and the Church as an institution accounts for about 72% of posts (37% and 34% individually, an ordering that falls within coding noise and should be read as an upper bound on the object reading, since the institution register also includes clergy acting as commentators). Charity accounts for 17%, while the structural, CST-justice register is marginal: 3% under strict coding, at most about 8% once latent structural framing in adjacent posts is counted. We formalize and evaluate four theory-derived expectations. Media inflation-attention is strongly price-coupled (H1 partially supported: Pearson r of about 0.73 with the Croatian HICP within the seam-free monitoring window, and 2.4 times higher mean attention above the literature-derived threshold of about 4%, though energy couples only weakly), and religious coverage appears to resonate with rather than lead real conditions (H2, provisional). The religious justice voice, however, does not fill that attention (P3: not visible in the digital-news measure, since the actor-level claim cannot be tested here), and framing is episodic rather than thematic (P4 supported, in part by construction). We argue that the justice-centred frame CST foregrounds has low visibility in the digital public sphere. The Church surfaces as an institution whose services became more expensive rather than as a prophetic voice, though we caution that media visibility is a weak proxy for the institution’s actual conduct. Beyond the substantive finding, the paper offers a transferable methodological caution: in keyword-filtered corpora, co-occurrence is not engagement, and linkage must be measured rather than counted.</w:t>
+        <w:t xml:space="preserve">Catholic Social Teaching (CST) calls the Church to name inflation as an injustice against the poor. We ask how that voice actually sounds in a national digital media space during a cost-of-living shock. From the DigiKat corpus of 710,307 religion-salient Croatian and Bosnian media posts (2021–2026), we isolate inflation mentions and separate genuine religion-inflation linkage from incidental co-occurrence. After coding 1,450 candidates with three language-model annotators, a measured domestic core of 520 posts remains. Within it, religion meets inflation overwhelmingly as an economic object: the rising cost of religious life and the Church as an institution together account for about 72% of posts, while the structural-justice register CST foregrounds reaches at most 8%. Media attention tracks real prices (Pearson r about 0.73), yet the religious justice voice does not fill it. In keyword-filtered corpora, co-occurrence is not engagement, and linkage must be measured, not counted.</w:t>
       </w:r>
     </w:p>
     <w:p>
@@ -275,65 +271,65 @@
       </w:r>
       <w:r>
         <w:rPr>
-          <w:i/>
-          <w:iCs/>
-        </w:rPr>
-        <w:t xml:space="preserve">structural</w:t>
-      </w:r>
-      <w:r>
-        <w:t xml:space="preserve"> </w:t>
-      </w:r>
-      <w:r>
-        <w:t xml:space="preserve">injustice the Church is called to name on behalf</w:t>
-      </w:r>
-      <w:r>
-        <w:t xml:space="preserve"> </w:t>
-      </w:r>
-      <w:r>
-        <w:t xml:space="preserve">of the vulnerable. In a country where the Catholic Church is a dominant cultural institution and operates one</w:t>
-      </w:r>
-      <w:r>
-        <w:t xml:space="preserve"> </w:t>
-      </w:r>
-      <w:r>
-        <w:t xml:space="preserve">of Europe’s more developed religious media ecosystems, one might expect the digital public sphere to carry an</w:t>
-      </w:r>
-      <w:r>
-        <w:t xml:space="preserve"> </w:t>
-      </w:r>
-      <w:r>
-        <w:t xml:space="preserve">audible religious-economic voice when prices spike.</w:t>
-      </w:r>
-    </w:p>
-    <w:p>
-      <w:pPr>
-        <w:pStyle w:val="BodyText"/>
-      </w:pPr>
-      <w:r>
-        <w:t xml:space="preserve">This paper asks a deliberately simple question:</w:t>
-      </w:r>
-      <w:r>
-        <w:t xml:space="preserve"> </w:t>
-      </w:r>
-      <w:r>
-        <w:rPr>
           <w:b/>
           <w:bCs/>
         </w:rPr>
-        <w:t xml:space="preserve">when inflation surfaces in religion-salient Croatian digital</w:t>
+        <w:t xml:space="preserve">structural</w:t>
+      </w:r>
+      <w:r>
+        <w:t xml:space="preserve"> </w:t>
+      </w:r>
+      <w:r>
+        <w:t xml:space="preserve">injustice the Church is called to name on behalf</w:t>
+      </w:r>
+      <w:r>
+        <w:t xml:space="preserve"> </w:t>
+      </w:r>
+      <w:r>
+        <w:t xml:space="preserve">of the vulnerable. In a country where the Catholic Church is a dominant cultural institution and operates one</w:t>
+      </w:r>
+      <w:r>
+        <w:t xml:space="preserve"> </w:t>
+      </w:r>
+      <w:r>
+        <w:t xml:space="preserve">of Europe’s more developed religious media ecosystems, one might expect the digital public sphere to carry an</w:t>
+      </w:r>
+      <w:r>
+        <w:t xml:space="preserve"> </w:t>
+      </w:r>
+      <w:r>
+        <w:t xml:space="preserve">audible religious-economic voice when prices spike.</w:t>
+      </w:r>
+    </w:p>
+    <w:p>
+      <w:pPr>
+        <w:pStyle w:val="BodyText"/>
+      </w:pPr>
+      <w:r>
+        <w:t xml:space="preserve">This paper asks a deliberately simple question:</w:t>
+      </w:r>
+      <w:r>
+        <w:t xml:space="preserve"> </w:t>
       </w:r>
       <w:r>
         <w:rPr>
           <w:b/>
           <w:bCs/>
         </w:rPr>
-        <w:t xml:space="preserve"> </w:t>
+        <w:t xml:space="preserve">when inflation surfaces in religion-salient Croatian digital</w:t>
       </w:r>
       <w:r>
         <w:rPr>
           <w:b/>
           <w:bCs/>
         </w:rPr>
+        <w:t xml:space="preserve"> </w:t>
+      </w:r>
+      <w:r>
+        <w:rPr>
+          <w:b/>
+          <w:bCs/>
+        </w:rPr>
         <w:t xml:space="preserve">discourse, who carries it, and in what register?</w:t>
       </w:r>
       <w:r>
@@ -440,7 +436,7 @@
         <w:t xml:space="preserve"> </w:t>
       </w:r>
       <w:r>
-        <w:t xml:space="preserve">roughly 2 to 4%, then jumps (Korenok, Munro &amp; Chen, 2026; Pfäuti, 2024). Coverage is less about the headline</w:t>
+        <w:t xml:space="preserve">roughly 2 to 4%, then jumps (Korenok, Munro and Chen, 2026; Pfäuti, 2024). Coverage is less about the headline</w:t>
       </w:r>
       <w:r>
         <w:t xml:space="preserve"> </w:t>
@@ -453,8 +449,8 @@
       </w:r>
       <w:r>
         <w:rPr>
-          <w:i/>
-          <w:iCs/>
+          <w:b/>
+          <w:bCs/>
         </w:rPr>
         <w:t xml:space="preserve">who is hurt</w:t>
       </w:r>
@@ -469,8 +465,8 @@
       </w:r>
       <w:r>
         <w:rPr>
-          <w:i/>
-          <w:iCs/>
+          <w:b/>
+          <w:bCs/>
         </w:rPr>
         <w:t xml:space="preserve">which component</w:t>
       </w:r>
@@ -499,7 +495,7 @@
         <w:t xml:space="preserve"> </w:t>
       </w:r>
       <w:r>
-        <w:t xml:space="preserve">inflation-attention index (Aarab et al., 2025). Agenda-setting theory (McCombs &amp; Shaw, 1972) is the backdrop,</w:t>
+        <w:t xml:space="preserve">inflation-attention index (Aarab et al., 2025). Agenda-setting theory (McCombs and Shaw, 1972) is the backdrop,</w:t>
       </w:r>
       <w:r>
         <w:t xml:space="preserve"> </w:t>
@@ -512,8 +508,8 @@
       </w:r>
       <w:r>
         <w:rPr>
-          <w:i/>
-          <w:iCs/>
+          <w:b/>
+          <w:bCs/>
         </w:rPr>
         <w:t xml:space="preserve">set</w:t>
       </w:r>
@@ -528,8 +524,8 @@
       </w:r>
       <w:r>
         <w:rPr>
-          <w:i/>
-          <w:iCs/>
+          <w:b/>
+          <w:bCs/>
         </w:rPr>
         <w:t xml:space="preserve">reflect</w:t>
       </w:r>
@@ -537,7 +533,7 @@
         <w:t xml:space="preserve"> </w:t>
       </w:r>
       <w:r>
-        <w:t xml:space="preserve">attention (Wlezien &amp; Soroka, 2024). A second</w:t>
+        <w:t xml:space="preserve">attention (Wlezien and Soroka, 2024). A second</w:t>
       </w:r>
       <w:r>
         <w:t xml:space="preserve"> </w:t>
@@ -550,8 +546,8 @@
       </w:r>
       <w:r>
         <w:rPr>
-          <w:i/>
-          <w:iCs/>
+          <w:b/>
+          <w:bCs/>
         </w:rPr>
         <w:t xml:space="preserve">Attribute</w:t>
       </w:r>
@@ -598,8 +594,8 @@
       </w:r>
       <w:r>
         <w:rPr>
-          <w:i/>
-          <w:iCs/>
+          <w:b/>
+          <w:bCs/>
         </w:rPr>
         <w:t xml:space="preserve">charity</w:t>
       </w:r>
@@ -620,8 +616,8 @@
       </w:r>
       <w:r>
         <w:rPr>
-          <w:i/>
-          <w:iCs/>
+          <w:b/>
+          <w:bCs/>
         </w:rPr>
         <w:t xml:space="preserve">justice</w:t>
       </w:r>
@@ -1203,22 +1199,105 @@
       </w:r>
       <w:r>
         <w:rPr>
+          <w:b/>
+          <w:bCs/>
+        </w:rPr>
+        <w:t xml:space="preserve">linked</w:t>
+      </w:r>
+      <w:r>
+        <w:t xml:space="preserve"> </w:t>
+      </w:r>
+      <w:r>
+        <w:t xml:space="preserve">set (1,450) rather than</w:t>
+      </w:r>
+      <w:r>
+        <w:t xml:space="preserve"> </w:t>
+      </w:r>
+      <w:r>
+        <w:t xml:space="preserve">the classifier’s narrower</w:t>
+      </w:r>
+      <w:r>
+        <w:t xml:space="preserve"> </w:t>
+      </w:r>
+      <w:r>
+        <w:rPr>
+          <w:b/>
+          <w:bCs/>
+        </w:rPr>
+        <w:t xml:space="preserve">domestic-linked</w:t>
+      </w:r>
+      <w:r>
+        <w:t xml:space="preserve"> </w:t>
+      </w:r>
+      <w:r>
+        <w:t xml:space="preserve">subset (1,103), because the automatic foreign/domestic flag is</w:t>
+      </w:r>
+      <w:r>
+        <w:t xml:space="preserve"> </w:t>
+      </w:r>
+      <w:r>
+        <w:t xml:space="preserve">unreliable (held-out precision of about 0.39). The annotators, not the flag, decide foreign versus domestic.</w:t>
+      </w:r>
+    </w:p>
+    <w:p>
+      <w:pPr>
+        <w:pStyle w:val="BodyText"/>
+      </w:pPr>
+      <w:r>
+        <w:t xml:space="preserve">The candidates were then coded. All 1,450 candidates were coded by</w:t>
+      </w:r>
+      <w:r>
+        <w:t xml:space="preserve"> </w:t>
+      </w:r>
+      <w:r>
+        <w:rPr>
+          <w:b/>
+          <w:bCs/>
+        </w:rPr>
+        <w:t xml:space="preserve">three independent annotators</w:t>
+      </w:r>
+      <w:r>
+        <w:t xml:space="preserve"> </w:t>
+      </w:r>
+      <w:r>
+        <w:t xml:space="preserve">(large-language-model annotators applying a fixed codebook), with labels majority-adjudicated, and 1,447 of</w:t>
+      </w:r>
+      <w:r>
+        <w:t xml:space="preserve"> </w:t>
+      </w:r>
+      <w:r>
+        <w:t xml:space="preserve">1,450 were coded by all three. Each post was labelled on four axes. The first was whether it is genuinely about</w:t>
+      </w:r>
+      <w:r>
+        <w:t xml:space="preserve"> </w:t>
+      </w:r>
+      <w:r>
+        <w:t xml:space="preserve">inflation or cost of living. The second was whether religion is genuinely linked to the inflation content, as</w:t>
+      </w:r>
+      <w:r>
+        <w:t xml:space="preserve"> </w:t>
+      </w:r>
+      <w:r>
+        <w:t xml:space="preserve">opposed to incidental, a geographic landmark, a metaphor, a hashtag, or a secular organisation containing a</w:t>
+      </w:r>
+      <w:r>
+        <w:t xml:space="preserve"> </w:t>
+      </w:r>
+      <w:r>
+        <w:t xml:space="preserve">religious word, for example</w:t>
+      </w:r>
+      <w:r>
+        <w:t xml:space="preserve"> </w:t>
+      </w:r>
+      <w:r>
+        <w:rPr>
           <w:i/>
           <w:iCs/>
         </w:rPr>
-        <w:t xml:space="preserve">linked</w:t>
-      </w:r>
-      <w:r>
-        <w:t xml:space="preserve"> </w:t>
-      </w:r>
-      <w:r>
-        <w:t xml:space="preserve">set (1,450) rather than</w:t>
-      </w:r>
-      <w:r>
-        <w:t xml:space="preserve"> </w:t>
-      </w:r>
-      <w:r>
-        <w:t xml:space="preserve">the classifier’s narrower</w:t>
+        <w:t xml:space="preserve">Crveni križ</w:t>
+      </w:r>
+      <w:r>
+        <w:t xml:space="preserve">, Red Cross, or</w:t>
       </w:r>
       <w:r>
         <w:t xml:space="preserve"> </w:t>
@@ -1228,27 +1307,16 @@
           <w:i/>
           <w:iCs/>
         </w:rPr>
-        <w:t xml:space="preserve">domestic-linked</w:t>
-      </w:r>
-      <w:r>
-        <w:t xml:space="preserve"> </w:t>
-      </w:r>
-      <w:r>
-        <w:t xml:space="preserve">subset (1,103), because the automatic foreign/domestic flag is</w:t>
-      </w:r>
-      <w:r>
-        <w:t xml:space="preserve"> </w:t>
-      </w:r>
-      <w:r>
-        <w:t xml:space="preserve">unreliable (held-out precision of about 0.39). The annotators, not the flag, decide foreign versus domestic.</w:t>
-      </w:r>
-    </w:p>
-    <w:p>
-      <w:pPr>
-        <w:pStyle w:val="BodyText"/>
-      </w:pPr>
-      <w:r>
-        <w:t xml:space="preserve">The candidates were then coded. All 1,450 candidates were coded by</w:t>
+        <w:t xml:space="preserve">Papa-test</w:t>
+      </w:r>
+      <w:r>
+        <w:t xml:space="preserve">, Pap smear. The third was whether the</w:t>
+      </w:r>
+      <w:r>
+        <w:t xml:space="preserve"> </w:t>
+      </w:r>
+      <w:r>
+        <w:t xml:space="preserve">inflation is foreign or domestic. The fourth, when linked, was its</w:t>
       </w:r>
       <w:r>
         <w:t xml:space="preserve"> </w:t>
@@ -1258,69 +1326,10 @@
           <w:b/>
           <w:bCs/>
         </w:rPr>
-        <w:t xml:space="preserve">three independent annotators</w:t>
-      </w:r>
-      <w:r>
-        <w:t xml:space="preserve"> </w:t>
-      </w:r>
-      <w:r>
-        <w:t xml:space="preserve">(large-language-model annotators applying a fixed codebook), with labels majority-adjudicated, and 1,447 of</w:t>
-      </w:r>
-      <w:r>
-        <w:t xml:space="preserve"> </w:t>
-      </w:r>
-      <w:r>
-        <w:t xml:space="preserve">1,450 were coded by all three. Each post was labelled on four axes. The first was whether it is genuinely about</w:t>
-      </w:r>
-      <w:r>
-        <w:t xml:space="preserve"> </w:t>
-      </w:r>
-      <w:r>
-        <w:t xml:space="preserve">inflation or cost of living. The second was whether religion is genuinely linked to the inflation content, as</w:t>
-      </w:r>
-      <w:r>
-        <w:t xml:space="preserve"> </w:t>
-      </w:r>
-      <w:r>
-        <w:t xml:space="preserve">opposed to incidental, a geographic landmark, a metaphor, a hashtag, or a secular organisation containing a</w:t>
-      </w:r>
-      <w:r>
-        <w:t xml:space="preserve"> </w:t>
-      </w:r>
-      <w:r>
-        <w:t xml:space="preserve">religious word, for example</w:t>
-      </w:r>
-      <w:r>
-        <w:t xml:space="preserve"> </w:t>
-      </w:r>
-      <w:r>
-        <w:rPr>
-          <w:i/>
-          <w:iCs/>
-        </w:rPr>
-        <w:t xml:space="preserve">Crveni križ</w:t>
-      </w:r>
-      <w:r>
-        <w:t xml:space="preserve">, Red Cross, or</w:t>
-      </w:r>
-      <w:r>
-        <w:t xml:space="preserve"> </w:t>
-      </w:r>
-      <w:r>
-        <w:rPr>
-          <w:i/>
-          <w:iCs/>
-        </w:rPr>
-        <w:t xml:space="preserve">Papa-test</w:t>
-      </w:r>
-      <w:r>
-        <w:t xml:space="preserve">, Pap smear. The third was whether the</w:t>
-      </w:r>
-      <w:r>
-        <w:t xml:space="preserve"> </w:t>
-      </w:r>
-      <w:r>
-        <w:t xml:space="preserve">inflation is foreign or domestic. The fourth, when linked, was its</w:t>
+        <w:t xml:space="preserve">register</w:t>
+      </w:r>
+      <w:r>
+        <w:t xml:space="preserve">:</w:t>
       </w:r>
       <w:r>
         <w:t xml:space="preserve"> </w:t>
@@ -1330,19 +1339,6 @@
           <w:b/>
           <w:bCs/>
         </w:rPr>
-        <w:t xml:space="preserve">register</w:t>
-      </w:r>
-      <w:r>
-        <w:t xml:space="preserve">:</w:t>
-      </w:r>
-      <w:r>
-        <w:t xml:space="preserve"> </w:t>
-      </w:r>
-      <w:r>
-        <w:rPr>
-          <w:i/>
-          <w:iCs/>
-        </w:rPr>
         <w:t xml:space="preserve">cost of religious life</w:t>
       </w:r>
       <w:r>
@@ -1362,8 +1358,8 @@
       </w:r>
       <w:r>
         <w:rPr>
-          <w:i/>
-          <w:iCs/>
+          <w:b/>
+          <w:bCs/>
         </w:rPr>
         <w:t xml:space="preserve">Church-as-institution</w:t>
       </w:r>
@@ -1384,8 +1380,8 @@
       </w:r>
       <w:r>
         <w:rPr>
-          <w:i/>
-          <w:iCs/>
+          <w:b/>
+          <w:bCs/>
         </w:rPr>
         <w:t xml:space="preserve">structural / CST justice</w:t>
       </w:r>
@@ -1397,8 +1393,8 @@
       </w:r>
       <w:r>
         <w:rPr>
-          <w:i/>
-          <w:iCs/>
+          <w:b/>
+          <w:bCs/>
         </w:rPr>
         <w:t xml:space="preserve">charity</w:t>
       </w:r>
@@ -1413,8 +1409,8 @@
       </w:r>
       <w:r>
         <w:rPr>
-          <w:i/>
-          <w:iCs/>
+          <w:b/>
+          <w:bCs/>
         </w:rPr>
         <w:t xml:space="preserve">devotional</w:t>
       </w:r>
@@ -1426,8 +1422,8 @@
       </w:r>
       <w:r>
         <w:rPr>
-          <w:i/>
-          <w:iCs/>
+          <w:b/>
+          <w:bCs/>
         </w:rPr>
         <w:t xml:space="preserve">other</w:t>
       </w:r>
@@ -1471,8 +1467,8 @@
       </w:r>
       <w:r>
         <w:rPr>
-          <w:i/>
-          <w:iCs/>
+          <w:b/>
+          <w:bCs/>
         </w:rPr>
         <w:t xml:space="preserve">filter</w:t>
       </w:r>
@@ -1548,8 +1544,8 @@
       </w:r>
       <w:r>
         <w:rPr>
-          <w:i/>
-          <w:iCs/>
+          <w:b/>
+          <w:bCs/>
         </w:rPr>
         <w:t xml:space="preserve">within</w:t>
       </w:r>
@@ -2190,6 +2186,8 @@
         <w:rPr>
           <w:b/>
           <w:bCs/>
+          <w:i/>
+          <w:iCs/>
         </w:rPr>
         <w:t xml:space="preserve">cost of religious life</w:t>
       </w:r>
@@ -2206,6 +2204,8 @@
         <w:rPr>
           <w:b/>
           <w:bCs/>
+          <w:i/>
+          <w:iCs/>
         </w:rPr>
         <w:t xml:space="preserve">Church-as-institution</w:t>
       </w:r>
@@ -2222,6 +2222,8 @@
         <w:rPr>
           <w:b/>
           <w:bCs/>
+          <w:i/>
+          <w:iCs/>
         </w:rPr>
         <w:t xml:space="preserve">charity</w:t>
       </w:r>
@@ -2238,6 +2240,8 @@
         <w:rPr>
           <w:b/>
           <w:bCs/>
+          <w:i/>
+          <w:iCs/>
         </w:rPr>
         <w:t xml:space="preserve">devotional</w:t>
       </w:r>
@@ -2254,6 +2258,8 @@
         <w:rPr>
           <w:b/>
           <w:bCs/>
+          <w:i/>
+          <w:iCs/>
         </w:rPr>
         <w:t xml:space="preserve">structural / CST justice</w:t>
       </w:r>
@@ -2321,8 +2327,8 @@
       </w:r>
       <w:r>
         <w:rPr>
-          <w:i/>
-          <w:iCs/>
+          <w:b/>
+          <w:bCs/>
         </w:rPr>
         <w:t xml:space="preserve">economic-object</w:t>
       </w:r>
@@ -2745,7 +2751,7 @@
       <w:r>
         <w:drawing>
           <wp:inline>
-            <wp:extent cx="4533900" cy="2538984"/>
+            <wp:extent cx="4533900" cy="2567389"/>
             <wp:effectExtent b="0" l="0" r="0" t="0"/>
             <wp:docPr descr="Figure 1" title="" id="27" name="Picture"/>
             <a:graphic>
@@ -2766,7 +2772,7 @@
                   <pic:spPr bwMode="auto">
                     <a:xfrm>
                       <a:off x="0" y="0"/>
-                      <a:ext cx="4533900" cy="2538984"/>
+                      <a:ext cx="4533900" cy="2567389"/>
                     </a:xfrm>
                     <a:prstGeom prst="rect">
                       <a:avLst/>
@@ -2813,106 +2819,172 @@
       </w:r>
       <w:r>
         <w:rPr>
+          <w:b/>
+          <w:bCs/>
+        </w:rPr>
+        <w:t xml:space="preserve">economic object</w:t>
+      </w:r>
+      <w:r>
+        <w:t xml:space="preserve">, not a moral voice: masses, church fees,</w:t>
+      </w:r>
+      <w:r>
+        <w:t xml:space="preserve"> </w:t>
+      </w:r>
+      <w:r>
+        <w:t xml:space="preserve">weddings, funerals and pilgrimages that became more expensive (</w:t>
+      </w:r>
+      <w:r>
+        <w:t xml:space="preserve">“cost of religious life”</w:t>
+      </w:r>
+      <w:r>
+        <w:t xml:space="preserve">), and clergy or dioceses</w:t>
+      </w:r>
+      <w:r>
+        <w:t xml:space="preserve"> </w:t>
+      </w:r>
+      <w:r>
+        <w:t xml:space="preserve">appearing in economic news as commentators or affected parties (</w:t>
+      </w:r>
+      <w:r>
+        <w:t xml:space="preserve">“institution”</w:t>
+      </w:r>
+      <w:r>
+        <w:t xml:space="preserve">). The second register also</w:t>
+      </w:r>
+      <w:r>
+        <w:t xml:space="preserve"> </w:t>
+      </w:r>
+      <w:r>
+        <w:t xml:space="preserve">carries a definitional caveat. It includes clergy appearing as</w:t>
+      </w:r>
+      <w:r>
+        <w:t xml:space="preserve"> </w:t>
+      </w:r>
+      <w:r>
+        <w:rPr>
+          <w:b/>
+          <w:bCs/>
+        </w:rPr>
+        <w:t xml:space="preserve">commentators</w:t>
+      </w:r>
+      <w:r>
+        <w:t xml:space="preserve">, speaking subjects, some of whom</w:t>
+      </w:r>
+      <w:r>
+        <w:t xml:space="preserve"> </w:t>
+      </w:r>
+      <w:r>
+        <w:t xml:space="preserve">voice moral or economic judgements, alongside the Church as an affected party. The</w:t>
+      </w:r>
+      <w:r>
+        <w:t xml:space="preserve"> </w:t>
+      </w:r>
+      <w:r>
+        <w:t xml:space="preserve">“economic-object”</w:t>
+      </w:r>
+      <w:r>
+        <w:t xml:space="preserve"> </w:t>
+      </w:r>
+      <w:r>
+        <w:t xml:space="preserve">reading of</w:t>
+      </w:r>
+      <w:r>
+        <w:t xml:space="preserve"> </w:t>
+      </w:r>
+      <w:r>
+        <w:t xml:space="preserve">the ≈72% macro-register is therefore an upper bound, and splitting the institution register into subject and</w:t>
+      </w:r>
+      <w:r>
+        <w:t xml:space="preserve"> </w:t>
+      </w:r>
+      <w:r>
+        <w:t xml:space="preserve">object is deferred to the planned human coding round (see Limitations).</w:t>
+      </w:r>
+    </w:p>
+    <w:p>
+      <w:pPr>
+        <w:pStyle w:val="BodyText"/>
+      </w:pPr>
+      <w:r>
+        <w:t xml:space="preserve">An outlet pattern is visible but must be read cautiously (Table 3, Figure 2). The</w:t>
+      </w:r>
+      <w:r>
+        <w:t xml:space="preserve"> </w:t>
+      </w:r>
+      <w:r>
+        <w:t xml:space="preserve">“cost of religious life”</w:t>
+      </w:r>
+      <w:r>
+        <w:t xml:space="preserve"> </w:t>
+      </w:r>
+      <w:r>
+        <w:t xml:space="preserve">register is almost entirely a</w:t>
+      </w:r>
+      <w:r>
+        <w:t xml:space="preserve"> </w:t>
+      </w:r>
+      <w:r>
+        <w:rPr>
+          <w:b/>
+          <w:bCs/>
+        </w:rPr>
+        <w:t xml:space="preserve">secular</w:t>
+      </w:r>
+      <w:r>
+        <w:t xml:space="preserve"> </w:t>
+      </w:r>
+      <w:r>
+        <w:t xml:space="preserve">story: 189 of 194 such posts are secular outlets reporting that the</w:t>
+      </w:r>
+      <w:r>
+        <w:t xml:space="preserve"> </w:t>
+      </w:r>
+      <w:r>
+        <w:t xml:space="preserve">Church raised its prices. A tempting reading is that Catholic outlets, when they engage, tilt toward</w:t>
+      </w:r>
+      <w:r>
+        <w:t xml:space="preserve"> </w:t>
+      </w:r>
+      <w:r>
+        <w:rPr>
+          <w:b/>
+          <w:bCs/>
+        </w:rPr>
+        <w:t xml:space="preserve">charity</w:t>
+      </w:r>
+      <w:r>
+        <w:t xml:space="preserve"> </w:t>
+      </w:r>
+      <w:r>
+        <w:t xml:space="preserve">(27/75, or 36%, of the Catholic core versus 58/442, or 13%, of the secular core). We do not press this claim.</w:t>
+      </w:r>
+      <w:r>
+        <w:t xml:space="preserve"> </w:t>
+      </w:r>
+      <w:r>
+        <w:t xml:space="preserve">The Catholic subsample is small (n = 75), 75% of it is the single aggregator</w:t>
+      </w:r>
+      <w:r>
+        <w:t xml:space="preserve"> </w:t>
+      </w:r>
+      <w:r>
+        <w:rPr>
           <w:i/>
           <w:iCs/>
         </w:rPr>
-        <w:t xml:space="preserve">economic object</w:t>
-      </w:r>
-      <w:r>
-        <w:t xml:space="preserve">, not a moral voice: masses, church fees,</w:t>
-      </w:r>
-      <w:r>
-        <w:t xml:space="preserve"> </w:t>
-      </w:r>
-      <w:r>
-        <w:t xml:space="preserve">weddings, funerals and pilgrimages that became more expensive (</w:t>
-      </w:r>
-      <w:r>
-        <w:t xml:space="preserve">“cost of religious life”</w:t>
-      </w:r>
-      <w:r>
-        <w:t xml:space="preserve">), and clergy or dioceses</w:t>
-      </w:r>
-      <w:r>
-        <w:t xml:space="preserve"> </w:t>
-      </w:r>
-      <w:r>
-        <w:t xml:space="preserve">appearing in economic news as commentators or affected parties (</w:t>
-      </w:r>
-      <w:r>
-        <w:t xml:space="preserve">“institution”</w:t>
-      </w:r>
-      <w:r>
-        <w:t xml:space="preserve">). The second register also</w:t>
-      </w:r>
-      <w:r>
-        <w:t xml:space="preserve"> </w:t>
-      </w:r>
-      <w:r>
-        <w:t xml:space="preserve">carries a definitional caveat. It includes clergy appearing as</w:t>
-      </w:r>
-      <w:r>
-        <w:t xml:space="preserve"> </w:t>
-      </w:r>
-      <w:r>
-        <w:rPr>
-          <w:i/>
-          <w:iCs/>
-        </w:rPr>
-        <w:t xml:space="preserve">commentators</w:t>
-      </w:r>
-      <w:r>
-        <w:t xml:space="preserve">, speaking subjects, some of whom</w:t>
-      </w:r>
-      <w:r>
-        <w:t xml:space="preserve"> </w:t>
-      </w:r>
-      <w:r>
-        <w:t xml:space="preserve">voice moral or economic judgements, alongside the Church as an affected party. The</w:t>
-      </w:r>
-      <w:r>
-        <w:t xml:space="preserve"> </w:t>
-      </w:r>
-      <w:r>
-        <w:t xml:space="preserve">“economic-object”</w:t>
-      </w:r>
-      <w:r>
-        <w:t xml:space="preserve"> </w:t>
-      </w:r>
-      <w:r>
-        <w:t xml:space="preserve">reading of</w:t>
-      </w:r>
-      <w:r>
-        <w:t xml:space="preserve"> </w:t>
-      </w:r>
-      <w:r>
-        <w:t xml:space="preserve">the ≈72% macro-register is therefore an upper bound, and splitting the institution register into subject and</w:t>
-      </w:r>
-      <w:r>
-        <w:t xml:space="preserve"> </w:t>
-      </w:r>
-      <w:r>
-        <w:t xml:space="preserve">object is deferred to the planned human coding round (see Limitations).</w:t>
-      </w:r>
-    </w:p>
-    <w:p>
-      <w:pPr>
-        <w:pStyle w:val="BodyText"/>
-      </w:pPr>
-      <w:r>
-        <w:t xml:space="preserve">An outlet pattern is visible but must be read cautiously (Table 3, Figure 2). The</w:t>
-      </w:r>
-      <w:r>
-        <w:t xml:space="preserve"> </w:t>
-      </w:r>
-      <w:r>
-        <w:t xml:space="preserve">“cost of religious life”</w:t>
-      </w:r>
-      <w:r>
-        <w:t xml:space="preserve"> </w:t>
-      </w:r>
-      <w:r>
-        <w:t xml:space="preserve">register is almost entirely a</w:t>
+        <w:t xml:space="preserve">hkm.hr</w:t>
+      </w:r>
+      <w:r>
+        <w:t xml:space="preserve"> </w:t>
+      </w:r>
+      <w:r>
+        <w:t xml:space="preserve">(56 posts) whose own top</w:t>
+      </w:r>
+      <w:r>
+        <w:t xml:space="preserve"> </w:t>
+      </w:r>
+      <w:r>
+        <w:t xml:space="preserve">register is</w:t>
       </w:r>
       <w:r>
         <w:t xml:space="preserve"> </w:t>
@@ -2921,72 +2993,6 @@
         <w:rPr>
           <w:b/>
           <w:bCs/>
-        </w:rPr>
-        <w:t xml:space="preserve">secular</w:t>
-      </w:r>
-      <w:r>
-        <w:t xml:space="preserve"> </w:t>
-      </w:r>
-      <w:r>
-        <w:t xml:space="preserve">story: 189 of 194 such posts are secular outlets reporting that the</w:t>
-      </w:r>
-      <w:r>
-        <w:t xml:space="preserve"> </w:t>
-      </w:r>
-      <w:r>
-        <w:t xml:space="preserve">Church raised its prices. A tempting reading is that Catholic outlets, when they engage, tilt toward</w:t>
-      </w:r>
-      <w:r>
-        <w:t xml:space="preserve"> </w:t>
-      </w:r>
-      <w:r>
-        <w:rPr>
-          <w:i/>
-          <w:iCs/>
-        </w:rPr>
-        <w:t xml:space="preserve">charity</w:t>
-      </w:r>
-      <w:r>
-        <w:t xml:space="preserve"> </w:t>
-      </w:r>
-      <w:r>
-        <w:t xml:space="preserve">(27/75, or 36%, of the Catholic core versus 58/442, or 13%, of the secular core). We do not press this claim.</w:t>
-      </w:r>
-      <w:r>
-        <w:t xml:space="preserve"> </w:t>
-      </w:r>
-      <w:r>
-        <w:t xml:space="preserve">The Catholic subsample is small (n = 75), 75% of it is the single aggregator</w:t>
-      </w:r>
-      <w:r>
-        <w:t xml:space="preserve"> </w:t>
-      </w:r>
-      <w:r>
-        <w:rPr>
-          <w:i/>
-          <w:iCs/>
-        </w:rPr>
-        <w:t xml:space="preserve">hkm.hr</w:t>
-      </w:r>
-      <w:r>
-        <w:t xml:space="preserve"> </w:t>
-      </w:r>
-      <w:r>
-        <w:t xml:space="preserve">(56 posts) whose own top</w:t>
-      </w:r>
-      <w:r>
-        <w:t xml:space="preserve"> </w:t>
-      </w:r>
-      <w:r>
-        <w:t xml:space="preserve">register is</w:t>
-      </w:r>
-      <w:r>
-        <w:t xml:space="preserve"> </w:t>
-      </w:r>
-      <w:r>
-        <w:rPr>
-          <w:i/>
-          <w:iCs/>
         </w:rPr>
         <w:t xml:space="preserve">institution</w:t>
       </w:r>
@@ -3435,7 +3441,7 @@
       <w:r>
         <w:drawing>
           <wp:inline>
-            <wp:extent cx="4533900" cy="2418080"/>
+            <wp:extent cx="4533900" cy="2449348"/>
             <wp:effectExtent b="0" l="0" r="0" t="0"/>
             <wp:docPr descr="Figure 2" title="" id="30" name="Picture"/>
             <a:graphic>
@@ -3456,7 +3462,7 @@
                   <pic:spPr bwMode="auto">
                     <a:xfrm>
                       <a:off x="0" y="0"/>
-                      <a:ext cx="4533900" cy="2418080"/>
+                      <a:ext cx="4533900" cy="2449348"/>
                     </a:xfrm>
                     <a:prstGeom prst="rect">
                       <a:avLst/>
@@ -3587,102 +3593,102 @@
       </w:r>
       <w:r>
         <w:rPr>
+          <w:b/>
+          <w:bCs/>
+        </w:rPr>
+        <w:t xml:space="preserve">within</w:t>
+      </w:r>
+      <w:r>
+        <w:t xml:space="preserve"> </w:t>
+      </w:r>
+      <w:r>
+        <w:t xml:space="preserve">a stream, not across the 2024</w:t>
+      </w:r>
+      <w:r>
+        <w:t xml:space="preserve"> </w:t>
+      </w:r>
+      <w:r>
+        <w:t xml:space="preserve">seam (Figure 3).</w:t>
+      </w:r>
+    </w:p>
+    <w:p>
+      <w:pPr>
+        <w:pStyle w:val="BodyText"/>
+      </w:pPr>
+      <w:r>
+        <w:rPr>
+          <w:b/>
+          <w:bCs/>
+        </w:rPr>
+        <w:t xml:space="preserve">Within the clean 2021 to 2024 monitoring stream</w:t>
+      </w:r>
+      <w:r>
+        <w:t xml:space="preserve">, the core rises sharply to a</w:t>
+      </w:r>
+      <w:r>
+        <w:t xml:space="preserve"> </w:t>
+      </w:r>
+      <w:r>
+        <w:rPr>
+          <w:b/>
+          <w:bCs/>
+        </w:rPr>
+        <w:t xml:space="preserve">2022 peak of 201 posts</w:t>
+      </w:r>
+      <w:r>
+        <w:t xml:space="preserve">,</w:t>
+      </w:r>
+      <w:r>
+        <w:t xml:space="preserve"> </w:t>
+      </w:r>
+      <w:r>
+        <w:t xml:space="preserve">the height of the energy shock, and declines thereafter (2023: 100, 2024: 64). This within-instrument decline is</w:t>
+      </w:r>
+      <w:r>
+        <w:t xml:space="preserve"> </w:t>
+      </w:r>
+      <w:r>
+        <w:t xml:space="preserve">genuine, not a collection artifact. The later backfill figures (2025: 66, 2026: 53) come from a different</w:t>
+      </w:r>
+      <w:r>
+        <w:t xml:space="preserve"> </w:t>
+      </w:r>
+      <w:r>
+        <w:t xml:space="preserve">instrument and are</w:t>
+      </w:r>
+      <w:r>
+        <w:t xml:space="preserve"> </w:t>
+      </w:r>
+      <w:r>
+        <w:rPr>
+          <w:b/>
+          <w:bCs/>
+        </w:rPr>
+        <w:t xml:space="preserve">not</w:t>
+      </w:r>
+      <w:r>
+        <w:t xml:space="preserve"> </w:t>
+      </w:r>
+      <w:r>
+        <w:t xml:space="preserve">evidence of a continued decline.</w:t>
+      </w:r>
+    </w:p>
+    <w:p>
+      <w:pPr>
+        <w:pStyle w:val="BodyText"/>
+      </w:pPr>
+      <w:r>
+        <w:t xml:space="preserve">Figure 3</w:t>
+      </w:r>
+      <w:r>
+        <w:t xml:space="preserve"> </w:t>
+      </w:r>
+      <w:r>
+        <w:rPr>
           <w:i/>
           <w:iCs/>
         </w:rPr>
-        <w:t xml:space="preserve">within</w:t>
-      </w:r>
-      <w:r>
-        <w:t xml:space="preserve"> </w:t>
-      </w:r>
-      <w:r>
-        <w:t xml:space="preserve">a stream, not across the 2024</w:t>
-      </w:r>
-      <w:r>
-        <w:t xml:space="preserve"> </w:t>
-      </w:r>
-      <w:r>
-        <w:t xml:space="preserve">seam (Figure 3).</w:t>
-      </w:r>
-    </w:p>
-    <w:p>
-      <w:pPr>
-        <w:pStyle w:val="BodyText"/>
-      </w:pPr>
-      <w:r>
-        <w:rPr>
-          <w:b/>
-          <w:bCs/>
-        </w:rPr>
-        <w:t xml:space="preserve">Within the clean 2021 to 2024 monitoring stream</w:t>
-      </w:r>
-      <w:r>
-        <w:t xml:space="preserve">, the core rises sharply to a</w:t>
-      </w:r>
-      <w:r>
-        <w:t xml:space="preserve"> </w:t>
-      </w:r>
-      <w:r>
-        <w:rPr>
-          <w:b/>
-          <w:bCs/>
-        </w:rPr>
-        <w:t xml:space="preserve">2022 peak of 201 posts</w:t>
-      </w:r>
-      <w:r>
-        <w:t xml:space="preserve">,</w:t>
-      </w:r>
-      <w:r>
-        <w:t xml:space="preserve"> </w:t>
-      </w:r>
-      <w:r>
-        <w:t xml:space="preserve">the height of the energy shock, and declines thereafter (2023: 100, 2024: 64). This within-instrument decline is</w:t>
-      </w:r>
-      <w:r>
-        <w:t xml:space="preserve"> </w:t>
-      </w:r>
-      <w:r>
-        <w:t xml:space="preserve">genuine, not a collection artifact. The later backfill figures (2025: 66, 2026: 53) come from a different</w:t>
-      </w:r>
-      <w:r>
-        <w:t xml:space="preserve"> </w:t>
-      </w:r>
-      <w:r>
-        <w:t xml:space="preserve">instrument and are</w:t>
-      </w:r>
-      <w:r>
-        <w:t xml:space="preserve"> </w:t>
-      </w:r>
-      <w:r>
-        <w:rPr>
-          <w:b/>
-          <w:bCs/>
-        </w:rPr>
-        <w:t xml:space="preserve">not</w:t>
-      </w:r>
-      <w:r>
-        <w:t xml:space="preserve"> </w:t>
-      </w:r>
-      <w:r>
-        <w:t xml:space="preserve">evidence of a continued decline.</w:t>
-      </w:r>
-    </w:p>
-    <w:p>
-      <w:pPr>
-        <w:pStyle w:val="BodyText"/>
-      </w:pPr>
-      <w:r>
-        <w:t xml:space="preserve">Figure 3</w:t>
-      </w:r>
-      <w:r>
-        <w:t xml:space="preserve"> </w:t>
-      </w:r>
-      <w:r>
-        <w:rPr>
-          <w:i/>
-          <w:iCs/>
-        </w:rPr>
-        <w:t xml:space="preserve">Measured core volume by collection stream (batch-confound check)</w:t>
+        <w:t xml:space="preserve">Measured core volume by collection stream, by year (batch-confound check)</w:t>
       </w:r>
     </w:p>
     <w:p>
@@ -3692,7 +3698,7 @@
       <w:r>
         <w:drawing>
           <wp:inline>
-            <wp:extent cx="4533900" cy="2050111"/>
+            <wp:extent cx="4533900" cy="2052186"/>
             <wp:effectExtent b="0" l="0" r="0" t="0"/>
             <wp:docPr descr="Figure 3" title="" id="34" name="Picture"/>
             <a:graphic>
@@ -3713,7 +3719,7 @@
                   <pic:spPr bwMode="auto">
                     <a:xfrm>
                       <a:off x="0" y="0"/>
-                      <a:ext cx="4533900" cy="2050111"/>
+                      <a:ext cx="4533900" cy="2052186"/>
                     </a:xfrm>
                     <a:prstGeom prst="rect">
                       <a:avLst/>
@@ -3745,6 +3751,12 @@
         <w:pStyle w:val="BodyText"/>
       </w:pPr>
       <w:r>
+        <w:t xml:space="preserve">Note: Trends must be read within a single stream. The monitoring stream covers roughly 2021 to 2024, the backfill stream roughly 2024 to 2026.</w:t>
+      </w:r>
+      <w:r>
+        <w:t xml:space="preserve"> </w:t>
+      </w:r>
+      <w:r>
         <w:t xml:space="preserve">Source: Authors’ calculation from the DigiKat corpus.</w:t>
       </w:r>
     </w:p>
@@ -3760,8 +3772,8 @@
       </w:r>
       <w:r>
         <w:rPr>
-          <w:i/>
-          <w:iCs/>
+          <w:b/>
+          <w:bCs/>
         </w:rPr>
         <w:t xml:space="preserve">institution</w:t>
       </w:r>
@@ -3788,8 +3800,8 @@
       </w:r>
       <w:r>
         <w:rPr>
-          <w:i/>
-          <w:iCs/>
+          <w:b/>
+          <w:bCs/>
         </w:rPr>
         <w:t xml:space="preserve">cost-of-religious-life</w:t>
       </w:r>
@@ -4513,7 +4525,7 @@
           <w:i/>
           <w:iCs/>
         </w:rPr>
-        <w:t xml:space="preserve">Register over time (monthly, measured core)</w:t>
+        <w:t xml:space="preserve">Register over time, by year (measured core)</w:t>
       </w:r>
     </w:p>
     <w:p>
@@ -4523,7 +4535,7 @@
       <w:r>
         <w:drawing>
           <wp:inline>
-            <wp:extent cx="4533900" cy="2286662"/>
+            <wp:extent cx="4533900" cy="2290812"/>
             <wp:effectExtent b="0" l="0" r="0" t="0"/>
             <wp:docPr descr="Figure 4" title="" id="37" name="Picture"/>
             <a:graphic>
@@ -4544,7 +4556,7 @@
                   <pic:spPr bwMode="auto">
                     <a:xfrm>
                       <a:off x="0" y="0"/>
-                      <a:ext cx="4533900" cy="2286662"/>
+                      <a:ext cx="4533900" cy="2290812"/>
                     </a:xfrm>
                     <a:prstGeom prst="rect">
                       <a:avLst/>
@@ -5006,7 +5018,7 @@
       <w:r>
         <w:drawing>
           <wp:inline>
-            <wp:extent cx="4533900" cy="2418080"/>
+            <wp:extent cx="4533900" cy="2449348"/>
             <wp:effectExtent b="0" l="0" r="0" t="0"/>
             <wp:docPr descr="Figure 5" title="" id="41" name="Picture"/>
             <a:graphic>
@@ -5027,7 +5039,7 @@
                   <pic:spPr bwMode="auto">
                     <a:xfrm>
                       <a:off x="0" y="0"/>
-                      <a:ext cx="4533900" cy="2418080"/>
+                      <a:ext cx="4533900" cy="2449348"/>
                     </a:xfrm>
                     <a:prstGeom prst="rect">
                       <a:avLst/>
@@ -5606,7 +5618,7 @@
           <w:i/>
           <w:iCs/>
         </w:rPr>
-        <w:t xml:space="preserve">Inflation-attention vs HICP, 2021–2024 monitoring stream</w:t>
+        <w:t xml:space="preserve">Inflation-attention versus HICP, 2021–2024 monitoring stream</w:t>
       </w:r>
     </w:p>
     <w:p>
@@ -5616,7 +5628,7 @@
       <w:r>
         <w:drawing>
           <wp:inline>
-            <wp:extent cx="4533900" cy="2365513"/>
+            <wp:extent cx="4533900" cy="2386263"/>
             <wp:effectExtent b="0" l="0" r="0" t="0"/>
             <wp:docPr descr="Figure 6" title="" id="45" name="Picture"/>
             <a:graphic>
@@ -5637,7 +5649,7 @@
                   <pic:spPr bwMode="auto">
                     <a:xfrm>
                       <a:off x="0" y="0"/>
-                      <a:ext cx="4533900" cy="2365513"/>
+                      <a:ext cx="4533900" cy="2386263"/>
                     </a:xfrm>
                     <a:prstGeom prst="rect">
                       <a:avLst/>
@@ -5669,6 +5681,12 @@
         <w:pStyle w:val="BodyText"/>
       </w:pPr>
       <w:r>
+        <w:t xml:space="preserve">Note: Bars show the share of corpus posts mentioning inflation (left axis). Lines show the Croatian HICP annual rate of change (right axis).</w:t>
+      </w:r>
+      <w:r>
+        <w:t xml:space="preserve"> </w:t>
+      </w:r>
+      <w:r>
         <w:t xml:space="preserve">Source: Authors’ calculation from the DigiKat corpus and Eurostat (</w:t>
       </w:r>
       <w:r>
@@ -5852,329 +5870,122 @@
       </w:r>
       <w:r>
         <w:rPr>
-          <w:i/>
-          <w:iCs/>
-        </w:rPr>
-        <w:t xml:space="preserve">religious</w:t>
-      </w:r>
-      <w:r>
-        <w:t xml:space="preserve"> </w:t>
-      </w:r>
-      <w:r>
-        <w:t xml:space="preserve">engagement is small and, where present, non-prophetic. The</w:t>
-      </w:r>
-      <w:r>
-        <w:t xml:space="preserve"> </w:t>
-      </w:r>
-      <w:r>
-        <w:t xml:space="preserve">public conversation about inflation was there for a religious justice voice to enter, but little of one is</w:t>
-      </w:r>
-      <w:r>
-        <w:t xml:space="preserve"> </w:t>
-      </w:r>
-      <w:r>
-        <w:t xml:space="preserve">visible in the measured discourse.</w:t>
-      </w:r>
-    </w:p>
-    <w:p>
-      <w:pPr>
-        <w:pStyle w:val="BodyText"/>
-      </w:pPr>
-      <w:r>
-        <w:t xml:space="preserve">A possible division of narrative labour emerges, though it remains a hypothesis. The register-outlet pattern</w:t>
-      </w:r>
-      <w:r>
-        <w:t xml:space="preserve"> </w:t>
-      </w:r>
-      <w:r>
-        <w:t xml:space="preserve">hints at two storytellers: secular media supplying the</w:t>
-      </w:r>
-      <w:r>
-        <w:t xml:space="preserve"> </w:t>
-      </w:r>
-      <w:r>
-        <w:t xml:space="preserve">“costlier candles”</w:t>
-      </w:r>
-      <w:r>
-        <w:t xml:space="preserve"> </w:t>
-      </w:r>
-      <w:r>
-        <w:t xml:space="preserve">story, reporting, often critically</w:t>
-      </w:r>
-      <w:r>
-        <w:t xml:space="preserve"> </w:t>
-      </w:r>
-      <w:r>
-        <w:t xml:space="preserve">and in a negative tone, that the Church raised the price of masses, weddings and funerals around the euro</w:t>
-      </w:r>
-      <w:r>
-        <w:t xml:space="preserve"> </w:t>
-      </w:r>
-      <w:r>
-        <w:t xml:space="preserve">changeover, and Catholic outlets leaning, in their thin non-aggregator tail, toward</w:t>
-      </w:r>
-      <w:r>
-        <w:t xml:space="preserve"> </w:t>
-      </w:r>
-      <w:r>
-        <w:t xml:space="preserve">“quiet charity.”</w:t>
-      </w:r>
-      <w:r>
-        <w:t xml:space="preserve"> </w:t>
-      </w:r>
-      <w:r>
-        <w:t xml:space="preserve">As noted</w:t>
-      </w:r>
-      <w:r>
-        <w:t xml:space="preserve"> </w:t>
-      </w:r>
-      <w:r>
-        <w:t xml:space="preserve">above, the Catholic subsample is too small and too aggregator-dominated to establish this contrast, so we</w:t>
-      </w:r>
-      <w:r>
-        <w:t xml:space="preserve"> </w:t>
-      </w:r>
-      <w:r>
-        <w:t xml:space="preserve">advance it only as a hypothesis. What both kinds of outlet share is the near-absence of the prophetic,</w:t>
-      </w:r>
-      <w:r>
-        <w:t xml:space="preserve"> </w:t>
-      </w:r>
-      <w:r>
-        <w:t xml:space="preserve">structural voice.</w:t>
-      </w:r>
-    </w:p>
-    <w:p>
-      <w:pPr>
-        <w:pStyle w:val="BodyText"/>
-      </w:pPr>
-      <w:r>
-        <w:t xml:space="preserve">Mechanism and timing also matter here. Within the 2021 to 2024 stream, the pattern is consistent with an</w:t>
-      </w:r>
-      <w:r>
-        <w:t xml:space="preserve"> </w:t>
-      </w:r>
-      <w:r>
-        <w:t xml:space="preserve">agenda-setting reading: the religious linkage flares during the acute 2022 shock, largely institutional</w:t>
-      </w:r>
-      <w:r>
-        <w:t xml:space="preserve"> </w:t>
-      </w:r>
-      <w:r>
-        <w:t xml:space="preserve">commentary, and recedes as prices stabilise, while church-fee coverage rises around euro adoption. On this</w:t>
-      </w:r>
-      <w:r>
-        <w:t xml:space="preserve"> </w:t>
-      </w:r>
-      <w:r>
-        <w:t xml:space="preserve">within-stream evidence, the dynamic looks closer to</w:t>
-      </w:r>
-      <w:r>
-        <w:t xml:space="preserve"> </w:t>
-      </w:r>
-      <w:r>
-        <w:rPr>
-          <w:i/>
-          <w:iCs/>
-        </w:rPr>
-        <w:t xml:space="preserve">resonance</w:t>
-      </w:r>
-      <w:r>
-        <w:t xml:space="preserve"> </w:t>
-      </w:r>
-      <w:r>
-        <w:t xml:space="preserve">than to</w:t>
-      </w:r>
-      <w:r>
-        <w:t xml:space="preserve"> </w:t>
-      </w:r>
-      <w:r>
-        <w:rPr>
-          <w:i/>
-          <w:iCs/>
-        </w:rPr>
-        <w:t xml:space="preserve">setting</w:t>
-      </w:r>
-      <w:r>
-        <w:t xml:space="preserve"> </w:t>
-      </w:r>
-      <w:r>
-        <w:t xml:space="preserve">(H2, provisional). Religion</w:t>
-      </w:r>
-      <w:r>
-        <w:t xml:space="preserve"> </w:t>
-      </w:r>
-      <w:r>
-        <w:t xml:space="preserve">enters inflation discourse reactively, as an affected party, rather than as an agenda-setter for economic</w:t>
-      </w:r>
-      <w:r>
-        <w:t xml:space="preserve"> </w:t>
-      </w:r>
-      <w:r>
-        <w:t xml:space="preserve">justice.</w:t>
-      </w:r>
-    </w:p>
-    <w:p>
-      <w:pPr>
-        <w:pStyle w:val="BodyText"/>
-      </w:pPr>
-      <w:r>
-        <w:t xml:space="preserve">This finding matters across three fields. For sociology of religion, it qualifies accounts of the Croatian</w:t>
-      </w:r>
-      <w:r>
-        <w:t xml:space="preserve"> </w:t>
-      </w:r>
-      <w:r>
-        <w:t xml:space="preserve">Church as a strong public actor: on the economy, at least, its digital-public presence is thin and</w:t>
-      </w:r>
-      <w:r>
-        <w:t xml:space="preserve"> </w:t>
-      </w:r>
-      <w:r>
-        <w:t xml:space="preserve">non-prophetic. For media studies, it extends inflation-salience research into the religious sphere and shows</w:t>
-      </w:r>
-      <w:r>
-        <w:t xml:space="preserve"> </w:t>
-      </w:r>
-      <w:r>
-        <w:t xml:space="preserve">that the</w:t>
-      </w:r>
-      <w:r>
-        <w:t xml:space="preserve"> </w:t>
-      </w:r>
-      <w:r>
-        <w:t xml:space="preserve">“who is hurt”</w:t>
-      </w:r>
-      <w:r>
-        <w:t xml:space="preserve"> </w:t>
-      </w:r>
-      <w:r>
-        <w:t xml:space="preserve">framing has a specifically institutional variant:</w:t>
-      </w:r>
-      <w:r>
-        <w:t xml:space="preserve"> </w:t>
-      </w:r>
-      <w:r>
-        <w:t xml:space="preserve">“who charges more.”</w:t>
-      </w:r>
-      <w:r>
-        <w:t xml:space="preserve"> </w:t>
-      </w:r>
-      <w:r>
-        <w:t xml:space="preserve">For CST</w:t>
-      </w:r>
-      <w:r>
-        <w:t xml:space="preserve"> </w:t>
-      </w:r>
-      <w:r>
-        <w:t xml:space="preserve">scholarship, the absence poses the question of why the doctrinal justice frame does not travel into the</w:t>
-      </w:r>
-      <w:r>
-        <w:t xml:space="preserve"> </w:t>
-      </w:r>
-      <w:r>
-        <w:t xml:space="preserve">national digital public sphere.</w:t>
-      </w:r>
-    </w:p>
-    <w:p>
-      <w:pPr>
-        <w:pStyle w:val="BodyText"/>
-      </w:pPr>
-      <w:r>
-        <w:t xml:space="preserve">Three implications for social policy follow. First, if agenda-setting research is right that media frames</w:t>
-      </w:r>
-      <w:r>
-        <w:t xml:space="preserve"> </w:t>
-      </w:r>
-      <w:r>
-        <w:t xml:space="preserve">shape which policy responses the public regards as warranted, then a digital sphere in which religion meets</w:t>
-      </w:r>
-      <w:r>
-        <w:t xml:space="preserve"> </w:t>
-      </w:r>
-      <w:r>
-        <w:t xml:space="preserve">inflation as fees and institutional news, rather than as structural injustice, contributes little to building</w:t>
-      </w:r>
-      <w:r>
-        <w:t xml:space="preserve"> </w:t>
-      </w:r>
-      <w:r>
-        <w:t xml:space="preserve">public support for redistributive or anti-poverty responses to a cost-of-living shock, despite doctrine that</w:t>
-      </w:r>
-      <w:r>
-        <w:t xml:space="preserve"> </w:t>
-      </w:r>
-      <w:r>
-        <w:t xml:space="preserve">points exactly there. Second, the visible charity register (17%) documents the place the country’s principal</w:t>
-      </w:r>
-      <w:r>
-        <w:t xml:space="preserve"> </w:t>
-      </w:r>
-      <w:r>
-        <w:t xml:space="preserve">faith-based relief network actually occupies in the digital public sphere: Caritas appears as an episodic</w:t>
-      </w:r>
-      <w:r>
-        <w:t xml:space="preserve"> </w:t>
-      </w:r>
-      <w:r>
-        <w:t xml:space="preserve">relief actor in the mixed economy of welfare rather than as an advocate for structural reform, the familiar</w:t>
-      </w:r>
-      <w:r>
-        <w:t xml:space="preserve"> </w:t>
-      </w:r>
-      <w:r>
-        <w:t xml:space="preserve">charity-versus-justice tension in faith-based provision, here measured rather than asserted. Third, the</w:t>
-      </w:r>
-      <w:r>
-        <w:t xml:space="preserve"> </w:t>
-      </w:r>
-      <w:r>
-        <w:t xml:space="preserve">dominant cost-of-religious-life register identifies a concrete social-policy object. Fees for weddings,</w:t>
-      </w:r>
-      <w:r>
-        <w:t xml:space="preserve"> </w:t>
-      </w:r>
-      <w:r>
-        <w:t xml:space="preserve">funerals and other rites of passage function as quasi-obligatory expenditures for religiously observant</w:t>
-      </w:r>
-      <w:r>
-        <w:t xml:space="preserve"> </w:t>
-      </w:r>
-      <w:r>
-        <w:t xml:space="preserve">low-income households, a neglected component of cost-of-living measurement that the euro-changeover fee resets</w:t>
-      </w:r>
-      <w:r>
-        <w:t xml:space="preserve"> </w:t>
-      </w:r>
-      <w:r>
-        <w:t xml:space="preserve">made briefly and unusually visible.</w:t>
-      </w:r>
-    </w:p>
-    <w:p>
-      <w:pPr>
-        <w:pStyle w:val="BodyText"/>
-      </w:pPr>
-      <w:r>
-        <w:t xml:space="preserve">To summarize the hypothesis scorecard, H1, attention-price coupling, is</w:t>
-      </w:r>
-      <w:r>
-        <w:t xml:space="preserve"> </w:t>
-      </w:r>
-      <w:r>
-        <w:rPr>
           <w:b/>
           <w:bCs/>
         </w:rPr>
-        <w:t xml:space="preserve">partially supported</w:t>
-      </w:r>
-      <w:r>
-        <w:t xml:space="preserve">: the coupling</w:t>
-      </w:r>
-      <w:r>
-        <w:t xml:space="preserve"> </w:t>
-      </w:r>
-      <w:r>
-        <w:t xml:space="preserve">holds, though energy couples only weakly. H2, resonance not setting, is</w:t>
+        <w:t xml:space="preserve">religious</w:t>
+      </w:r>
+      <w:r>
+        <w:t xml:space="preserve"> </w:t>
+      </w:r>
+      <w:r>
+        <w:t xml:space="preserve">engagement is small and, where present, non-prophetic. The</w:t>
+      </w:r>
+      <w:r>
+        <w:t xml:space="preserve"> </w:t>
+      </w:r>
+      <w:r>
+        <w:t xml:space="preserve">public conversation about inflation was there for a religious justice voice to enter, but little of one is</w:t>
+      </w:r>
+      <w:r>
+        <w:t xml:space="preserve"> </w:t>
+      </w:r>
+      <w:r>
+        <w:t xml:space="preserve">visible in the measured discourse.</w:t>
+      </w:r>
+    </w:p>
+    <w:p>
+      <w:pPr>
+        <w:pStyle w:val="BodyText"/>
+      </w:pPr>
+      <w:r>
+        <w:t xml:space="preserve">A possible division of narrative labour emerges, though it remains a hypothesis. The register-outlet pattern</w:t>
+      </w:r>
+      <w:r>
+        <w:t xml:space="preserve"> </w:t>
+      </w:r>
+      <w:r>
+        <w:t xml:space="preserve">hints at two storytellers: secular media supplying the</w:t>
+      </w:r>
+      <w:r>
+        <w:t xml:space="preserve"> </w:t>
+      </w:r>
+      <w:r>
+        <w:t xml:space="preserve">“costlier candles”</w:t>
+      </w:r>
+      <w:r>
+        <w:t xml:space="preserve"> </w:t>
+      </w:r>
+      <w:r>
+        <w:t xml:space="preserve">story, reporting, often critically</w:t>
+      </w:r>
+      <w:r>
+        <w:t xml:space="preserve"> </w:t>
+      </w:r>
+      <w:r>
+        <w:t xml:space="preserve">and in a negative tone, that the Church raised the price of masses, weddings and funerals around the euro</w:t>
+      </w:r>
+      <w:r>
+        <w:t xml:space="preserve"> </w:t>
+      </w:r>
+      <w:r>
+        <w:t xml:space="preserve">changeover, and Catholic outlets leaning, in their thin non-aggregator tail, toward</w:t>
+      </w:r>
+      <w:r>
+        <w:t xml:space="preserve"> </w:t>
+      </w:r>
+      <w:r>
+        <w:t xml:space="preserve">“quiet charity.”</w:t>
+      </w:r>
+      <w:r>
+        <w:t xml:space="preserve"> </w:t>
+      </w:r>
+      <w:r>
+        <w:t xml:space="preserve">As noted</w:t>
+      </w:r>
+      <w:r>
+        <w:t xml:space="preserve"> </w:t>
+      </w:r>
+      <w:r>
+        <w:t xml:space="preserve">above, the Catholic subsample is too small and too aggregator-dominated to establish this contrast, so we</w:t>
+      </w:r>
+      <w:r>
+        <w:t xml:space="preserve"> </w:t>
+      </w:r>
+      <w:r>
+        <w:t xml:space="preserve">advance it only as a hypothesis. What both kinds of outlet share is the near-absence of the prophetic,</w:t>
+      </w:r>
+      <w:r>
+        <w:t xml:space="preserve"> </w:t>
+      </w:r>
+      <w:r>
+        <w:t xml:space="preserve">structural voice.</w:t>
+      </w:r>
+    </w:p>
+    <w:p>
+      <w:pPr>
+        <w:pStyle w:val="BodyText"/>
+      </w:pPr>
+      <w:r>
+        <w:t xml:space="preserve">Mechanism and timing also matter here. Within the 2021 to 2024 stream, the pattern is consistent with an</w:t>
+      </w:r>
+      <w:r>
+        <w:t xml:space="preserve"> </w:t>
+      </w:r>
+      <w:r>
+        <w:t xml:space="preserve">agenda-setting reading: the religious linkage flares during the acute 2022 shock, largely institutional</w:t>
+      </w:r>
+      <w:r>
+        <w:t xml:space="preserve"> </w:t>
+      </w:r>
+      <w:r>
+        <w:t xml:space="preserve">commentary, and recedes as prices stabilise, while church-fee coverage rises around euro adoption. On this</w:t>
+      </w:r>
+      <w:r>
+        <w:t xml:space="preserve"> </w:t>
+      </w:r>
+      <w:r>
+        <w:t xml:space="preserve">within-stream evidence, the dynamic looks closer to</w:t>
       </w:r>
       <w:r>
         <w:t xml:space="preserve"> </w:t>
@@ -6184,16 +5995,13 @@
           <w:b/>
           <w:bCs/>
         </w:rPr>
-        <w:t xml:space="preserve">provisionally consistent</w:t>
-      </w:r>
-      <w:r>
-        <w:t xml:space="preserve">, pending</w:t>
-      </w:r>
-      <w:r>
-        <w:t xml:space="preserve"> </w:t>
-      </w:r>
-      <w:r>
-        <w:t xml:space="preserve">a lead-lag test. P3, the prophetic-actor proposition, is</w:t>
+        <w:t xml:space="preserve">resonance</w:t>
+      </w:r>
+      <w:r>
+        <w:t xml:space="preserve"> </w:t>
+      </w:r>
+      <w:r>
+        <w:t xml:space="preserve">than to</w:t>
       </w:r>
       <w:r>
         <w:t xml:space="preserve"> </w:t>
@@ -6203,16 +6011,169 @@
           <w:b/>
           <w:bCs/>
         </w:rPr>
-        <w:t xml:space="preserve">not visible in the digital-news measure</w:t>
-      </w:r>
-      <w:r>
-        <w:t xml:space="preserve">, since the</w:t>
-      </w:r>
-      <w:r>
-        <w:t xml:space="preserve"> </w:t>
-      </w:r>
-      <w:r>
-        <w:t xml:space="preserve">actor-level claim is not testable here. P4, episodic over thematic, is</w:t>
+        <w:t xml:space="preserve">setting</w:t>
+      </w:r>
+      <w:r>
+        <w:t xml:space="preserve"> </w:t>
+      </w:r>
+      <w:r>
+        <w:t xml:space="preserve">(H2, provisional). Religion</w:t>
+      </w:r>
+      <w:r>
+        <w:t xml:space="preserve"> </w:t>
+      </w:r>
+      <w:r>
+        <w:t xml:space="preserve">enters inflation discourse reactively, as an affected party, rather than as an agenda-setter for economic</w:t>
+      </w:r>
+      <w:r>
+        <w:t xml:space="preserve"> </w:t>
+      </w:r>
+      <w:r>
+        <w:t xml:space="preserve">justice.</w:t>
+      </w:r>
+    </w:p>
+    <w:p>
+      <w:pPr>
+        <w:pStyle w:val="BodyText"/>
+      </w:pPr>
+      <w:r>
+        <w:t xml:space="preserve">This finding matters across three fields. For sociology of religion, it qualifies accounts of the Croatian</w:t>
+      </w:r>
+      <w:r>
+        <w:t xml:space="preserve"> </w:t>
+      </w:r>
+      <w:r>
+        <w:t xml:space="preserve">Church as a strong public actor: on the economy, at least, its digital-public presence is thin and</w:t>
+      </w:r>
+      <w:r>
+        <w:t xml:space="preserve"> </w:t>
+      </w:r>
+      <w:r>
+        <w:t xml:space="preserve">non-prophetic. For media studies, it extends inflation-salience research into the religious sphere and shows</w:t>
+      </w:r>
+      <w:r>
+        <w:t xml:space="preserve"> </w:t>
+      </w:r>
+      <w:r>
+        <w:t xml:space="preserve">that the</w:t>
+      </w:r>
+      <w:r>
+        <w:t xml:space="preserve"> </w:t>
+      </w:r>
+      <w:r>
+        <w:t xml:space="preserve">“who is hurt”</w:t>
+      </w:r>
+      <w:r>
+        <w:t xml:space="preserve"> </w:t>
+      </w:r>
+      <w:r>
+        <w:t xml:space="preserve">framing has a specifically institutional variant:</w:t>
+      </w:r>
+      <w:r>
+        <w:t xml:space="preserve"> </w:t>
+      </w:r>
+      <w:r>
+        <w:t xml:space="preserve">“who charges more.”</w:t>
+      </w:r>
+      <w:r>
+        <w:t xml:space="preserve"> </w:t>
+      </w:r>
+      <w:r>
+        <w:t xml:space="preserve">For CST</w:t>
+      </w:r>
+      <w:r>
+        <w:t xml:space="preserve"> </w:t>
+      </w:r>
+      <w:r>
+        <w:t xml:space="preserve">scholarship, the absence poses the question of why the doctrinal justice frame does not travel into the</w:t>
+      </w:r>
+      <w:r>
+        <w:t xml:space="preserve"> </w:t>
+      </w:r>
+      <w:r>
+        <w:t xml:space="preserve">national digital public sphere.</w:t>
+      </w:r>
+    </w:p>
+    <w:p>
+      <w:pPr>
+        <w:pStyle w:val="BodyText"/>
+      </w:pPr>
+      <w:r>
+        <w:t xml:space="preserve">Three implications for social policy follow. First, if agenda-setting research is right that media frames</w:t>
+      </w:r>
+      <w:r>
+        <w:t xml:space="preserve"> </w:t>
+      </w:r>
+      <w:r>
+        <w:t xml:space="preserve">shape which policy responses the public regards as warranted, then a digital sphere in which religion meets</w:t>
+      </w:r>
+      <w:r>
+        <w:t xml:space="preserve"> </w:t>
+      </w:r>
+      <w:r>
+        <w:t xml:space="preserve">inflation as fees and institutional news, rather than as structural injustice, contributes little to building</w:t>
+      </w:r>
+      <w:r>
+        <w:t xml:space="preserve"> </w:t>
+      </w:r>
+      <w:r>
+        <w:t xml:space="preserve">public support for redistributive or anti-poverty responses to a cost-of-living shock, despite doctrine that</w:t>
+      </w:r>
+      <w:r>
+        <w:t xml:space="preserve"> </w:t>
+      </w:r>
+      <w:r>
+        <w:t xml:space="preserve">points exactly there. Second, the visible charity register (17%) documents the place the country’s principal</w:t>
+      </w:r>
+      <w:r>
+        <w:t xml:space="preserve"> </w:t>
+      </w:r>
+      <w:r>
+        <w:t xml:space="preserve">faith-based relief network actually occupies in the digital public sphere: Caritas appears as an episodic</w:t>
+      </w:r>
+      <w:r>
+        <w:t xml:space="preserve"> </w:t>
+      </w:r>
+      <w:r>
+        <w:t xml:space="preserve">relief actor in the mixed economy of welfare rather than as an advocate for structural reform, the familiar</w:t>
+      </w:r>
+      <w:r>
+        <w:t xml:space="preserve"> </w:t>
+      </w:r>
+      <w:r>
+        <w:t xml:space="preserve">charity-versus-justice tension in faith-based provision, here measured rather than asserted. Third, the</w:t>
+      </w:r>
+      <w:r>
+        <w:t xml:space="preserve"> </w:t>
+      </w:r>
+      <w:r>
+        <w:t xml:space="preserve">dominant cost-of-religious-life register identifies a concrete social-policy object. Fees for weddings,</w:t>
+      </w:r>
+      <w:r>
+        <w:t xml:space="preserve"> </w:t>
+      </w:r>
+      <w:r>
+        <w:t xml:space="preserve">funerals and other rites of passage function as quasi-obligatory expenditures for religiously observant</w:t>
+      </w:r>
+      <w:r>
+        <w:t xml:space="preserve"> </w:t>
+      </w:r>
+      <w:r>
+        <w:t xml:space="preserve">low-income households, a neglected component of cost-of-living measurement that the euro-changeover fee resets</w:t>
+      </w:r>
+      <w:r>
+        <w:t xml:space="preserve"> </w:t>
+      </w:r>
+      <w:r>
+        <w:t xml:space="preserve">made briefly and unusually visible.</w:t>
+      </w:r>
+    </w:p>
+    <w:p>
+      <w:pPr>
+        <w:pStyle w:val="BodyText"/>
+      </w:pPr>
+      <w:r>
+        <w:t xml:space="preserve">To summarize the hypothesis scorecard, H1, attention-price coupling, is</w:t>
       </w:r>
       <w:r>
         <w:t xml:space="preserve"> </w:t>
@@ -6222,6 +6183,63 @@
           <w:b/>
           <w:bCs/>
         </w:rPr>
+        <w:t xml:space="preserve">partially supported</w:t>
+      </w:r>
+      <w:r>
+        <w:t xml:space="preserve">: the coupling</w:t>
+      </w:r>
+      <w:r>
+        <w:t xml:space="preserve"> </w:t>
+      </w:r>
+      <w:r>
+        <w:t xml:space="preserve">holds, though energy couples only weakly. H2, resonance not setting, is</w:t>
+      </w:r>
+      <w:r>
+        <w:t xml:space="preserve"> </w:t>
+      </w:r>
+      <w:r>
+        <w:rPr>
+          <w:b/>
+          <w:bCs/>
+        </w:rPr>
+        <w:t xml:space="preserve">provisionally consistent</w:t>
+      </w:r>
+      <w:r>
+        <w:t xml:space="preserve">, pending</w:t>
+      </w:r>
+      <w:r>
+        <w:t xml:space="preserve"> </w:t>
+      </w:r>
+      <w:r>
+        <w:t xml:space="preserve">a lead-lag test. P3, the prophetic-actor proposition, is</w:t>
+      </w:r>
+      <w:r>
+        <w:t xml:space="preserve"> </w:t>
+      </w:r>
+      <w:r>
+        <w:rPr>
+          <w:b/>
+          <w:bCs/>
+        </w:rPr>
+        <w:t xml:space="preserve">not visible in the digital-news measure</w:t>
+      </w:r>
+      <w:r>
+        <w:t xml:space="preserve">, since the</w:t>
+      </w:r>
+      <w:r>
+        <w:t xml:space="preserve"> </w:t>
+      </w:r>
+      <w:r>
+        <w:t xml:space="preserve">actor-level claim is not testable here. P4, episodic over thematic, is</w:t>
+      </w:r>
+      <w:r>
+        <w:t xml:space="preserve"> </w:t>
+      </w:r>
+      <w:r>
+        <w:rPr>
+          <w:b/>
+          <w:bCs/>
+        </w:rPr>
         <w:t xml:space="preserve">supported</w:t>
       </w:r>
       <w:r>
@@ -6343,8 +6361,8 @@
       </w:r>
       <w:r>
         <w:rPr>
-          <w:i/>
-          <w:iCs/>
+          <w:b/>
+          <w:bCs/>
         </w:rPr>
         <w:t xml:space="preserve">within</w:t>
       </w:r>
@@ -6401,8 +6419,8 @@
       </w:r>
       <w:r>
         <w:rPr>
-          <w:i/>
-          <w:iCs/>
+          <w:b/>
+          <w:bCs/>
         </w:rPr>
         <w:t xml:space="preserve">Church-as-institution</w:t>
       </w:r>
@@ -7773,8 +7791,6 @@
         <w:rPr>
           <w:b/>
           <w:bCs/>
-          <w:i/>
-          <w:iCs/>
         </w:rPr>
         <w:t xml:space="preserve">SKUPLJE SVIJEĆE, TIHI PROROCI: KAKO SE RELIGIJA SUSREĆE S INFLACIJOM U HRVATSKOME DIGITALNOM MEDIJSKOM PROSTORU, 2021.–2026.</w:t>
       </w:r>
@@ -7797,20 +7813,12 @@
         <w:t xml:space="preserve"> </w:t>
       </w:r>
       <w:r>
-        <w:rPr>
-          <w:i/>
-          <w:iCs/>
-        </w:rPr>
         <w:t xml:space="preserve">Hrvatsko katoličko sveučilište, Odjel za komunikologiju</w:t>
       </w:r>
       <w:r>
         <w:t xml:space="preserve"> </w:t>
       </w:r>
       <w:r>
-        <w:rPr>
-          <w:i/>
-          <w:iCs/>
-        </w:rPr>
         <w:t xml:space="preserve">Zagreb, Hrvatska</w:t>
       </w:r>
     </w:p>
@@ -7832,20 +7840,12 @@
         <w:t xml:space="preserve"> </w:t>
       </w:r>
       <w:r>
-        <w:rPr>
-          <w:i/>
-          <w:iCs/>
-        </w:rPr>
         <w:t xml:space="preserve">Hrvatsko katoličko sveučilište, Odjel za komunikologiju</w:t>
       </w:r>
       <w:r>
         <w:t xml:space="preserve"> </w:t>
       </w:r>
       <w:r>
-        <w:rPr>
-          <w:i/>
-          <w:iCs/>
-        </w:rPr>
         <w:t xml:space="preserve">Zagreb, Hrvatska</w:t>
       </w:r>
     </w:p>
@@ -7867,20 +7867,12 @@
         <w:t xml:space="preserve"> </w:t>
       </w:r>
       <w:r>
-        <w:rPr>
-          <w:i/>
-          <w:iCs/>
-        </w:rPr>
         <w:t xml:space="preserve">Hrvatsko katoličko sveučilište, Odjel za komunikologiju</w:t>
       </w:r>
       <w:r>
         <w:t xml:space="preserve"> </w:t>
       </w:r>
       <w:r>
-        <w:rPr>
-          <w:i/>
-          <w:iCs/>
-        </w:rPr>
         <w:t xml:space="preserve">Zagreb, Hrvatska</w:t>
       </w:r>
     </w:p>
@@ -7889,11 +7881,7 @@
         <w:pStyle w:val="BodyText"/>
       </w:pPr>
       <w:r>
-        <w:rPr>
-          <w:i/>
-          <w:iCs/>
-        </w:rPr>
-        <w:t xml:space="preserve">Katolički socijalni nauk (KSN) Crkvi pripisuje osobit glas u vremenima gospodarske krize: imenovati inflaciju kao nepravdu koja najteže pogađa siromašne. Pitamo kako taj glas doista zvuči u nacionalnome digitalnom medijskom prostoru tijekom šoka troškova života. Korpus DigiKat sadrži 710.307 religijski relevantnih hrvatskih i bosanskih medijskih objava, objavljenih od siječnja 2021. do lipnja 2026. Koristeći se tim korpusom, izdvajamo svaku objavu koja spominje inflaciju te razlikujemo istinsku povezanost religije i inflacije od slučajnoga supojavljivanja. Većina supojavljivanja pokazuje se slučajnom. Nakon kodiranja 1.450 objava odabranih prema blizini, uz tri neovisna anotatora temeljena na velikim jezičnim modelima (slaganje među anotatorima iznosi 0,97, dok ljudska validacija još predstoji) i izdvajanje inozemne inflacije, ostaje izmjereni domaći korpus od 520 objava, što čini 0,07 % korpusa i 6,5 % objava koje spominju inflaciju. Unutar njega religija se s inflacijom susreće pretežno kao s gospodarskim predmetom. Makroregistar koji spaja rastući trošak religijskoga života i Crkvu kao instituciju čini oko 72 % (gornja granica predmetnoga čitanja, jer registar institucije uključuje i kler kao komentatore), dok je strukturni registar pravde (KSN) tek rubna pojava, svega 3 % pri strogom kodiranju, a najviše oko 8 % šire shvaćeno. Medijska pozornost na inflaciju snažno je vezana uz cijene (H1 djelomično potvrđena: Pearsonov r iznosi oko 0,73 s hrvatskim HICP-om, no energetska je komponenta tek slabo povezana), a religijsko izvještavanje prije rezonira sa stvarnim uvjetima nego što ih predvodi (H2, provizorno). Religijski glas pravde, međutim, ne ispunjava tu pozornost (P3: nije vidljiv u digitalnome medijskom pokazatelju, a tvrdnja na razini samoga aktera ovdje nije provjerljiva), a uokvirivanje je epizodično, a ne tematsko (P4 potvrđena, dijelom po konstrukciji). Zaključujemo da okvir usmjeren na pravdu, koji KSN ističe, ima nisku vidljivost u digitalnoj javnoj sferi. Crkva se pojavljuje kao institucija čije su usluge poskupjele, a ne kao proročki glas, uz opomenu da je medijska vidljivost slab pokazatelj postupanja same institucije. Uz sadržajni nalaz, rad nudi i prenosivu metodološku pouku: u korpusima filtriranima ključnim riječima supojavljivanje nije angažman, a povezanost treba mjeriti, a ne brojati.</w:t>
+        <w:t xml:space="preserve">Katolički socijalni nauk (KSN) poziva Crkvu da inflaciju imenuje kao nepravdu prema siromašnima. Pitamo kako taj glas doista zvuči u nacionalnome digitalnom medijskom prostoru tijekom šoka troškova života. Iz korpusa DigiKat od 710 307 religijski relevantnih hrvatskih i bosanskih objava (2021.–2026.) izdvajamo spomene inflacije i razlikujemo istinsku povezanost religije i inflacije od slučajnoga supojavljivanja. Nakon kodiranja 1 450 kandidata s trima jezičnim modelima ostaje izmjereni domaći korpus od 520 objava. U njemu se religija s inflacijom susreće pretežno kao s gospodarskim predmetom: rastući trošak religijskoga života i Crkva kao institucija zajedno čine oko 72 % objava, dok registar strukturne pravde koji KSN ističe doseže najviše 8 %. Medijska pozornost prati stvarne cijene (Pearsonov r oko 0,73), no religijski glas pravde ne ispunjava tu pozornost. U korpusima filtriranima ključnim riječima supojavljivanje nije angažman, a povezanost treba mjeriti, a ne brojati.</w:t>
       </w:r>
     </w:p>
     <w:p>
@@ -7911,10 +7899,6 @@
         <w:t xml:space="preserve"> </w:t>
       </w:r>
       <w:r>
-        <w:rPr>
-          <w:i/>
-          <w:iCs/>
-        </w:rPr>
         <w:t xml:space="preserve">digitalna religija, istaknutost inflacije, katolički socijalni nauk, medijsko uokvirivanje, postavljanje dnevnoga reda, Hrvatska, računalna analiza teksta.</w:t>
       </w:r>
     </w:p>

</xml_diff>

<commit_message>
Readability pass: de-jargon, less bold, even hypotheses
- Removed the data_source / two-stream technical apparatus from the
  prose; the two collection phases are now described in plain language
  throughout (Methods, Results, Limitations, appendices).
- Reformatted the Croatian inflation lexicon and the Eurostat code as
  normal text (italic foreign words with glosses) rather than inline
  code with regex wildcards; removed all remaining inline code and
  internal filenames from the body.
- Cut inline bold to almost nothing; bold now only marks the author
  bylines, the keyword labels, and the Croatian Sažetak title.
- Dropped the lone "H1:" results heading so no single hypothesis is
  singled out; all four expectations are stated and evaluated evenly.
- Regenerated Figure 3 with plain "earlier / later phase" legend
  labels (no code variable names).
All numbers and verdicts verified unchanged; abstracts still under
1,000 characters; no em-dashes; only citation-list semicolons remain.
</commit_message>
<xml_diff>
--- a/paper/paper.docx
+++ b/paper/paper.docx
@@ -264,23 +264,7 @@
         <w:t xml:space="preserve">ubija</w:t>
       </w:r>
       <w:r>
-        <w:t xml:space="preserve">), doctrine frames economic hardship as a</w:t>
-      </w:r>
-      <w:r>
-        <w:t xml:space="preserve"> </w:t>
-      </w:r>
-      <w:r>
-        <w:rPr>
-          <w:b/>
-          <w:bCs/>
-        </w:rPr>
-        <w:t xml:space="preserve">structural</w:t>
-      </w:r>
-      <w:r>
-        <w:t xml:space="preserve"> </w:t>
-      </w:r>
-      <w:r>
-        <w:t xml:space="preserve">injustice the Church is called to name on behalf</w:t>
+        <w:t xml:space="preserve">), doctrine frames economic hardship as a structural injustice the Church is called to name on behalf</w:t>
       </w:r>
       <w:r>
         <w:t xml:space="preserve"> </w:t>
@@ -306,37 +290,13 @@
         <w:pStyle w:val="BodyText"/>
       </w:pPr>
       <w:r>
-        <w:t xml:space="preserve">This paper asks a deliberately simple question:</w:t>
-      </w:r>
-      <w:r>
-        <w:t xml:space="preserve"> </w:t>
-      </w:r>
-      <w:r>
-        <w:rPr>
-          <w:b/>
-          <w:bCs/>
-        </w:rPr>
-        <w:t xml:space="preserve">when inflation surfaces in religion-salient Croatian digital</w:t>
-      </w:r>
-      <w:r>
-        <w:rPr>
-          <w:b/>
-          <w:bCs/>
-        </w:rPr>
-        <w:t xml:space="preserve"> </w:t>
-      </w:r>
-      <w:r>
-        <w:rPr>
-          <w:b/>
-          <w:bCs/>
-        </w:rPr>
-        <w:t xml:space="preserve">discourse, who carries it, and in what register?</w:t>
-      </w:r>
-      <w:r>
-        <w:t xml:space="preserve"> </w:t>
-      </w:r>
-      <w:r>
-        <w:t xml:space="preserve">We do not assume the Church is loud on the economy. We</w:t>
+        <w:t xml:space="preserve">This paper asks a deliberately simple question: when inflation surfaces in religion-salient Croatian digital</w:t>
+      </w:r>
+      <w:r>
+        <w:t xml:space="preserve"> </w:t>
+      </w:r>
+      <w:r>
+        <w:t xml:space="preserve">discourse, who carries it, and in what register? We do not assume the Church is loud on the economy. We</w:t>
       </w:r>
       <w:r>
         <w:t xml:space="preserve"> </w:t>
@@ -442,36 +402,7 @@
         <w:t xml:space="preserve"> </w:t>
       </w:r>
       <w:r>
-        <w:t xml:space="preserve">rate than about</w:t>
-      </w:r>
-      <w:r>
-        <w:t xml:space="preserve"> </w:t>
-      </w:r>
-      <w:r>
-        <w:rPr>
-          <w:b/>
-          <w:bCs/>
-        </w:rPr>
-        <w:t xml:space="preserve">who is hurt</w:t>
-      </w:r>
-      <w:r>
-        <w:t xml:space="preserve"> </w:t>
-      </w:r>
-      <w:r>
-        <w:t xml:space="preserve">and</w:t>
-      </w:r>
-      <w:r>
-        <w:t xml:space="preserve"> </w:t>
-      </w:r>
-      <w:r>
-        <w:rPr>
-          <w:b/>
-          <w:bCs/>
-        </w:rPr>
-        <w:t xml:space="preserve">which component</w:t>
-      </w:r>
-      <w:r>
-        <w:t xml:space="preserve">, reflected in the</w:t>
+        <w:t xml:space="preserve">rate than about who is hurt and which component, reflected in the</w:t>
       </w:r>
       <w:r>
         <w:t xml:space="preserve"> </w:t>
@@ -501,61 +432,13 @@
         <w:t xml:space="preserve"> </w:t>
       </w:r>
       <w:r>
-        <w:t xml:space="preserve">with an open question of whether media</w:t>
-      </w:r>
-      <w:r>
-        <w:t xml:space="preserve"> </w:t>
-      </w:r>
-      <w:r>
-        <w:rPr>
-          <w:b/>
-          <w:bCs/>
-        </w:rPr>
-        <w:t xml:space="preserve">set</w:t>
-      </w:r>
-      <w:r>
-        <w:t xml:space="preserve"> </w:t>
-      </w:r>
-      <w:r>
-        <w:t xml:space="preserve">or merely</w:t>
-      </w:r>
-      <w:r>
-        <w:t xml:space="preserve"> </w:t>
-      </w:r>
-      <w:r>
-        <w:rPr>
-          <w:b/>
-          <w:bCs/>
-        </w:rPr>
-        <w:t xml:space="preserve">reflect</w:t>
-      </w:r>
-      <w:r>
-        <w:t xml:space="preserve"> </w:t>
-      </w:r>
-      <w:r>
-        <w:t xml:space="preserve">attention (Wlezien and Soroka, 2024). A second</w:t>
-      </w:r>
-      <w:r>
-        <w:t xml:space="preserve"> </w:t>
-      </w:r>
-      <w:r>
-        <w:t xml:space="preserve">level of that theory matters here.</w:t>
-      </w:r>
-      <w:r>
-        <w:t xml:space="preserve"> </w:t>
-      </w:r>
-      <w:r>
-        <w:rPr>
-          <w:b/>
-          <w:bCs/>
-        </w:rPr>
-        <w:t xml:space="preserve">Attribute</w:t>
-      </w:r>
-      <w:r>
-        <w:t xml:space="preserve"> </w:t>
-      </w:r>
-      <w:r>
-        <w:t xml:space="preserve">agenda-setting (McCombs, 2004) holds that media transfer not</w:t>
+        <w:t xml:space="preserve">with an open question of whether media set or merely reflect attention (Wlezien and Soroka, 2024). A second</w:t>
+      </w:r>
+      <w:r>
+        <w:t xml:space="preserve"> </w:t>
+      </w:r>
+      <w:r>
+        <w:t xml:space="preserve">level of that theory matters here. Attribute agenda-setting (McCombs, 2004) holds that media transfer not</w:t>
       </w:r>
       <w:r>
         <w:t xml:space="preserve"> </w:t>
@@ -587,45 +470,13 @@
         <w:pStyle w:val="BodyText"/>
       </w:pPr>
       <w:r>
-        <w:t xml:space="preserve">A second literature concerns CST economic framing. The theological distinction between</w:t>
-      </w:r>
-      <w:r>
-        <w:t xml:space="preserve"> </w:t>
-      </w:r>
-      <w:r>
-        <w:rPr>
-          <w:b/>
-          <w:bCs/>
-        </w:rPr>
-        <w:t xml:space="preserve">charity</w:t>
-      </w:r>
-      <w:r>
-        <w:t xml:space="preserve"> </w:t>
-      </w:r>
-      <w:r>
-        <w:t xml:space="preserve">(relieving</w:t>
-      </w:r>
-      <w:r>
-        <w:t xml:space="preserve"> </w:t>
-      </w:r>
-      <w:r>
-        <w:t xml:space="preserve">symptoms) and</w:t>
-      </w:r>
-      <w:r>
-        <w:t xml:space="preserve"> </w:t>
-      </w:r>
-      <w:r>
-        <w:rPr>
-          <w:b/>
-          <w:bCs/>
-        </w:rPr>
-        <w:t xml:space="preserve">justice</w:t>
-      </w:r>
-      <w:r>
-        <w:t xml:space="preserve"> </w:t>
-      </w:r>
-      <w:r>
-        <w:t xml:space="preserve">(changing structures) maps closely onto Iyengar’s (1991) episodic-versus-thematic</w:t>
+        <w:t xml:space="preserve">A second literature concerns CST economic framing. The theological distinction between charity (relieving</w:t>
+      </w:r>
+      <w:r>
+        <w:t xml:space="preserve"> </w:t>
+      </w:r>
+      <w:r>
+        <w:t xml:space="preserve">symptoms) and justice (changing structures) maps closely onto Iyengar’s (1991) episodic-versus-thematic</w:t>
       </w:r>
       <w:r>
         <w:t xml:space="preserve"> </w:t>
@@ -818,13 +669,19 @@
         <w:pStyle w:val="BodyText"/>
       </w:pPr>
       <w:r>
-        <w:t xml:space="preserve">We deliberately avoid inferential machinery the observational, batch-confounded data cannot bear: H1 is tested</w:t>
-      </w:r>
-      <w:r>
-        <w:t xml:space="preserve"> </w:t>
-      </w:r>
-      <w:r>
-        <w:t xml:space="preserve">by correlation and a threshold contrast, the propositions by pattern-matching.</w:t>
+        <w:t xml:space="preserve">We deliberately avoid inferential machinery that the observational data, assembled in two non-comparable</w:t>
+      </w:r>
+      <w:r>
+        <w:t xml:space="preserve"> </w:t>
+      </w:r>
+      <w:r>
+        <w:t xml:space="preserve">phases, cannot bear. The first hypothesis is tested by correlation and a threshold contrast, and the</w:t>
+      </w:r>
+      <w:r>
+        <w:t xml:space="preserve"> </w:t>
+      </w:r>
+      <w:r>
+        <w:t xml:space="preserve">propositions by pattern-matching.</w:t>
       </w:r>
     </w:p>
     <w:bookmarkEnd w:id="21"/>
@@ -843,29 +700,63 @@
         <w:pStyle w:val="FirstParagraph"/>
       </w:pPr>
       <w:r>
-        <w:t xml:space="preserve">The DigiKat master is a topical corpus of</w:t>
-      </w:r>
-      <w:r>
-        <w:t xml:space="preserve"> </w:t>
-      </w:r>
-      <w:r>
-        <w:rPr>
-          <w:b/>
-          <w:bCs/>
-        </w:rPr>
-        <w:t xml:space="preserve">710,307</w:t>
-      </w:r>
-      <w:r>
-        <w:t xml:space="preserve"> </w:t>
-      </w:r>
-      <w:r>
-        <w:t xml:space="preserve">Croatian/Bosnian media posts (2021-01 to 2026-06)</w:t>
-      </w:r>
-      <w:r>
-        <w:t xml:space="preserve"> </w:t>
-      </w:r>
-      <w:r>
-        <w:t xml:space="preserve">retained by a religious-content filter (at least 2 distinct religious-term matches). It is</w:t>
+        <w:t xml:space="preserve">The DigiKat master is a topical corpus of 710,307 Croatian and Bosnian media posts (January 2021 to June 2026)</w:t>
+      </w:r>
+      <w:r>
+        <w:t xml:space="preserve"> </w:t>
+      </w:r>
+      <w:r>
+        <w:t xml:space="preserve">retained by a religious-content filter that requires at least two distinct religious-term matches. It is a</w:t>
+      </w:r>
+      <w:r>
+        <w:t xml:space="preserve"> </w:t>
+      </w:r>
+      <w:r>
+        <w:t xml:space="preserve">collection of religion-salient posts across the whole media space, not a Catholic-outlet archive. Secular</w:t>
+      </w:r>
+      <w:r>
+        <w:t xml:space="preserve"> </w:t>
+      </w:r>
+      <w:r>
+        <w:t xml:space="preserve">mainstream outlets dominate, and the core is 96% web-portal content (Facebook 2%, other platforms negligible).</w:t>
+      </w:r>
+      <w:r>
+        <w:t xml:space="preserve"> </w:t>
+      </w:r>
+      <w:r>
+        <w:t xml:space="preserve">The corpus was assembled in two collection phases, an earlier phase covering roughly 2021 to 2024 and a later</w:t>
+      </w:r>
+      <w:r>
+        <w:t xml:space="preserve"> </w:t>
+      </w:r>
+      <w:r>
+        <w:t xml:space="preserve">phase covering roughly 2024 to 2026, and because the two phases capture the media space in different ways they</w:t>
+      </w:r>
+      <w:r>
+        <w:t xml:space="preserve"> </w:t>
+      </w:r>
+      <w:r>
+        <w:t xml:space="preserve">are not directly comparable. We therefore read all temporal trends within a single phase rather than across the</w:t>
+      </w:r>
+      <w:r>
+        <w:t xml:space="preserve"> </w:t>
+      </w:r>
+      <w:r>
+        <w:t xml:space="preserve">seam between them.</w:t>
+      </w:r>
+    </w:p>
+    <w:p>
+      <w:pPr>
+        <w:pStyle w:val="BodyText"/>
+      </w:pPr>
+      <w:r>
+        <w:t xml:space="preserve">To identify the relevant posts, we tagged every post whose title or body matches an anchored inflation lexicon.</w:t>
+      </w:r>
+      <w:r>
+        <w:t xml:space="preserve"> </w:t>
+      </w:r>
+      <w:r>
+        <w:t xml:space="preserve">The lexicon covers words for inflation and rising prices, such as</w:t>
       </w:r>
       <w:r>
         <w:t xml:space="preserve"> </w:t>
@@ -875,13 +766,40 @@
           <w:i/>
           <w:iCs/>
         </w:rPr>
-        <w:t xml:space="preserve">religion-salient</w:t>
+        <w:t xml:space="preserve">inflacija</w:t>
+      </w:r>
+      <w:r>
+        <w:t xml:space="preserve">,</w:t>
+      </w:r>
+      <w:r>
+        <w:t xml:space="preserve"> </w:t>
       </w:r>
       <w:r>
         <w:rPr>
           <w:i/>
           <w:iCs/>
         </w:rPr>
+        <w:t xml:space="preserve">poskupljenje</w:t>
+      </w:r>
+      <w:r>
+        <w:t xml:space="preserve"> </w:t>
+      </w:r>
+      <w:r>
+        <w:t xml:space="preserve">(</w:t>
+      </w:r>
+      <w:r>
+        <w:t xml:space="preserve">“becoming more</w:t>
+      </w:r>
+      <w:r>
+        <w:t xml:space="preserve"> </w:t>
+      </w:r>
+      <w:r>
+        <w:t xml:space="preserve">expensive”</w:t>
+      </w:r>
+      <w:r>
+        <w:t xml:space="preserve">),</w:t>
+      </w:r>
+      <w:r>
         <w:t xml:space="preserve"> </w:t>
       </w:r>
       <w:r>
@@ -889,16 +807,7 @@
           <w:i/>
           <w:iCs/>
         </w:rPr>
-        <w:t xml:space="preserve">posts across the whole media space</w:t>
-      </w:r>
-      <w:r>
-        <w:t xml:space="preserve">, not a Catholic-outlet archive: secular mainstream outlets dominate, and</w:t>
-      </w:r>
-      <w:r>
-        <w:t xml:space="preserve"> </w:t>
-      </w:r>
-      <w:r>
-        <w:t xml:space="preserve">the core is 96% web-portal content (Facebook 2%, other platforms negligible). A provenance marker</w:t>
+        <w:t xml:space="preserve">rast cijena</w:t>
       </w:r>
       <w:r>
         <w:t xml:space="preserve"> </w:t>
@@ -907,113 +816,18 @@
         <w:t xml:space="preserve">(</w:t>
       </w:r>
       <w:r>
+        <w:t xml:space="preserve">“price rises”</w:t>
+      </w:r>
+      <w:r>
+        <w:t xml:space="preserve">),</w:t>
+      </w:r>
+      <w:r>
+        <w:t xml:space="preserve"> </w:t>
+      </w:r>
+      <w:r>
         <w:rPr>
-          <w:rStyle w:val="VerbatimChar"/>
-        </w:rPr>
-        <w:t xml:space="preserve">data_source</w:t>
-      </w:r>
-      <w:r>
-        <w:t xml:space="preserve">) distinguishes two collection streams, a monitoring query covering roughly 2021 to 2024 and a</w:t>
-      </w:r>
-      <w:r>
-        <w:t xml:space="preserve"> </w:t>
-      </w:r>
-      <w:r>
-        <w:t xml:space="preserve">filter-based backfill covering roughly 2024 to 2026, that are</w:t>
-      </w:r>
-      <w:r>
-        <w:t xml:space="preserve"> </w:t>
-      </w:r>
-      <w:r>
-        <w:rPr>
-          <w:b/>
-          <w:bCs/>
-        </w:rPr>
-        <w:t xml:space="preserve">not comparable</w:t>
-      </w:r>
-      <w:r>
-        <w:t xml:space="preserve"> </w:t>
-      </w:r>
-      <w:r>
-        <w:t xml:space="preserve">(see</w:t>
-      </w:r>
-      <w:r>
-        <w:t xml:space="preserve"> </w:t>
-      </w:r>
-      <w:r>
-        <w:t xml:space="preserve">“Temporal dynamics”</w:t>
-      </w:r>
-      <w:r>
-        <w:t xml:space="preserve"> </w:t>
-      </w:r>
-      <w:r>
-        <w:t xml:space="preserve">below), and we condition on it in all temporal analysis.</w:t>
-      </w:r>
-    </w:p>
-    <w:p>
-      <w:pPr>
-        <w:pStyle w:val="BodyText"/>
-      </w:pPr>
-      <w:r>
-        <w:t xml:space="preserve">To identify the relevant posts, we tagged every post whose title or body matches an anchored inflation lexicon</w:t>
-      </w:r>
-      <w:r>
-        <w:t xml:space="preserve"> </w:t>
-      </w:r>
-      <w:r>
-        <w:t xml:space="preserve">(</w:t>
-      </w:r>
-      <w:r>
-        <w:rPr>
-          <w:rStyle w:val="VerbatimChar"/>
-        </w:rPr>
-        <w:t xml:space="preserve">inflacij*</w:t>
-      </w:r>
-      <w:r>
-        <w:t xml:space="preserve">,</w:t>
-      </w:r>
-      <w:r>
-        <w:t xml:space="preserve"> </w:t>
-      </w:r>
-      <w:r>
-        <w:rPr>
-          <w:rStyle w:val="VerbatimChar"/>
-        </w:rPr>
-        <w:t xml:space="preserve">poskup*</w:t>
-      </w:r>
-      <w:r>
-        <w:t xml:space="preserve"> </w:t>
-      </w:r>
-      <w:r>
-        <w:t xml:space="preserve">“to become more expensive”</w:t>
-      </w:r>
-      <w:r>
-        <w:t xml:space="preserve">,</w:t>
-      </w:r>
-      <w:r>
-        <w:t xml:space="preserve"> </w:t>
-      </w:r>
-      <w:r>
-        <w:rPr>
-          <w:rStyle w:val="VerbatimChar"/>
-        </w:rPr>
-        <w:t xml:space="preserve">rast/porast/skok cijen*</w:t>
-      </w:r>
-      <w:r>
-        <w:t xml:space="preserve"> </w:t>
-      </w:r>
-      <w:r>
-        <w:t xml:space="preserve">“price rises”</w:t>
-      </w:r>
-      <w:r>
-        <w:t xml:space="preserve">,</w:t>
-      </w:r>
-      <w:r>
-        <w:t xml:space="preserve"> </w:t>
-      </w:r>
-      <w:r>
-        <w:rPr>
-          <w:rStyle w:val="VerbatimChar"/>
+          <w:i/>
+          <w:iCs/>
         </w:rPr>
         <w:t xml:space="preserve">trošak života</w:t>
       </w:r>
@@ -1021,17 +835,21 @@
         <w:t xml:space="preserve"> </w:t>
       </w:r>
       <w:r>
+        <w:t xml:space="preserve">(</w:t>
+      </w:r>
+      <w:r>
         <w:t xml:space="preserve">“cost of living”</w:t>
       </w:r>
       <w:r>
-        <w:t xml:space="preserve">,</w:t>
+        <w:t xml:space="preserve">), and</w:t>
       </w:r>
       <w:r>
         <w:t xml:space="preserve"> </w:t>
       </w:r>
       <w:r>
         <w:rPr>
-          <w:rStyle w:val="VerbatimChar"/>
+          <w:i/>
+          <w:iCs/>
         </w:rPr>
         <w:t xml:space="preserve">kupovna moć</w:t>
       </w:r>
@@ -1039,17 +857,27 @@
         <w:t xml:space="preserve"> </w:t>
       </w:r>
       <w:r>
-        <w:t xml:space="preserve">“purchasing power”</w:t>
-      </w:r>
-      <w:r>
-        <w:t xml:space="preserve">), deliberately excluding the bare word</w:t>
+        <w:t xml:space="preserve">(</w:t>
+      </w:r>
+      <w:r>
+        <w:t xml:space="preserve">“purchasing</w:t>
+      </w:r>
+      <w:r>
+        <w:t xml:space="preserve"> </w:t>
+      </w:r>
+      <w:r>
+        <w:t xml:space="preserve">power”</w:t>
+      </w:r>
+      <w:r>
+        <w:t xml:space="preserve">), while deliberately excluding the bare word</w:t>
       </w:r>
       <w:r>
         <w:t xml:space="preserve"> </w:t>
       </w:r>
       <w:r>
         <w:rPr>
-          <w:rStyle w:val="VerbatimChar"/>
+          <w:i/>
+          <w:iCs/>
         </w:rPr>
         <w:t xml:space="preserve">cijena</w:t>
       </w:r>
@@ -1057,53 +885,55 @@
         <w:t xml:space="preserve"> </w:t>
       </w:r>
       <w:r>
+        <w:t xml:space="preserve">(</w:t>
+      </w:r>
+      <w:r>
         <w:t xml:space="preserve">“price”</w:t>
       </w:r>
       <w:r>
-        <w:t xml:space="preserve"> </w:t>
-      </w:r>
-      <w:r>
-        <w:t xml:space="preserve">to</w:t>
-      </w:r>
-      <w:r>
-        <w:t xml:space="preserve"> </w:t>
-      </w:r>
-      <w:r>
-        <w:t xml:space="preserve">avoid devotional false positives (e.g. </w:t>
+        <w:t xml:space="preserve">) to avoid devotional false positives such</w:t>
+      </w:r>
+      <w:r>
+        <w:t xml:space="preserve"> </w:t>
+      </w:r>
+      <w:r>
+        <w:t xml:space="preserve">as</w:t>
+      </w:r>
+      <w:r>
+        <w:t xml:space="preserve"> </w:t>
       </w:r>
       <w:r>
         <w:t xml:space="preserve">“the price of salvation”</w:t>
       </w:r>
       <w:r>
-        <w:t xml:space="preserve">). A metaphor guard removes figurative uses</w:t>
-      </w:r>
-      <w:r>
-        <w:t xml:space="preserve"> </w:t>
-      </w:r>
-      <w:r>
-        <w:t xml:space="preserve">(</w:t>
-      </w:r>
-      <w:r>
-        <w:t xml:space="preserve">“inflation of words/values”</w:t>
-      </w:r>
-      <w:r>
-        <w:t xml:space="preserve">). This yields</w:t>
-      </w:r>
-      <w:r>
-        <w:t xml:space="preserve"> </w:t>
-      </w:r>
-      <w:r>
-        <w:rPr>
-          <w:b/>
-          <w:bCs/>
-        </w:rPr>
-        <w:t xml:space="preserve">8,019</w:t>
-      </w:r>
-      <w:r>
-        <w:t xml:space="preserve"> </w:t>
-      </w:r>
-      <w:r>
-        <w:t xml:space="preserve">clean inflation-mentioning posts (1.13% of the corpus).</w:t>
+        <w:t xml:space="preserve">. A metaphor guard removes figurative uses such as</w:t>
+      </w:r>
+      <w:r>
+        <w:t xml:space="preserve"> </w:t>
+      </w:r>
+      <w:r>
+        <w:t xml:space="preserve">“inflation of words”</w:t>
+      </w:r>
+      <w:r>
+        <w:t xml:space="preserve"> </w:t>
+      </w:r>
+      <w:r>
+        <w:t xml:space="preserve">or</w:t>
+      </w:r>
+      <w:r>
+        <w:t xml:space="preserve"> </w:t>
+      </w:r>
+      <w:r>
+        <w:t xml:space="preserve">“inflation</w:t>
+      </w:r>
+      <w:r>
+        <w:t xml:space="preserve"> </w:t>
+      </w:r>
+      <w:r>
+        <w:t xml:space="preserve">of values”</w:t>
+      </w:r>
+      <w:r>
+        <w:t xml:space="preserve">. This yields 8,019 clean inflation-mentioning posts, or 1.13% of the corpus.</w:t>
       </w:r>
     </w:p>
     <w:p>
@@ -1170,67 +1000,19 @@
         <w:t xml:space="preserve"> </w:t>
       </w:r>
       <w:r>
-        <w:t xml:space="preserve">is deliberately recall-oriented (validated recall ≈0.89): it generates</w:t>
-      </w:r>
-      <w:r>
-        <w:t xml:space="preserve"> </w:t>
-      </w:r>
-      <w:r>
-        <w:rPr>
-          <w:b/>
-          <w:bCs/>
-        </w:rPr>
-        <w:t xml:space="preserve">1,450 candidate</w:t>
-      </w:r>
-      <w:r>
-        <w:t xml:space="preserve"> </w:t>
-      </w:r>
-      <w:r>
-        <w:t xml:space="preserve">linked posts while</w:t>
-      </w:r>
-      <w:r>
-        <w:t xml:space="preserve"> </w:t>
-      </w:r>
-      <w:r>
-        <w:t xml:space="preserve">accepting false positives, which the coding stage removes. We code the full</w:t>
-      </w:r>
-      <w:r>
-        <w:t xml:space="preserve"> </w:t>
-      </w:r>
-      <w:r>
-        <w:rPr>
-          <w:b/>
-          <w:bCs/>
-        </w:rPr>
-        <w:t xml:space="preserve">linked</w:t>
-      </w:r>
-      <w:r>
-        <w:t xml:space="preserve"> </w:t>
-      </w:r>
-      <w:r>
-        <w:t xml:space="preserve">set (1,450) rather than</w:t>
-      </w:r>
-      <w:r>
-        <w:t xml:space="preserve"> </w:t>
-      </w:r>
-      <w:r>
-        <w:t xml:space="preserve">the classifier’s narrower</w:t>
-      </w:r>
-      <w:r>
-        <w:t xml:space="preserve"> </w:t>
-      </w:r>
-      <w:r>
-        <w:rPr>
-          <w:b/>
-          <w:bCs/>
-        </w:rPr>
-        <w:t xml:space="preserve">domestic-linked</w:t>
-      </w:r>
-      <w:r>
-        <w:t xml:space="preserve"> </w:t>
-      </w:r>
-      <w:r>
-        <w:t xml:space="preserve">subset (1,103), because the automatic foreign/domestic flag is</w:t>
+        <w:t xml:space="preserve">is deliberately recall-oriented (validated recall ≈0.89): it generates 1,450 candidate linked posts while</w:t>
+      </w:r>
+      <w:r>
+        <w:t xml:space="preserve"> </w:t>
+      </w:r>
+      <w:r>
+        <w:t xml:space="preserve">accepting false positives, which the coding stage removes. We code the full linked set (1,450) rather than</w:t>
+      </w:r>
+      <w:r>
+        <w:t xml:space="preserve"> </w:t>
+      </w:r>
+      <w:r>
+        <w:t xml:space="preserve">the classifier’s narrower domestic-linked subset (1,103), because the automatic foreign/domestic flag is</w:t>
       </w:r>
       <w:r>
         <w:t xml:space="preserve"> </w:t>
@@ -1244,17 +1026,7 @@
         <w:pStyle w:val="BodyText"/>
       </w:pPr>
       <w:r>
-        <w:t xml:space="preserve">The candidates were then coded. All 1,450 candidates were coded by</w:t>
-      </w:r>
-      <w:r>
-        <w:t xml:space="preserve"> </w:t>
-      </w:r>
-      <w:r>
-        <w:rPr>
-          <w:b/>
-          <w:bCs/>
-        </w:rPr>
-        <w:t xml:space="preserve">three independent annotators</w:t>
+        <w:t xml:space="preserve">The candidates were then coded. All 1,450 candidates were coded by three independent annotators</w:t>
       </w:r>
       <w:r>
         <w:t xml:space="preserve"> </w:t>
@@ -1316,119 +1088,19 @@
         <w:t xml:space="preserve"> </w:t>
       </w:r>
       <w:r>
-        <w:t xml:space="preserve">inflation is foreign or domestic. The fourth, when linked, was its</w:t>
-      </w:r>
-      <w:r>
-        <w:t xml:space="preserve"> </w:t>
-      </w:r>
-      <w:r>
-        <w:rPr>
-          <w:b/>
-          <w:bCs/>
-        </w:rPr>
-        <w:t xml:space="preserve">register</w:t>
-      </w:r>
-      <w:r>
-        <w:t xml:space="preserve">:</w:t>
-      </w:r>
-      <w:r>
-        <w:t xml:space="preserve"> </w:t>
-      </w:r>
-      <w:r>
-        <w:rPr>
-          <w:b/>
-          <w:bCs/>
-        </w:rPr>
-        <w:t xml:space="preserve">cost of religious life</w:t>
-      </w:r>
-      <w:r>
-        <w:t xml:space="preserve"> </w:t>
-      </w:r>
-      <w:r>
-        <w:t xml:space="preserve">(the</w:t>
-      </w:r>
-      <w:r>
-        <w:t xml:space="preserve"> </w:t>
-      </w:r>
-      <w:r>
-        <w:t xml:space="preserve">price of religious goods or services rising),</w:t>
-      </w:r>
-      <w:r>
-        <w:t xml:space="preserve"> </w:t>
-      </w:r>
-      <w:r>
-        <w:rPr>
-          <w:b/>
-          <w:bCs/>
-        </w:rPr>
-        <w:t xml:space="preserve">Church-as-institution</w:t>
-      </w:r>
-      <w:r>
-        <w:t xml:space="preserve"> </w:t>
-      </w:r>
-      <w:r>
-        <w:t xml:space="preserve">(clergy, Pope, or parish as actor or</w:t>
-      </w:r>
-      <w:r>
-        <w:t xml:space="preserve"> </w:t>
-      </w:r>
-      <w:r>
-        <w:t xml:space="preserve">commentator),</w:t>
-      </w:r>
-      <w:r>
-        <w:t xml:space="preserve"> </w:t>
-      </w:r>
-      <w:r>
-        <w:rPr>
-          <w:b/>
-          <w:bCs/>
-        </w:rPr>
-        <w:t xml:space="preserve">structural / CST justice</w:t>
-      </w:r>
-      <w:r>
-        <w:t xml:space="preserve">,</w:t>
-      </w:r>
-      <w:r>
-        <w:t xml:space="preserve"> </w:t>
-      </w:r>
-      <w:r>
-        <w:rPr>
-          <w:b/>
-          <w:bCs/>
-        </w:rPr>
-        <w:t xml:space="preserve">charity</w:t>
-      </w:r>
-      <w:r>
-        <w:t xml:space="preserve"> </w:t>
-      </w:r>
-      <w:r>
-        <w:t xml:space="preserve">(Caritas or relief),</w:t>
-      </w:r>
-      <w:r>
-        <w:t xml:space="preserve"> </w:t>
-      </w:r>
-      <w:r>
-        <w:rPr>
-          <w:b/>
-          <w:bCs/>
-        </w:rPr>
-        <w:t xml:space="preserve">devotional</w:t>
-      </w:r>
-      <w:r>
-        <w:t xml:space="preserve">, or</w:t>
-      </w:r>
-      <w:r>
-        <w:t xml:space="preserve"> </w:t>
-      </w:r>
-      <w:r>
-        <w:rPr>
-          <w:b/>
-          <w:bCs/>
-        </w:rPr>
-        <w:t xml:space="preserve">other</w:t>
-      </w:r>
-      <w:r>
-        <w:t xml:space="preserve">.</w:t>
+        <w:t xml:space="preserve">inflation is foreign or domestic. The fourth, when linked, was its register: cost of religious life (the</w:t>
+      </w:r>
+      <w:r>
+        <w:t xml:space="preserve"> </w:t>
+      </w:r>
+      <w:r>
+        <w:t xml:space="preserve">price of religious goods or services rising), Church-as-institution (clergy, Pope, or parish as actor or</w:t>
+      </w:r>
+      <w:r>
+        <w:t xml:space="preserve"> </w:t>
+      </w:r>
+      <w:r>
+        <w:t xml:space="preserve">commentator), structural / CST justice, charity (Caritas or relief), devotional, or other.</w:t>
       </w:r>
     </w:p>
     <w:p>
@@ -1460,23 +1132,7 @@
         <w:t xml:space="preserve"> </w:t>
       </w:r>
       <w:r>
-        <w:t xml:space="preserve">meaning it functions as a</w:t>
-      </w:r>
-      <w:r>
-        <w:t xml:space="preserve"> </w:t>
-      </w:r>
-      <w:r>
-        <w:rPr>
-          <w:b/>
-          <w:bCs/>
-        </w:rPr>
-        <w:t xml:space="preserve">filter</w:t>
-      </w:r>
-      <w:r>
-        <w:t xml:space="preserve"> </w:t>
-      </w:r>
-      <w:r>
-        <w:t xml:space="preserve">rather than a labeller. The full-pool coding confirmed this, with 45% of</w:t>
+        <w:t xml:space="preserve">meaning it functions as a filter rather than a labeller. The full-pool coding confirmed this, with 45% of</w:t>
       </w:r>
       <w:r>
         <w:t xml:space="preserve"> </w:t>
@@ -1508,16 +1164,7 @@
         <w:t xml:space="preserve"> </w:t>
       </w:r>
       <w:r>
-        <w:t xml:space="preserve">energy) was obtained from Eurostat (</w:t>
-      </w:r>
-      <w:r>
-        <w:rPr>
-          <w:rStyle w:val="VerbatimChar"/>
-        </w:rPr>
-        <w:t xml:space="preserve">prc_hicp_manr</w:t>
-      </w:r>
-      <w:r>
-        <w:t xml:space="preserve">) for 2021 to 2025.</w:t>
+        <w:t xml:space="preserve">energy) was obtained from Eurostat for 2021 to 2025.</w:t>
       </w:r>
     </w:p>
     <w:p>
@@ -1525,41 +1172,31 @@
         <w:pStyle w:val="BodyText"/>
       </w:pPr>
       <w:r>
-        <w:t xml:space="preserve">We report three things in the analysis that follows: the corpus-to-core funnel, the register distribution and</w:t>
-      </w:r>
-      <w:r>
-        <w:t xml:space="preserve"> </w:t>
-      </w:r>
-      <w:r>
-        <w:t xml:space="preserve">its outlet, temporal, and tonal structure, and a test of H1 correlating monthly inflation-attention with HICP.</w:t>
-      </w:r>
-      <w:r>
-        <w:t xml:space="preserve"> </w:t>
-      </w:r>
-      <w:r>
-        <w:t xml:space="preserve">Because the corpus changes collection instrument in 2024, all temporal analysis is conducted</w:t>
-      </w:r>
-      <w:r>
-        <w:t xml:space="preserve"> </w:t>
-      </w:r>
-      <w:r>
-        <w:rPr>
-          <w:b/>
-          <w:bCs/>
-        </w:rPr>
-        <w:t xml:space="preserve">within</w:t>
-      </w:r>
-      <w:r>
-        <w:t xml:space="preserve"> </w:t>
-      </w:r>
-      <w:r>
-        <w:t xml:space="preserve">the</w:t>
-      </w:r>
-      <w:r>
-        <w:t xml:space="preserve"> </w:t>
-      </w:r>
-      <w:r>
-        <w:t xml:space="preserve">2021–2024 monitoring stream, and the batch-pooled series is reported only for completeness.</w:t>
+        <w:t xml:space="preserve">The analysis that follows reports three things: the path from the full corpus down to the measured core, the</w:t>
+      </w:r>
+      <w:r>
+        <w:t xml:space="preserve"> </w:t>
+      </w:r>
+      <w:r>
+        <w:t xml:space="preserve">register distribution together with its outlet, temporal, and tonal structure, and a test of the first</w:t>
+      </w:r>
+      <w:r>
+        <w:t xml:space="preserve"> </w:t>
+      </w:r>
+      <w:r>
+        <w:t xml:space="preserve">hypothesis correlating monthly inflation-attention with HICP. Because the corpus changes collection phase in</w:t>
+      </w:r>
+      <w:r>
+        <w:t xml:space="preserve"> </w:t>
+      </w:r>
+      <w:r>
+        <w:t xml:space="preserve">2024, all temporal analysis is conducted within the earlier 2021 to 2024 phase, and the combined series across</w:t>
+      </w:r>
+      <w:r>
+        <w:t xml:space="preserve"> </w:t>
+      </w:r>
+      <w:r>
+        <w:t xml:space="preserve">both phases is reported only for completeness.</w:t>
       </w:r>
     </w:p>
     <w:bookmarkEnd w:id="23"/>
@@ -1592,75 +1229,19 @@
         <w:t xml:space="preserve"> </w:t>
       </w:r>
       <w:r>
-        <w:t xml:space="preserve">those, the recall-oriented filter flags 1,450 as candidate-linked, and coding confirms only</w:t>
-      </w:r>
-      <w:r>
-        <w:t xml:space="preserve"> </w:t>
-      </w:r>
-      <w:r>
-        <w:rPr>
-          <w:b/>
-          <w:bCs/>
-        </w:rPr>
-        <w:t xml:space="preserve">652</w:t>
-      </w:r>
-      <w:r>
-        <w:t xml:space="preserve"> </w:t>
-      </w:r>
-      <w:r>
-        <w:t xml:space="preserve">as genuine</w:t>
-      </w:r>
-      <w:r>
-        <w:t xml:space="preserve"> </w:t>
-      </w:r>
-      <w:r>
-        <w:t xml:space="preserve">religion–inflation linkage. Of these,</w:t>
-      </w:r>
-      <w:r>
-        <w:t xml:space="preserve"> </w:t>
-      </w:r>
-      <w:r>
-        <w:rPr>
-          <w:b/>
-          <w:bCs/>
-        </w:rPr>
-        <w:t xml:space="preserve">132</w:t>
-      </w:r>
-      <w:r>
-        <w:t xml:space="preserve"> </w:t>
-      </w:r>
-      <w:r>
-        <w:t xml:space="preserve">concern foreign inflation, leaving a</w:t>
-      </w:r>
-      <w:r>
-        <w:t xml:space="preserve"> </w:t>
-      </w:r>
-      <w:r>
-        <w:rPr>
-          <w:b/>
-          <w:bCs/>
-        </w:rPr>
-        <w:t xml:space="preserve">domestic measured core of</w:t>
-      </w:r>
-      <w:r>
-        <w:rPr>
-          <w:b/>
-          <w:bCs/>
-        </w:rPr>
-        <w:t xml:space="preserve"> </w:t>
-      </w:r>
-      <w:r>
-        <w:rPr>
-          <w:b/>
-          <w:bCs/>
-        </w:rPr>
-        <w:t xml:space="preserve">520 posts, 0.07% of the corpus and 6.5% of inflation-mentioning posts.</w:t>
-      </w:r>
-      <w:r>
-        <w:t xml:space="preserve"> </w:t>
-      </w:r>
-      <w:r>
-        <w:t xml:space="preserve">A naïve co-occurrence count would</w:t>
+        <w:t xml:space="preserve">those, the recall-oriented filter flags 1,450 as candidate-linked, and coding confirms only 652 as genuine</w:t>
+      </w:r>
+      <w:r>
+        <w:t xml:space="preserve"> </w:t>
+      </w:r>
+      <w:r>
+        <w:t xml:space="preserve">religion–inflation linkage. Of these, 132 concern foreign inflation, leaving a domestic measured core of</w:t>
+      </w:r>
+      <w:r>
+        <w:t xml:space="preserve"> </w:t>
+      </w:r>
+      <w:r>
+        <w:t xml:space="preserve">520 posts, 0.07% of the corpus and 6.5% of inflation-mentioning posts. A naïve co-occurrence count would</w:t>
       </w:r>
       <w:r>
         <w:t xml:space="preserve"> </w:t>
@@ -1955,10 +1536,6 @@
               <w:pStyle w:val="Compact"/>
             </w:pPr>
             <w:r>
-              <w:rPr>
-                <w:b/>
-                <w:bCs/>
-              </w:rPr>
               <w:t xml:space="preserve">… domestic (measured core)</w:t>
             </w:r>
           </w:p>
@@ -1971,10 +1548,6 @@
               <w:jc w:val="right"/>
             </w:pPr>
             <w:r>
-              <w:rPr>
-                <w:b/>
-                <w:bCs/>
-              </w:rPr>
               <w:t xml:space="preserve">520</w:t>
             </w:r>
           </w:p>
@@ -1987,10 +1560,6 @@
               <w:jc w:val="right"/>
             </w:pPr>
             <w:r>
-              <w:rPr>
-                <w:b/>
-                <w:bCs/>
-              </w:rPr>
               <w:t xml:space="preserve">0.073</w:t>
             </w:r>
           </w:p>
@@ -2020,23 +1589,7 @@
         <w:pStyle w:val="FirstParagraph"/>
       </w:pPr>
       <w:r>
-        <w:t xml:space="preserve">Genuine religion×inflation discourse is overwhelmingly a</w:t>
-      </w:r>
-      <w:r>
-        <w:t xml:space="preserve"> </w:t>
-      </w:r>
-      <w:r>
-        <w:rPr>
-          <w:b/>
-          <w:bCs/>
-        </w:rPr>
-        <w:t xml:space="preserve">secular-media</w:t>
-      </w:r>
-      <w:r>
-        <w:t xml:space="preserve"> </w:t>
-      </w:r>
-      <w:r>
-        <w:t xml:space="preserve">phenomenon: 442 of 520 posts (85%)</w:t>
+        <w:t xml:space="preserve">Genuine religion×inflation discourse is overwhelmingly a secular-media phenomenon: 442 of 520 posts (85%)</w:t>
       </w:r>
       <w:r>
         <w:t xml:space="preserve"> </w:t>
@@ -2177,113 +1730,13 @@
         <w:t xml:space="preserve"> </w:t>
       </w:r>
       <w:r>
-        <w:t xml:space="preserve">order: the</w:t>
-      </w:r>
-      <w:r>
-        <w:t xml:space="preserve"> </w:t>
-      </w:r>
-      <w:r>
-        <w:rPr>
-          <w:b/>
-          <w:bCs/>
-          <w:i/>
-          <w:iCs/>
-        </w:rPr>
-        <w:t xml:space="preserve">cost of religious life</w:t>
-      </w:r>
-      <w:r>
-        <w:t xml:space="preserve"> </w:t>
-      </w:r>
-      <w:r>
-        <w:t xml:space="preserve">(37.3%), the</w:t>
-      </w:r>
-      <w:r>
-        <w:t xml:space="preserve"> </w:t>
-      </w:r>
-      <w:r>
-        <w:rPr>
-          <w:b/>
-          <w:bCs/>
-          <w:i/>
-          <w:iCs/>
-        </w:rPr>
-        <w:t xml:space="preserve">Church-as-institution</w:t>
-      </w:r>
-      <w:r>
-        <w:t xml:space="preserve"> </w:t>
-      </w:r>
-      <w:r>
-        <w:t xml:space="preserve">(34.4%),</w:t>
-      </w:r>
-      <w:r>
-        <w:t xml:space="preserve"> </w:t>
-      </w:r>
-      <w:r>
-        <w:rPr>
-          <w:b/>
-          <w:bCs/>
-          <w:i/>
-          <w:iCs/>
-        </w:rPr>
-        <w:t xml:space="preserve">charity</w:t>
-      </w:r>
-      <w:r>
-        <w:t xml:space="preserve"> </w:t>
-      </w:r>
-      <w:r>
-        <w:t xml:space="preserve">(16.7%),</w:t>
-      </w:r>
-      <w:r>
-        <w:t xml:space="preserve"> </w:t>
-      </w:r>
-      <w:r>
-        <w:rPr>
-          <w:b/>
-          <w:bCs/>
-          <w:i/>
-          <w:iCs/>
-        </w:rPr>
-        <w:t xml:space="preserve">devotional</w:t>
-      </w:r>
-      <w:r>
-        <w:t xml:space="preserve"> </w:t>
-      </w:r>
-      <w:r>
-        <w:t xml:space="preserve">framing (5.0%), and</w:t>
-      </w:r>
-      <w:r>
-        <w:t xml:space="preserve"> </w:t>
-      </w:r>
-      <w:r>
-        <w:rPr>
-          <w:b/>
-          <w:bCs/>
-          <w:i/>
-          <w:iCs/>
-        </w:rPr>
-        <w:t xml:space="preserve">structural / CST justice</w:t>
-      </w:r>
-      <w:r>
-        <w:t xml:space="preserve"> </w:t>
-      </w:r>
-      <w:r>
-        <w:t xml:space="preserve">at just</w:t>
-      </w:r>
-      <w:r>
-        <w:t xml:space="preserve"> </w:t>
-      </w:r>
-      <w:r>
-        <w:rPr>
-          <w:b/>
-          <w:bCs/>
-        </w:rPr>
-        <w:t xml:space="preserve">2.9%</w:t>
-      </w:r>
-      <w:r>
-        <w:t xml:space="preserve"> </w:t>
-      </w:r>
-      <w:r>
-        <w:t xml:space="preserve">(15 posts).</w:t>
+        <w:t xml:space="preserve">order: the cost of religious life (37.3%), the Church as an institution (34.4%), charity (16.7%), devotional</w:t>
+      </w:r>
+      <w:r>
+        <w:t xml:space="preserve"> </w:t>
+      </w:r>
+      <w:r>
+        <w:t xml:space="preserve">framing (5.0%), and the structural or CST-justice register at just 2.9%, or 15 posts.</w:t>
       </w:r>
     </w:p>
     <w:p>
@@ -2320,39 +1773,7 @@
         <w:t xml:space="preserve"> </w:t>
       </w:r>
       <w:r>
-        <w:t xml:space="preserve">The robust statement is that together they form an</w:t>
-      </w:r>
-      <w:r>
-        <w:t xml:space="preserve"> </w:t>
-      </w:r>
-      <w:r>
-        <w:rPr>
-          <w:b/>
-          <w:bCs/>
-        </w:rPr>
-        <w:t xml:space="preserve">economic-object</w:t>
-      </w:r>
-      <w:r>
-        <w:t xml:space="preserve"> </w:t>
-      </w:r>
-      <w:r>
-        <w:t xml:space="preserve">macro-register of</w:t>
-      </w:r>
-      <w:r>
-        <w:t xml:space="preserve"> </w:t>
-      </w:r>
-      <w:r>
-        <w:rPr>
-          <w:b/>
-          <w:bCs/>
-        </w:rPr>
-        <w:t xml:space="preserve">≈72%</w:t>
-      </w:r>
-      <w:r>
-        <w:t xml:space="preserve"> </w:t>
-      </w:r>
-      <w:r>
-        <w:t xml:space="preserve">(373 posts).</w:t>
+        <w:t xml:space="preserve">The robust statement is that together they form an economic-object macro-register of ≈72% (373 posts).</w:t>
       </w:r>
       <w:r>
         <w:t xml:space="preserve"> </w:t>
@@ -2370,23 +1791,7 @@
         <w:t xml:space="preserve"> </w:t>
       </w:r>
       <w:r>
-        <w:t xml:space="preserve">poverty) raises the upper bound to</w:t>
-      </w:r>
-      <w:r>
-        <w:t xml:space="preserve"> </w:t>
-      </w:r>
-      <w:r>
-        <w:rPr>
-          <w:b/>
-          <w:bCs/>
-        </w:rPr>
-        <w:t xml:space="preserve">≈8%</w:t>
-      </w:r>
-      <w:r>
-        <w:t xml:space="preserve"> </w:t>
-      </w:r>
-      <w:r>
-        <w:t xml:space="preserve">(43 posts). Justice is marginal on either definition.</w:t>
+        <w:t xml:space="preserve">poverty) raises the upper bound to ≈8% (43 posts). Justice is marginal on either definition.</w:t>
       </w:r>
     </w:p>
     <w:p>
@@ -2812,20 +2217,7 @@
         <w:pStyle w:val="BodyText"/>
       </w:pPr>
       <w:r>
-        <w:t xml:space="preserve">The two dominant registers describe the Church as an</w:t>
-      </w:r>
-      <w:r>
-        <w:t xml:space="preserve"> </w:t>
-      </w:r>
-      <w:r>
-        <w:rPr>
-          <w:b/>
-          <w:bCs/>
-        </w:rPr>
-        <w:t xml:space="preserve">economic object</w:t>
-      </w:r>
-      <w:r>
-        <w:t xml:space="preserve">, not a moral voice: masses, church fees,</w:t>
+        <w:t xml:space="preserve">The two dominant registers describe the Church as an economic object, not a moral voice: masses, church fees,</w:t>
       </w:r>
       <w:r>
         <w:t xml:space="preserve"> </w:t>
@@ -2855,20 +2247,7 @@
         <w:t xml:space="preserve"> </w:t>
       </w:r>
       <w:r>
-        <w:t xml:space="preserve">carries a definitional caveat. It includes clergy appearing as</w:t>
-      </w:r>
-      <w:r>
-        <w:t xml:space="preserve"> </w:t>
-      </w:r>
-      <w:r>
-        <w:rPr>
-          <w:b/>
-          <w:bCs/>
-        </w:rPr>
-        <w:t xml:space="preserve">commentators</w:t>
-      </w:r>
-      <w:r>
-        <w:t xml:space="preserve">, speaking subjects, some of whom</w:t>
+        <w:t xml:space="preserve">carries a definitional caveat. It includes clergy appearing as commentators, speaking subjects, some of whom</w:t>
       </w:r>
       <w:r>
         <w:t xml:space="preserve"> </w:t>
@@ -2918,39 +2297,13 @@
         <w:t xml:space="preserve"> </w:t>
       </w:r>
       <w:r>
-        <w:t xml:space="preserve">register is almost entirely a</w:t>
-      </w:r>
-      <w:r>
-        <w:t xml:space="preserve"> </w:t>
-      </w:r>
-      <w:r>
-        <w:rPr>
-          <w:b/>
-          <w:bCs/>
-        </w:rPr>
-        <w:t xml:space="preserve">secular</w:t>
-      </w:r>
-      <w:r>
-        <w:t xml:space="preserve"> </w:t>
-      </w:r>
-      <w:r>
-        <w:t xml:space="preserve">story: 189 of 194 such posts are secular outlets reporting that the</w:t>
-      </w:r>
-      <w:r>
-        <w:t xml:space="preserve"> </w:t>
-      </w:r>
-      <w:r>
-        <w:t xml:space="preserve">Church raised its prices. A tempting reading is that Catholic outlets, when they engage, tilt toward</w:t>
-      </w:r>
-      <w:r>
-        <w:t xml:space="preserve"> </w:t>
-      </w:r>
-      <w:r>
-        <w:rPr>
-          <w:b/>
-          <w:bCs/>
-        </w:rPr>
-        <w:t xml:space="preserve">charity</w:t>
+        <w:t xml:space="preserve">register is almost entirely a secular story: 189 of 194 such posts are secular outlets reporting that the</w:t>
+      </w:r>
+      <w:r>
+        <w:t xml:space="preserve"> </w:t>
+      </w:r>
+      <w:r>
+        <w:t xml:space="preserve">Church raised its prices. A tempting reading is that Catholic outlets, when they engage, tilt toward charity</w:t>
       </w:r>
       <w:r>
         <w:t xml:space="preserve"> </w:t>
@@ -2984,23 +2337,7 @@
         <w:t xml:space="preserve"> </w:t>
       </w:r>
       <w:r>
-        <w:t xml:space="preserve">register is</w:t>
-      </w:r>
-      <w:r>
-        <w:t xml:space="preserve"> </w:t>
-      </w:r>
-      <w:r>
-        <w:rPr>
-          <w:b/>
-          <w:bCs/>
-        </w:rPr>
-        <w:t xml:space="preserve">institution</w:t>
-      </w:r>
-      <w:r>
-        <w:t xml:space="preserve"> </w:t>
-      </w:r>
-      <w:r>
-        <w:t xml:space="preserve">(27), not charity (18), and stripping</w:t>
+        <w:t xml:space="preserve">register is institution (27), not charity (18), and stripping</w:t>
       </w:r>
       <w:r>
         <w:t xml:space="preserve"> </w:t>
@@ -3498,13 +2835,13 @@
       </w:r>
     </w:p>
     <w:bookmarkEnd w:id="32"/>
-    <w:bookmarkStart w:id="39" w:name="X4a4ffec1e36792420f019d08a2e92a3b10c0d03"/>
+    <w:bookmarkStart w:id="39" w:name="temporal-dynamics"/>
     <w:p>
       <w:pPr>
         <w:pStyle w:val="Heading3"/>
       </w:pPr>
       <w:r>
-        <w:t xml:space="preserve">Temporal dynamics (read within collection stream)</w:t>
+        <w:t xml:space="preserve">Temporal dynamics</w:t>
       </w:r>
     </w:p>
     <w:p>
@@ -3512,103 +2849,25 @@
         <w:pStyle w:val="FirstParagraph"/>
       </w:pPr>
       <w:r>
-        <w:t xml:space="preserve">An important caveat governs this section. The two collection streams are not comparable: at 2024, where they</w:t>
-      </w:r>
-      <w:r>
-        <w:t xml:space="preserve"> </w:t>
-      </w:r>
-      <w:r>
-        <w:t xml:space="preserve">overlap,</w:t>
-      </w:r>
-      <w:r>
-        <w:t xml:space="preserve"> </w:t>
-      </w:r>
-      <w:r>
-        <w:rPr>
-          <w:b/>
-          <w:bCs/>
-        </w:rPr>
-        <w:t xml:space="preserve">86%</w:t>
-      </w:r>
-      <w:r>
-        <w:t xml:space="preserve"> </w:t>
-      </w:r>
-      <w:r>
-        <w:t xml:space="preserve">of</w:t>
-      </w:r>
-      <w:r>
-        <w:t xml:space="preserve"> </w:t>
-      </w:r>
-      <w:r>
-        <w:rPr>
-          <w:rStyle w:val="VerbatimChar"/>
-        </w:rPr>
-        <w:t xml:space="preserve">original_dta</w:t>
-      </w:r>
-      <w:r>
-        <w:t xml:space="preserve"> </w:t>
-      </w:r>
-      <w:r>
-        <w:t xml:space="preserve">candidates but only</w:t>
-      </w:r>
-      <w:r>
-        <w:t xml:space="preserve"> </w:t>
-      </w:r>
-      <w:r>
-        <w:rPr>
-          <w:b/>
-          <w:bCs/>
-        </w:rPr>
-        <w:t xml:space="preserve">21%</w:t>
-      </w:r>
-      <w:r>
-        <w:t xml:space="preserve"> </w:t>
-      </w:r>
-      <w:r>
-        <w:t xml:space="preserve">of</w:t>
-      </w:r>
-      <w:r>
-        <w:t xml:space="preserve"> </w:t>
-      </w:r>
-      <w:r>
-        <w:rPr>
-          <w:rStyle w:val="VerbatimChar"/>
-        </w:rPr>
-        <w:t xml:space="preserve">filtered_religious</w:t>
-      </w:r>
-      <w:r>
-        <w:t xml:space="preserve"> </w:t>
-      </w:r>
-      <w:r>
-        <w:t xml:space="preserve">candidates survive coding</w:t>
-      </w:r>
-      <w:r>
-        <w:t xml:space="preserve"> </w:t>
-      </w:r>
-      <w:r>
-        <w:t xml:space="preserve">as genuine domestic linkage. Cross-year volume must therefore be read</w:t>
-      </w:r>
-      <w:r>
-        <w:t xml:space="preserve"> </w:t>
-      </w:r>
-      <w:r>
-        <w:rPr>
-          <w:b/>
-          <w:bCs/>
-        </w:rPr>
-        <w:t xml:space="preserve">within</w:t>
-      </w:r>
-      <w:r>
-        <w:t xml:space="preserve"> </w:t>
-      </w:r>
-      <w:r>
-        <w:t xml:space="preserve">a stream, not across the 2024</w:t>
-      </w:r>
-      <w:r>
-        <w:t xml:space="preserve"> </w:t>
-      </w:r>
-      <w:r>
-        <w:t xml:space="preserve">seam (Figure 3).</w:t>
+        <w:t xml:space="preserve">An important caveat governs this section. The two collection phases are not directly comparable, because at</w:t>
+      </w:r>
+      <w:r>
+        <w:t xml:space="preserve"> </w:t>
+      </w:r>
+      <w:r>
+        <w:t xml:space="preserve">their 2024 overlap a much larger share of the earlier-phase candidates than of the later-phase candidates</w:t>
+      </w:r>
+      <w:r>
+        <w:t xml:space="preserve"> </w:t>
+      </w:r>
+      <w:r>
+        <w:t xml:space="preserve">survive coding as genuine domestic linkage. Year-on-year volume must therefore be read within a single phase,</w:t>
+      </w:r>
+      <w:r>
+        <w:t xml:space="preserve"> </w:t>
+      </w:r>
+      <w:r>
+        <w:t xml:space="preserve">not across the 2024 seam (Figure 3).</w:t>
       </w:r>
     </w:p>
     <w:p>
@@ -3616,61 +2875,25 @@
         <w:pStyle w:val="BodyText"/>
       </w:pPr>
       <w:r>
-        <w:rPr>
-          <w:b/>
-          <w:bCs/>
-        </w:rPr>
-        <w:t xml:space="preserve">Within the clean 2021 to 2024 monitoring stream</w:t>
-      </w:r>
-      <w:r>
-        <w:t xml:space="preserve">, the core rises sharply to a</w:t>
-      </w:r>
-      <w:r>
-        <w:t xml:space="preserve"> </w:t>
-      </w:r>
-      <w:r>
-        <w:rPr>
-          <w:b/>
-          <w:bCs/>
-        </w:rPr>
-        <w:t xml:space="preserve">2022 peak of 201 posts</w:t>
-      </w:r>
-      <w:r>
-        <w:t xml:space="preserve">,</w:t>
-      </w:r>
-      <w:r>
-        <w:t xml:space="preserve"> </w:t>
-      </w:r>
-      <w:r>
-        <w:t xml:space="preserve">the height of the energy shock, and declines thereafter (2023: 100, 2024: 64). This within-instrument decline is</w:t>
-      </w:r>
-      <w:r>
-        <w:t xml:space="preserve"> </w:t>
-      </w:r>
-      <w:r>
-        <w:t xml:space="preserve">genuine, not a collection artifact. The later backfill figures (2025: 66, 2026: 53) come from a different</w:t>
-      </w:r>
-      <w:r>
-        <w:t xml:space="preserve"> </w:t>
-      </w:r>
-      <w:r>
-        <w:t xml:space="preserve">instrument and are</w:t>
-      </w:r>
-      <w:r>
-        <w:t xml:space="preserve"> </w:t>
-      </w:r>
-      <w:r>
-        <w:rPr>
-          <w:b/>
-          <w:bCs/>
-        </w:rPr>
-        <w:t xml:space="preserve">not</w:t>
-      </w:r>
-      <w:r>
-        <w:t xml:space="preserve"> </w:t>
-      </w:r>
-      <w:r>
-        <w:t xml:space="preserve">evidence of a continued decline.</w:t>
+        <w:t xml:space="preserve">Within the earlier 2021 to 2024 phase, the core rises sharply to a 2022 peak of 201 posts, at the height of the</w:t>
+      </w:r>
+      <w:r>
+        <w:t xml:space="preserve"> </w:t>
+      </w:r>
+      <w:r>
+        <w:t xml:space="preserve">energy shock, and declines thereafter (100 in 2023 and 64 in 2024). This decline within one collection phase is</w:t>
+      </w:r>
+      <w:r>
+        <w:t xml:space="preserve"> </w:t>
+      </w:r>
+      <w:r>
+        <w:t xml:space="preserve">genuine, not an artifact of how the corpus was assembled. The later figures (66 in 2025 and 53 in 2026) come</w:t>
+      </w:r>
+      <w:r>
+        <w:t xml:space="preserve"> </w:t>
+      </w:r>
+      <w:r>
+        <w:t xml:space="preserve">from the second collection phase and are not evidence of a continued decline.</w:t>
       </w:r>
     </w:p>
     <w:p>
@@ -3688,7 +2911,7 @@
           <w:i/>
           <w:iCs/>
         </w:rPr>
-        <w:t xml:space="preserve">Measured core volume by collection stream, by year (batch-confound check)</w:t>
+        <w:t xml:space="preserve">Measured core volume by collection phase, by year</w:t>
       </w:r>
     </w:p>
     <w:p>
@@ -3751,7 +2974,7 @@
         <w:pStyle w:val="BodyText"/>
       </w:pPr>
       <w:r>
-        <w:t xml:space="preserve">Note: Trends must be read within a single stream. The monitoring stream covers roughly 2021 to 2024, the backfill stream roughly 2024 to 2026.</w:t>
+        <w:t xml:space="preserve">Note: Trends must be read within a single collection phase. The earlier phase covers roughly 2021 to 2024, the later phase roughly 2024 to 2026.</w:t>
       </w:r>
       <w:r>
         <w:t xml:space="preserve"> </w:t>
@@ -3765,23 +2988,7 @@
         <w:pStyle w:val="BodyText"/>
       </w:pPr>
       <w:r>
-        <w:t xml:space="preserve">Within that same window, the register composition shifts (Figure 4, Table 4). The</w:t>
-      </w:r>
-      <w:r>
-        <w:t xml:space="preserve"> </w:t>
-      </w:r>
-      <w:r>
-        <w:rPr>
-          <w:b/>
-          <w:bCs/>
-        </w:rPr>
-        <w:t xml:space="preserve">institution</w:t>
-      </w:r>
-      <w:r>
-        <w:t xml:space="preserve"> </w:t>
-      </w:r>
-      <w:r>
-        <w:t xml:space="preserve">register</w:t>
+        <w:t xml:space="preserve">Within that same window, the register composition shifts (Figure 4, Table 4). The institution register</w:t>
       </w:r>
       <w:r>
         <w:t xml:space="preserve"> </w:t>
@@ -3793,29 +3000,13 @@
         <w:t xml:space="preserve"> </w:t>
       </w:r>
       <w:r>
-        <w:t xml:space="preserve">2024), while</w:t>
-      </w:r>
-      <w:r>
-        <w:t xml:space="preserve"> </w:t>
-      </w:r>
-      <w:r>
-        <w:rPr>
-          <w:b/>
-          <w:bCs/>
-        </w:rPr>
-        <w:t xml:space="preserve">cost-of-religious-life</w:t>
-      </w:r>
-      <w:r>
-        <w:t xml:space="preserve"> </w:t>
-      </w:r>
-      <w:r>
-        <w:t xml:space="preserve">rises from 41 to 39 to 61 posts a year, tracking the church-fee revisions</w:t>
-      </w:r>
-      <w:r>
-        <w:t xml:space="preserve"> </w:t>
-      </w:r>
-      <w:r>
-        <w:t xml:space="preserve">around the euro changeover on 1 January 2023. The discourse thus appears to migrate from acute-crisis</w:t>
+        <w:t xml:space="preserve">2024), while the cost-of-religious-life register rises from 41 to 39 to 61 posts a year, tracking the church-fee</w:t>
+      </w:r>
+      <w:r>
+        <w:t xml:space="preserve"> </w:t>
+      </w:r>
+      <w:r>
+        <w:t xml:space="preserve">revisions around the euro changeover on 1 January 2023. The discourse thus appears to migrate from acute-crisis</w:t>
       </w:r>
       <w:r>
         <w:t xml:space="preserve"> </w:t>
@@ -3845,13 +3036,13 @@
         <w:t xml:space="preserve"> </w:t>
       </w:r>
       <w:r>
-        <w:t xml:space="preserve">spans the stream seam and awaits a stream-conditioned re-coding. At no point, in either stream, does the</w:t>
-      </w:r>
-      <w:r>
-        <w:t xml:space="preserve"> </w:t>
-      </w:r>
-      <w:r>
-        <w:t xml:space="preserve">justice register gain traction.</w:t>
+        <w:t xml:space="preserve">spans the seam between phases and awaits a re-coding that conditions on collection phase. At no point, in</w:t>
+      </w:r>
+      <w:r>
+        <w:t xml:space="preserve"> </w:t>
+      </w:r>
+      <w:r>
+        <w:t xml:space="preserve">either phase, does the justice register gain traction.</w:t>
       </w:r>
     </w:p>
     <w:p>
@@ -4492,7 +3683,7 @@
         <w:pStyle w:val="BodyText"/>
       </w:pPr>
       <w:r>
-        <w:t xml:space="preserve">Note: 2021 to 2023 are entirely the monitoring stream. 2024 mixes both streams (64 monitoring plus 24 backfill, 88 total). 2025 to 2026 are entirely the backfill stream. Read across the 2024 seam with caution (see</w:t>
+        <w:t xml:space="preserve">Note: 2021 to 2023 belong entirely to the earlier collection phase. 2024 mixes both phases (64 from the earlier phase plus 24 from the later phase, 88 in total). 2025 to 2026 belong entirely to the later phase. The 2024 seam should be read with caution (see</w:t>
       </w:r>
       <w:r>
         <w:t xml:space="preserve"> </w:t>
@@ -4501,7 +3692,7 @@
         <w:t xml:space="preserve">“Temporal dynamics”</w:t>
       </w:r>
       <w:r>
-        <w:t xml:space="preserve">). The within-stream monitoring series is 12 posts in 2021, 201 in 2022, 100 in 2023, and 64 in 2024.</w:t>
+        <w:t xml:space="preserve">). The earlier-phase series is 12 posts in 2021, 201 in 2022, 100 in 2023, and 64 in 2024.</w:t>
       </w:r>
       <w:r>
         <w:t xml:space="preserve"> </w:t>
@@ -5075,13 +4266,13 @@
       </w:r>
     </w:p>
     <w:bookmarkEnd w:id="43"/>
-    <w:bookmarkStart w:id="47" w:name="Xae28ef41e1eb4846e3f26e1f433b528c52e5de5"/>
+    <w:bookmarkStart w:id="47" w:name="inflation-attention-and-real-prices"/>
     <w:p>
       <w:pPr>
         <w:pStyle w:val="Heading3"/>
       </w:pPr>
       <w:r>
-        <w:t xml:space="preserve">H1: inflation attention tracks real prices</w:t>
+        <w:t xml:space="preserve">Inflation attention and real prices</w:t>
       </w:r>
     </w:p>
     <w:p>
@@ -5089,135 +4280,61 @@
         <w:pStyle w:val="FirstParagraph"/>
       </w:pPr>
       <w:r>
-        <w:t xml:space="preserve">To test H1 we correlate monthly inflation-attention, the share of corpus posts mentioning inflation, with the</w:t>
-      </w:r>
-      <w:r>
-        <w:t xml:space="preserve"> </w:t>
-      </w:r>
-      <w:r>
-        <w:t xml:space="preserve">Croatian HICP annual rate of change (headline, food, energy), within the 2021 to 2024 monitoring stream. This</w:t>
-      </w:r>
-      <w:r>
-        <w:t xml:space="preserve"> </w:t>
-      </w:r>
-      <w:r>
-        <w:t xml:space="preserve">stream provides 39 months with coverage: 37 consecutive months through January 2024, plus two thin months in</w:t>
-      </w:r>
-      <w:r>
-        <w:t xml:space="preserve"> </w:t>
-      </w:r>
-      <w:r>
-        <w:t xml:space="preserve">June and July 2024 as the stream winds down, so the series is not fully contiguous. The batch-pooled series is</w:t>
-      </w:r>
-      <w:r>
-        <w:t xml:space="preserve"> </w:t>
-      </w:r>
-      <w:r>
-        <w:t xml:space="preserve">reported for completeness only. Within the clean window, attention tracks inflation strongly (Table 6, Figure</w:t>
-      </w:r>
-      <w:r>
-        <w:t xml:space="preserve"> </w:t>
-      </w:r>
-      <w:r>
-        <w:t xml:space="preserve">6): Pearson</w:t>
-      </w:r>
-      <w:r>
-        <w:t xml:space="preserve"> </w:t>
-      </w:r>
-      <w:r>
-        <w:rPr>
-          <w:b/>
-          <w:bCs/>
-        </w:rPr>
-        <w:t xml:space="preserve">r = 0.73</w:t>
-      </w:r>
-      <w:r>
-        <w:t xml:space="preserve"> </w:t>
-      </w:r>
-      <w:r>
-        <w:t xml:space="preserve">with headline HICP (nominal p &lt; 0.001, see the inference cautions below),</w:t>
-      </w:r>
-      <w:r>
-        <w:t xml:space="preserve"> </w:t>
-      </w:r>
-      <w:r>
-        <w:rPr>
-          <w:b/>
-          <w:bCs/>
-        </w:rPr>
-        <w:t xml:space="preserve">0.72</w:t>
-      </w:r>
-      <w:r>
-        <w:t xml:space="preserve"> </w:t>
-      </w:r>
-      <w:r>
-        <w:t xml:space="preserve">with</w:t>
-      </w:r>
-      <w:r>
-        <w:t xml:space="preserve"> </w:t>
-      </w:r>
-      <w:r>
-        <w:t xml:space="preserve">food, and</w:t>
-      </w:r>
-      <w:r>
-        <w:t xml:space="preserve"> </w:t>
-      </w:r>
-      <w:r>
-        <w:rPr>
-          <w:b/>
-          <w:bCs/>
-        </w:rPr>
-        <w:t xml:space="preserve">0.44</w:t>
-      </w:r>
-      <w:r>
-        <w:t xml:space="preserve"> </w:t>
-      </w:r>
-      <w:r>
-        <w:t xml:space="preserve">with energy (Spearman ρ comparable). The threshold form of H1 also holds descriptively. Mean</w:t>
-      </w:r>
-      <w:r>
-        <w:t xml:space="preserve"> </w:t>
-      </w:r>
-      <w:r>
-        <w:t xml:space="preserve">attention is</w:t>
-      </w:r>
-      <w:r>
-        <w:t xml:space="preserve"> </w:t>
-      </w:r>
-      <w:r>
-        <w:rPr>
-          <w:b/>
-          <w:bCs/>
-        </w:rPr>
-        <w:t xml:space="preserve">0.49%</w:t>
-      </w:r>
-      <w:r>
-        <w:t xml:space="preserve"> </w:t>
-      </w:r>
-      <w:r>
-        <w:t xml:space="preserve">of posts in months with headline HICP below 4% (12 months) and</w:t>
-      </w:r>
-      <w:r>
-        <w:t xml:space="preserve"> </w:t>
-      </w:r>
-      <w:r>
-        <w:rPr>
-          <w:b/>
-          <w:bCs/>
-        </w:rPr>
-        <w:t xml:space="preserve">1.17%</w:t>
-      </w:r>
-      <w:r>
-        <w:t xml:space="preserve"> </w:t>
-      </w:r>
-      <w:r>
-        <w:t xml:space="preserve">at or above (27</w:t>
-      </w:r>
-      <w:r>
-        <w:t xml:space="preserve"> </w:t>
-      </w:r>
-      <w:r>
-        <w:t xml:space="preserve">months), a 2.4-fold jump around the threshold of about 4% documented cross-nationally.</w:t>
+        <w:t xml:space="preserve">To test the first hypothesis we correlate monthly inflation-attention, the share of corpus posts mentioning</w:t>
+      </w:r>
+      <w:r>
+        <w:t xml:space="preserve"> </w:t>
+      </w:r>
+      <w:r>
+        <w:t xml:space="preserve">inflation, with the Croatian HICP annual rate of change (headline, food, energy), within the earlier 2021 to</w:t>
+      </w:r>
+      <w:r>
+        <w:t xml:space="preserve"> </w:t>
+      </w:r>
+      <w:r>
+        <w:t xml:space="preserve">2024 collection phase. This phase provides 39 months with coverage: 37 consecutive months through January 2024,</w:t>
+      </w:r>
+      <w:r>
+        <w:t xml:space="preserve"> </w:t>
+      </w:r>
+      <w:r>
+        <w:t xml:space="preserve">plus two thin months in June and July 2024 as the phase winds down, so the series is not fully contiguous. The</w:t>
+      </w:r>
+      <w:r>
+        <w:t xml:space="preserve"> </w:t>
+      </w:r>
+      <w:r>
+        <w:t xml:space="preserve">combined series across both phases is reported for completeness only. Within the clean window, attention tracks</w:t>
+      </w:r>
+      <w:r>
+        <w:t xml:space="preserve"> </w:t>
+      </w:r>
+      <w:r>
+        <w:t xml:space="preserve">inflation strongly (Table 6, Figure 6): Pearson r = 0.73 with headline HICP (nominal p &lt; 0.001, see the</w:t>
+      </w:r>
+      <w:r>
+        <w:t xml:space="preserve"> </w:t>
+      </w:r>
+      <w:r>
+        <w:t xml:space="preserve">inference cautions below), 0.72 with food, and 0.44 with energy (Spearman ρ comparable). The threshold form of</w:t>
+      </w:r>
+      <w:r>
+        <w:t xml:space="preserve"> </w:t>
+      </w:r>
+      <w:r>
+        <w:t xml:space="preserve">the hypothesis also holds descriptively. Mean attention is 0.49% of posts in months with headline HICP below 4%</w:t>
+      </w:r>
+      <w:r>
+        <w:t xml:space="preserve"> </w:t>
+      </w:r>
+      <w:r>
+        <w:t xml:space="preserve">(12 months) and 1.17% at or above (27 months), a 2.4-fold jump around the threshold of about 4% documented</w:t>
+      </w:r>
+      <w:r>
+        <w:t xml:space="preserve"> </w:t>
+      </w:r>
+      <w:r>
+        <w:t xml:space="preserve">cross-nationally.</w:t>
       </w:r>
     </w:p>
     <w:p>
@@ -5299,56 +4416,19 @@
         <w:pStyle w:val="BodyText"/>
       </w:pPr>
       <w:r>
-        <w:t xml:space="preserve">On this evidence</w:t>
-      </w:r>
-      <w:r>
-        <w:t xml:space="preserve"> </w:t>
-      </w:r>
-      <w:r>
-        <w:rPr>
-          <w:b/>
-          <w:bCs/>
-        </w:rPr>
-        <w:t xml:space="preserve">H1 is partially supported</w:t>
-      </w:r>
-      <w:r>
-        <w:t xml:space="preserve">. The attention-price coupling and the descriptive threshold</w:t>
-      </w:r>
-      <w:r>
-        <w:t xml:space="preserve"> </w:t>
-      </w:r>
-      <w:r>
-        <w:t xml:space="preserve">pattern hold, and food inflation tracks attention as strongly as the headline, but</w:t>
-      </w:r>
-      <w:r>
-        <w:t xml:space="preserve"> </w:t>
-      </w:r>
-      <w:r>
-        <w:rPr>
-          <w:b/>
-          <w:bCs/>
-        </w:rPr>
-        <w:t xml:space="preserve">energy couples only</w:t>
-      </w:r>
-      <w:r>
-        <w:rPr>
-          <w:b/>
-          <w:bCs/>
-        </w:rPr>
-        <w:t xml:space="preserve"> </w:t>
-      </w:r>
-      <w:r>
-        <w:rPr>
-          <w:b/>
-          <w:bCs/>
-        </w:rPr>
-        <w:t xml:space="preserve">weakly</w:t>
-      </w:r>
-      <w:r>
-        <w:t xml:space="preserve"> </w:t>
-      </w:r>
-      <w:r>
-        <w:t xml:space="preserve">(r = 0.44). Energy’s large, partly negative swings in 2023 to 2024 loosen its link to attention, so</w:t>
+        <w:t xml:space="preserve">On this evidence the hypothesis is partially supported. The attention-price coupling and the descriptive</w:t>
+      </w:r>
+      <w:r>
+        <w:t xml:space="preserve"> </w:t>
+      </w:r>
+      <w:r>
+        <w:t xml:space="preserve">threshold pattern hold, and food inflation tracks attention as strongly as the headline, but energy couples</w:t>
+      </w:r>
+      <w:r>
+        <w:t xml:space="preserve"> </w:t>
+      </w:r>
+      <w:r>
+        <w:t xml:space="preserve">only weakly (r = 0.44). Energy’s large, partly negative swings in 2023 to 2024 loosen its link to attention, so</w:t>
       </w:r>
       <w:r>
         <w:t xml:space="preserve"> </w:t>
@@ -5390,19 +4470,19 @@
         <w:t xml:space="preserve"> </w:t>
       </w:r>
       <w:r>
-        <w:t xml:space="preserve">and dropping the thinnest tail month gives r = 0.72, while the batch-pooled series attenuates it (headline</w:t>
-      </w:r>
-      <w:r>
-        <w:t xml:space="preserve"> </w:t>
-      </w:r>
-      <w:r>
-        <w:t xml:space="preserve">r = 0.63), consistent with the 2024 seam adding noise. The religion-linked core is too sparse for a monthly</w:t>
-      </w:r>
-      <w:r>
-        <w:t xml:space="preserve"> </w:t>
-      </w:r>
-      <w:r>
-        <w:t xml:space="preserve">test, but its annual volume aligns with inflation, since both peak in 2022.</w:t>
+        <w:t xml:space="preserve">and dropping the thinnest tail month gives r = 0.72, while the combined series across both phases attenuates it</w:t>
+      </w:r>
+      <w:r>
+        <w:t xml:space="preserve"> </w:t>
+      </w:r>
+      <w:r>
+        <w:t xml:space="preserve">(headline r = 0.63), consistent with the 2024 seam adding noise. The religion-linked core is too sparse for a</w:t>
+      </w:r>
+      <w:r>
+        <w:t xml:space="preserve"> </w:t>
+      </w:r>
+      <w:r>
+        <w:t xml:space="preserve">monthly test, but its annual volume aligns with inflation, since both peak in 2022.</w:t>
       </w:r>
     </w:p>
     <w:p>
@@ -5420,7 +4500,7 @@
           <w:i/>
           <w:iCs/>
         </w:rPr>
-        <w:t xml:space="preserve">Inflation-attention versus HICP (monthly, within the 2021–2024 stream, n = 39 months with coverage, not fully contiguous)</w:t>
+        <w:t xml:space="preserve">Inflation-attention versus HICP (monthly, within the earlier 2021–2024 phase, n = 39 months with coverage, not fully contiguous)</w:t>
       </w:r>
     </w:p>
     <w:tbl>
@@ -5591,16 +4671,7 @@
         <w:pStyle w:val="BodyText"/>
       </w:pPr>
       <w:r>
-        <w:t xml:space="preserve">Source: Authors’ calculation from the DigiKat corpus and Eurostat (</w:t>
-      </w:r>
-      <w:r>
-        <w:rPr>
-          <w:rStyle w:val="VerbatimChar"/>
-        </w:rPr>
-        <w:t xml:space="preserve">prc_hicp_manr</w:t>
-      </w:r>
-      <w:r>
-        <w:t xml:space="preserve">).</w:t>
+        <w:t xml:space="preserve">Source: Authors’ calculation from the DigiKat corpus and Eurostat.</w:t>
       </w:r>
     </w:p>
     <w:p>
@@ -5618,7 +4689,7 @@
           <w:i/>
           <w:iCs/>
         </w:rPr>
-        <w:t xml:space="preserve">Inflation-attention versus HICP, 2021–2024 monitoring stream</w:t>
+        <w:t xml:space="preserve">Inflation-attention versus HICP, earlier 2021–2024 collection phase</w:t>
       </w:r>
     </w:p>
     <w:p>
@@ -5687,16 +4758,7 @@
         <w:t xml:space="preserve"> </w:t>
       </w:r>
       <w:r>
-        <w:t xml:space="preserve">Source: Authors’ calculation from the DigiKat corpus and Eurostat (</w:t>
-      </w:r>
-      <w:r>
-        <w:rPr>
-          <w:rStyle w:val="VerbatimChar"/>
-        </w:rPr>
-        <w:t xml:space="preserve">prc_hicp_manr</w:t>
-      </w:r>
-      <w:r>
-        <w:t xml:space="preserve">).</w:t>
+        <w:t xml:space="preserve">Source: Authors’ calculation from the DigiKat corpus and Eurostat.</w:t>
       </w:r>
     </w:p>
     <w:bookmarkEnd w:id="47"/>
@@ -5863,23 +4925,7 @@
         <w:t xml:space="preserve"> </w:t>
       </w:r>
       <w:r>
-        <w:t xml:space="preserve">attention, once linkage is measured, the</w:t>
-      </w:r>
-      <w:r>
-        <w:t xml:space="preserve"> </w:t>
-      </w:r>
-      <w:r>
-        <w:rPr>
-          <w:b/>
-          <w:bCs/>
-        </w:rPr>
-        <w:t xml:space="preserve">religious</w:t>
-      </w:r>
-      <w:r>
-        <w:t xml:space="preserve"> </w:t>
-      </w:r>
-      <w:r>
-        <w:t xml:space="preserve">engagement is small and, where present, non-prophetic. The</w:t>
+        <w:t xml:space="preserve">attention, once linkage is measured, the religious engagement is small and, where present, non-prophetic. The</w:t>
       </w:r>
       <w:r>
         <w:t xml:space="preserve"> </w:t>
@@ -5967,7 +5013,7 @@
         <w:pStyle w:val="BodyText"/>
       </w:pPr>
       <w:r>
-        <w:t xml:space="preserve">Mechanism and timing also matter here. Within the 2021 to 2024 stream, the pattern is consistent with an</w:t>
+        <w:t xml:space="preserve">Mechanism and timing also matter here. Within the earlier 2021 to 2024 phase, the pattern is consistent with an</w:t>
       </w:r>
       <w:r>
         <w:t xml:space="preserve"> </w:t>
@@ -5985,51 +5031,19 @@
         <w:t xml:space="preserve"> </w:t>
       </w:r>
       <w:r>
-        <w:t xml:space="preserve">within-stream evidence, the dynamic looks closer to</w:t>
-      </w:r>
-      <w:r>
-        <w:t xml:space="preserve"> </w:t>
-      </w:r>
-      <w:r>
-        <w:rPr>
-          <w:b/>
-          <w:bCs/>
-        </w:rPr>
-        <w:t xml:space="preserve">resonance</w:t>
-      </w:r>
-      <w:r>
-        <w:t xml:space="preserve"> </w:t>
-      </w:r>
-      <w:r>
-        <w:t xml:space="preserve">than to</w:t>
-      </w:r>
-      <w:r>
-        <w:t xml:space="preserve"> </w:t>
-      </w:r>
-      <w:r>
-        <w:rPr>
-          <w:b/>
-          <w:bCs/>
-        </w:rPr>
-        <w:t xml:space="preserve">setting</w:t>
-      </w:r>
-      <w:r>
-        <w:t xml:space="preserve"> </w:t>
-      </w:r>
-      <w:r>
-        <w:t xml:space="preserve">(H2, provisional). Religion</w:t>
-      </w:r>
-      <w:r>
-        <w:t xml:space="preserve"> </w:t>
-      </w:r>
-      <w:r>
-        <w:t xml:space="preserve">enters inflation discourse reactively, as an affected party, rather than as an agenda-setter for economic</w:t>
-      </w:r>
-      <w:r>
-        <w:t xml:space="preserve"> </w:t>
-      </w:r>
-      <w:r>
-        <w:t xml:space="preserve">justice.</w:t>
+        <w:t xml:space="preserve">within-phase evidence, the dynamic looks closer to resonance than to setting, in line with the second</w:t>
+      </w:r>
+      <w:r>
+        <w:t xml:space="preserve"> </w:t>
+      </w:r>
+      <w:r>
+        <w:t xml:space="preserve">hypothesis, though only provisionally. Religion enters inflation discourse reactively, as an affected party,</w:t>
+      </w:r>
+      <w:r>
+        <w:t xml:space="preserve"> </w:t>
+      </w:r>
+      <w:r>
+        <w:t xml:space="preserve">rather than as an agenda-setter for economic justice.</w:t>
       </w:r>
     </w:p>
     <w:p>
@@ -6173,77 +5187,25 @@
         <w:pStyle w:val="BodyText"/>
       </w:pPr>
       <w:r>
-        <w:t xml:space="preserve">To summarize the hypothesis scorecard, H1, attention-price coupling, is</w:t>
-      </w:r>
-      <w:r>
-        <w:t xml:space="preserve"> </w:t>
-      </w:r>
-      <w:r>
-        <w:rPr>
-          <w:b/>
-          <w:bCs/>
-        </w:rPr>
-        <w:t xml:space="preserve">partially supported</w:t>
-      </w:r>
-      <w:r>
-        <w:t xml:space="preserve">: the coupling</w:t>
-      </w:r>
-      <w:r>
-        <w:t xml:space="preserve"> </w:t>
-      </w:r>
-      <w:r>
-        <w:t xml:space="preserve">holds, though energy couples only weakly. H2, resonance not setting, is</w:t>
-      </w:r>
-      <w:r>
-        <w:t xml:space="preserve"> </w:t>
-      </w:r>
-      <w:r>
-        <w:rPr>
-          <w:b/>
-          <w:bCs/>
-        </w:rPr>
-        <w:t xml:space="preserve">provisionally consistent</w:t>
-      </w:r>
-      <w:r>
-        <w:t xml:space="preserve">, pending</w:t>
-      </w:r>
-      <w:r>
-        <w:t xml:space="preserve"> </w:t>
-      </w:r>
-      <w:r>
-        <w:t xml:space="preserve">a lead-lag test. P3, the prophetic-actor proposition, is</w:t>
-      </w:r>
-      <w:r>
-        <w:t xml:space="preserve"> </w:t>
-      </w:r>
-      <w:r>
-        <w:rPr>
-          <w:b/>
-          <w:bCs/>
-        </w:rPr>
-        <w:t xml:space="preserve">not visible in the digital-news measure</w:t>
-      </w:r>
-      <w:r>
-        <w:t xml:space="preserve">, since the</w:t>
-      </w:r>
-      <w:r>
-        <w:t xml:space="preserve"> </w:t>
-      </w:r>
-      <w:r>
-        <w:t xml:space="preserve">actor-level claim is not testable here. P4, episodic over thematic, is</w:t>
-      </w:r>
-      <w:r>
-        <w:t xml:space="preserve"> </w:t>
-      </w:r>
-      <w:r>
-        <w:rPr>
-          <w:b/>
-          <w:bCs/>
-        </w:rPr>
-        <w:t xml:space="preserve">supported</w:t>
-      </w:r>
-      <w:r>
-        <w:t xml:space="preserve">, in part by construction</w:t>
+        <w:t xml:space="preserve">To summarize the hypothesis scorecard, H1, attention-price coupling, is partially supported: the coupling</w:t>
+      </w:r>
+      <w:r>
+        <w:t xml:space="preserve"> </w:t>
+      </w:r>
+      <w:r>
+        <w:t xml:space="preserve">holds, though energy couples only weakly. H2, resonance not setting, is provisionally consistent, pending</w:t>
+      </w:r>
+      <w:r>
+        <w:t xml:space="preserve"> </w:t>
+      </w:r>
+      <w:r>
+        <w:t xml:space="preserve">a lead-lag test. P3, the prophetic-actor proposition, is not visible in the digital-news measure, since the</w:t>
+      </w:r>
+      <w:r>
+        <w:t xml:space="preserve"> </w:t>
+      </w:r>
+      <w:r>
+        <w:t xml:space="preserve">actor-level claim is not testable here. P4, episodic over thematic, is supported, in part by construction</w:t>
       </w:r>
       <w:r>
         <w:t xml:space="preserve"> </w:t>
@@ -6348,41 +5310,31 @@
         <w:pStyle w:val="FirstParagraph"/>
       </w:pPr>
       <w:r>
-        <w:t xml:space="preserve">Several limitations qualify these findings. The corpus mixes two collection streams with very different</w:t>
-      </w:r>
-      <w:r>
-        <w:t xml:space="preserve"> </w:t>
-      </w:r>
-      <w:r>
-        <w:t xml:space="preserve">confirmation rates at their 2024 overlap (0.86 versus 0.21), so we read temporal trends</w:t>
-      </w:r>
-      <w:r>
-        <w:t xml:space="preserve"> </w:t>
-      </w:r>
-      <w:r>
-        <w:rPr>
-          <w:b/>
-          <w:bCs/>
-        </w:rPr>
-        <w:t xml:space="preserve">within</w:t>
-      </w:r>
-      <w:r>
-        <w:t xml:space="preserve"> </w:t>
-      </w:r>
-      <w:r>
-        <w:t xml:space="preserve">stream and do</w:t>
-      </w:r>
-      <w:r>
-        <w:t xml:space="preserve"> </w:t>
-      </w:r>
-      <w:r>
-        <w:t xml:space="preserve">not claim a decline across the 2024 seam. A stream-conditioned re-coding is the single highest-value robustness</w:t>
-      </w:r>
-      <w:r>
-        <w:t xml:space="preserve"> </w:t>
-      </w:r>
-      <w:r>
-        <w:t xml:space="preserve">check. Inter-annotator agreement is high (0.97), but this is inter-model reliability, not a human gold</w:t>
+        <w:t xml:space="preserve">Several limitations qualify these findings. The corpus was assembled in two collection phases that confirm</w:t>
+      </w:r>
+      <w:r>
+        <w:t xml:space="preserve"> </w:t>
+      </w:r>
+      <w:r>
+        <w:t xml:space="preserve">genuine linkage at very different rates where they overlap in 2024, so we read temporal trends within a single</w:t>
+      </w:r>
+      <w:r>
+        <w:t xml:space="preserve"> </w:t>
+      </w:r>
+      <w:r>
+        <w:t xml:space="preserve">phase and do not claim a decline across the 2024 seam. A re-coding that conditions on collection phase is the</w:t>
+      </w:r>
+      <w:r>
+        <w:t xml:space="preserve"> </w:t>
+      </w:r>
+      <w:r>
+        <w:t xml:space="preserve">single highest-value robustness check. Inter-annotator agreement is high (0.97), but this is inter-model</w:t>
+      </w:r>
+      <w:r>
+        <w:t xml:space="preserve"> </w:t>
+      </w:r>
+      <w:r>
+        <w:t xml:space="preserve">reliability, not a human gold</w:t>
       </w:r>
       <w:r>
         <w:t xml:space="preserve"> </w:t>
@@ -6412,23 +5364,7 @@
         <w:t xml:space="preserve"> </w:t>
       </w:r>
       <w:r>
-        <w:t xml:space="preserve">cases. As defined,</w:t>
-      </w:r>
-      <w:r>
-        <w:t xml:space="preserve"> </w:t>
-      </w:r>
-      <w:r>
-        <w:rPr>
-          <w:b/>
-          <w:bCs/>
-        </w:rPr>
-        <w:t xml:space="preserve">Church-as-institution</w:t>
-      </w:r>
-      <w:r>
-        <w:t xml:space="preserve"> </w:t>
-      </w:r>
-      <w:r>
-        <w:t xml:space="preserve">also mixes the institution as an affected party with clergy as</w:t>
+        <w:t xml:space="preserve">cases. As defined, Church-as-institution also mixes the institution as an affected party with clergy as</w:t>
       </w:r>
       <w:r>
         <w:t xml:space="preserve"> </w:t>
@@ -6502,19 +5438,19 @@
         <w:t xml:space="preserve"> </w:t>
       </w:r>
       <w:r>
-        <w:t xml:space="preserve">window-sensitivity check addresses this. H1 is also tested only at the level of corpus-wide</w:t>
-      </w:r>
-      <w:r>
-        <w:t xml:space="preserve"> </w:t>
-      </w:r>
-      <w:r>
-        <w:t xml:space="preserve">inflation-attention. A monthly HICP overlay on the religion-linked core specifically is too sparse to test, and</w:t>
-      </w:r>
-      <w:r>
-        <w:t xml:space="preserve"> </w:t>
-      </w:r>
-      <w:r>
-        <w:t xml:space="preserve">the H2 lead-lag test against public search interest is future work.</w:t>
+        <w:t xml:space="preserve">window-sensitivity check addresses this. The attention-price test is also conducted only at the level of</w:t>
+      </w:r>
+      <w:r>
+        <w:t xml:space="preserve"> </w:t>
+      </w:r>
+      <w:r>
+        <w:t xml:space="preserve">corpus-wide inflation-attention. A monthly HICP overlay on the religion-linked core specifically is too sparse</w:t>
+      </w:r>
+      <w:r>
+        <w:t xml:space="preserve"> </w:t>
+      </w:r>
+      <w:r>
+        <w:t xml:space="preserve">to test, and the lead-lag test of resonance against public search interest is future work.</w:t>
       </w:r>
     </w:p>
     <w:p>
@@ -6636,82 +5572,31 @@
         <w:pStyle w:val="FirstParagraph"/>
       </w:pPr>
       <w:r>
-        <w:t xml:space="preserve">Tracked aggregates, coded outputs, tables and figures are in the study</w:t>
-      </w:r>
-      <w:r>
-        <w:t xml:space="preserve"> </w:t>
-      </w:r>
-      <w:r>
-        <w:rPr>
-          <w:rStyle w:val="VerbatimChar"/>
-        </w:rPr>
-        <w:t xml:space="preserve">output/</w:t>
-      </w:r>
-      <w:r>
-        <w:t xml:space="preserve"> </w:t>
-      </w:r>
-      <w:r>
-        <w:t xml:space="preserve">directory</w:t>
-      </w:r>
-      <w:r>
-        <w:t xml:space="preserve"> </w:t>
-      </w:r>
-      <w:r>
-        <w:t xml:space="preserve">(</w:t>
-      </w:r>
-      <w:r>
-        <w:rPr>
-          <w:rStyle w:val="VerbatimChar"/>
-        </w:rPr>
-        <w:t xml:space="preserve">analysis_core_coded.csv</w:t>
-      </w:r>
-      <w:r>
-        <w:t xml:space="preserve">, the</w:t>
-      </w:r>
-      <w:r>
-        <w:t xml:space="preserve"> </w:t>
-      </w:r>
-      <w:r>
-        <w:rPr>
-          <w:rStyle w:val="VerbatimChar"/>
-        </w:rPr>
-        <w:t xml:space="preserve">tables/</w:t>
-      </w:r>
-      <w:r>
-        <w:t xml:space="preserve"> </w:t>
-      </w:r>
-      <w:r>
-        <w:t xml:space="preserve">folder,</w:t>
-      </w:r>
-      <w:r>
-        <w:t xml:space="preserve"> </w:t>
-      </w:r>
-      <w:r>
-        <w:rPr>
-          <w:rStyle w:val="VerbatimChar"/>
-        </w:rPr>
-        <w:t xml:space="preserve">hicp_hr.csv</w:t>
-      </w:r>
-      <w:r>
-        <w:t xml:space="preserve">). The underlying master corpus contains scraped</w:t>
-      </w:r>
-      <w:r>
-        <w:t xml:space="preserve"> </w:t>
-      </w:r>
-      <w:r>
-        <w:t xml:space="preserve">post text and is not redistributable. Analyses are reproducible from the numbered pipeline scripts (Appendix A)</w:t>
-      </w:r>
-      <w:r>
-        <w:t xml:space="preserve"> </w:t>
-      </w:r>
-      <w:r>
-        <w:t xml:space="preserve">given access to the master. The measured-core file carries URLs and text excerpts and is held internally</w:t>
-      </w:r>
-      <w:r>
-        <w:t xml:space="preserve"> </w:t>
-      </w:r>
-      <w:r>
-        <w:t xml:space="preserve">pending a statistical-disclosure review.</w:t>
+        <w:t xml:space="preserve">The aggregate outputs behind every table and figure, together with the coded data and the HICP price series,</w:t>
+      </w:r>
+      <w:r>
+        <w:t xml:space="preserve"> </w:t>
+      </w:r>
+      <w:r>
+        <w:t xml:space="preserve">are available on request. The underlying corpus contains scraped post text and is not redistributable, so the</w:t>
+      </w:r>
+      <w:r>
+        <w:t xml:space="preserve"> </w:t>
+      </w:r>
+      <w:r>
+        <w:t xml:space="preserve">analysis is reproducible from the aggregate data and the analysis scripts rather than from the raw corpus. The</w:t>
+      </w:r>
+      <w:r>
+        <w:t xml:space="preserve"> </w:t>
+      </w:r>
+      <w:r>
+        <w:t xml:space="preserve">measured-core file carries URLs and text excerpts and is held internally pending a statistical-disclosure</w:t>
+      </w:r>
+      <w:r>
+        <w:t xml:space="preserve"> </w:t>
+      </w:r>
+      <w:r>
+        <w:t xml:space="preserve">review.</w:t>
       </w:r>
     </w:p>
     <w:bookmarkEnd w:id="53"/>
@@ -7150,70 +6035,19 @@
         <w:pStyle w:val="FirstParagraph"/>
       </w:pPr>
       <w:r>
-        <w:rPr>
-          <w:i/>
-          <w:iCs/>
-        </w:rPr>
-        <w:t xml:space="preserve">Some literature entries remain to be verified against Hrčak / CrossRef before submission. See</w:t>
-      </w:r>
-      <w:r>
-        <w:rPr>
-          <w:i/>
-          <w:iCs/>
-        </w:rPr>
-        <w:t xml:space="preserve"> </w:t>
-      </w:r>
-      <w:r>
-        <w:rPr>
-          <w:rStyle w:val="VerbatimChar"/>
-          <w:i/>
-          <w:iCs/>
-        </w:rPr>
-        <w:t xml:space="preserve">LITERATURE.md</w:t>
-      </w:r>
-      <w:r>
-        <w:rPr>
-          <w:i/>
-          <w:iCs/>
-        </w:rPr>
-        <w:t xml:space="preserve">.</w:t>
-      </w:r>
-      <w:r>
-        <w:t xml:space="preserve"> </w:t>
-      </w:r>
-      <w:r>
-        <w:rPr>
-          <w:b/>
-          <w:bCs/>
-        </w:rPr>
-        <w:t xml:space="preserve">Data source:</w:t>
-      </w:r>
-      <w:r>
-        <w:t xml:space="preserve"> </w:t>
-      </w:r>
-      <w:r>
-        <w:t xml:space="preserve">Croatian HICP annual rate of change (Eurostat</w:t>
-      </w:r>
-      <w:r>
-        <w:t xml:space="preserve"> </w:t>
-      </w:r>
-      <w:r>
-        <w:rPr>
-          <w:rStyle w:val="VerbatimChar"/>
-        </w:rPr>
-        <w:t xml:space="preserve">prc_hicp_manr</w:t>
-      </w:r>
-      <w:r>
-        <w:t xml:space="preserve">, all-items/food/energy, monthly), retrieved 2026-07-01 (</w:t>
-      </w:r>
-      <w:r>
-        <w:rPr>
-          <w:rStyle w:val="VerbatimChar"/>
-        </w:rPr>
-        <w:t xml:space="preserve">output/hicp_hr.csv</w:t>
-      </w:r>
-      <w:r>
-        <w:t xml:space="preserve">).</w:t>
+        <w:t xml:space="preserve">Some literature entries remain to be verified against Hrčak and CrossRef before submission. The price data are</w:t>
+      </w:r>
+      <w:r>
+        <w:t xml:space="preserve"> </w:t>
+      </w:r>
+      <w:r>
+        <w:t xml:space="preserve">the Croatian HICP annual rate of change (all items, food, and energy, monthly) from Eurostat, retrieved on 1</w:t>
+      </w:r>
+      <w:r>
+        <w:t xml:space="preserve"> </w:t>
+      </w:r>
+      <w:r>
+        <w:t xml:space="preserve">July 2026.</w:t>
       </w:r>
     </w:p>
     <w:bookmarkEnd w:id="56"/>
@@ -7231,142 +6065,43 @@
         <w:pStyle w:val="FirstParagraph"/>
       </w:pPr>
       <w:r>
-        <w:t xml:space="preserve">Pipeline:</w:t>
-      </w:r>
-      <w:r>
-        <w:t xml:space="preserve"> </w:t>
-      </w:r>
-      <w:r>
-        <w:rPr>
-          <w:rStyle w:val="VerbatimChar"/>
-        </w:rPr>
-        <w:t xml:space="preserve">10_rerun_fixed.R</w:t>
-      </w:r>
-      <w:r>
-        <w:t xml:space="preserve"> </w:t>
-      </w:r>
-      <w:r>
-        <w:t xml:space="preserve">(tagging + linkage + fixes) →</w:t>
-      </w:r>
-      <w:r>
-        <w:t xml:space="preserve"> </w:t>
-      </w:r>
-      <w:r>
-        <w:rPr>
-          <w:rStyle w:val="VerbatimChar"/>
-        </w:rPr>
-        <w:t xml:space="preserve">13_make_coding_pool.R</w:t>
-      </w:r>
-      <w:r>
-        <w:t xml:space="preserve"> </w:t>
-      </w:r>
-      <w:r>
-        <w:t xml:space="preserve">(1,450-candidate pool +</w:t>
-      </w:r>
-      <w:r>
-        <w:t xml:space="preserve"> </w:t>
-      </w:r>
-      <w:r>
-        <w:t xml:space="preserve">annotation batches) → the</w:t>
-      </w:r>
-      <w:r>
-        <w:t xml:space="preserve"> </w:t>
-      </w:r>
-      <w:r>
-        <w:rPr>
-          <w:rStyle w:val="VerbatimChar"/>
-        </w:rPr>
-        <w:t xml:space="preserve">code-candidate-pool</w:t>
-      </w:r>
-      <w:r>
-        <w:t xml:space="preserve"> </w:t>
-      </w:r>
-      <w:r>
-        <w:t xml:space="preserve">workflow (3 annotators × 20 batches, majority) →</w:t>
-      </w:r>
-      <w:r>
-        <w:t xml:space="preserve"> </w:t>
-      </w:r>
-      <w:r>
-        <w:rPr>
-          <w:rStyle w:val="VerbatimChar"/>
-        </w:rPr>
-        <w:t xml:space="preserve">14_finalize_coded.R</w:t>
-      </w:r>
-      <w:r>
-        <w:t xml:space="preserve"> </w:t>
-      </w:r>
-      <w:r>
-        <w:t xml:space="preserve">(measured core) →</w:t>
-      </w:r>
-      <w:r>
-        <w:t xml:space="preserve"> </w:t>
-      </w:r>
-      <w:r>
-        <w:rPr>
-          <w:rStyle w:val="VerbatimChar"/>
-        </w:rPr>
-        <w:t xml:space="preserve">15_paper_analysis.R</w:t>
-      </w:r>
-      <w:r>
-        <w:t xml:space="preserve"> </w:t>
-      </w:r>
-      <w:r>
-        <w:t xml:space="preserve">(register/outlet/sentiment tables + figures) →</w:t>
-      </w:r>
-      <w:r>
-        <w:t xml:space="preserve"> </w:t>
-      </w:r>
-      <w:r>
-        <w:rPr>
-          <w:rStyle w:val="VerbatimChar"/>
-        </w:rPr>
-        <w:t xml:space="preserve">16_review_response.R</w:t>
-      </w:r>
-      <w:r>
-        <w:t xml:space="preserve"> </w:t>
-      </w:r>
-      <w:r>
-        <w:t xml:space="preserve">(stream conditioning, hkm.hr decomposition, latent-justice bound) →</w:t>
-      </w:r>
-      <w:r>
-        <w:t xml:space="preserve"> </w:t>
-      </w:r>
-      <w:r>
-        <w:rPr>
-          <w:rStyle w:val="VerbatimChar"/>
-        </w:rPr>
-        <w:t xml:space="preserve">17_h1_hicp.R</w:t>
-      </w:r>
-      <w:r>
-        <w:t xml:space="preserve"> </w:t>
-      </w:r>
-      <w:r>
-        <w:t xml:space="preserve">(H1 test). Run against the master (R path in</w:t>
-      </w:r>
-      <w:r>
-        <w:t xml:space="preserve"> </w:t>
-      </w:r>
-      <w:r>
-        <w:rPr>
-          <w:rStyle w:val="VerbatimChar"/>
-        </w:rPr>
-        <w:t xml:space="preserve">CLAUDE.local.md</w:t>
-      </w:r>
-      <w:r>
-        <w:t xml:space="preserve">). Coded data:</w:t>
-      </w:r>
-      <w:r>
-        <w:t xml:space="preserve"> </w:t>
-      </w:r>
-      <w:r>
-        <w:rPr>
-          <w:rStyle w:val="VerbatimChar"/>
-        </w:rPr>
-        <w:t xml:space="preserve">output/analysis_core_coded.{rds,csv}</w:t>
-      </w:r>
-      <w:r>
-        <w:t xml:space="preserve">.</w:t>
+        <w:t xml:space="preserve">The analysis proceeds in five stages. We first tag inflation mentions and identify candidate religion-inflation</w:t>
+      </w:r>
+      <w:r>
+        <w:t xml:space="preserve"> </w:t>
+      </w:r>
+      <w:r>
+        <w:t xml:space="preserve">links in the corpus. We then assemble the 1,450-candidate pool and prepare it for coding. Three annotators code</w:t>
+      </w:r>
+      <w:r>
+        <w:t xml:space="preserve"> </w:t>
+      </w:r>
+      <w:r>
+        <w:t xml:space="preserve">the pool independently and their labels are combined by majority. From the coded pool we derive the measured</w:t>
+      </w:r>
+      <w:r>
+        <w:t xml:space="preserve"> </w:t>
+      </w:r>
+      <w:r>
+        <w:t xml:space="preserve">core, and from the core we compute the register, outlet, and sentiment tables and figures, the collection-phase</w:t>
+      </w:r>
+      <w:r>
+        <w:t xml:space="preserve"> </w:t>
+      </w:r>
+      <w:r>
+        <w:t xml:space="preserve">robustness checks, and the attention-price test against HICP. The analysis scripts and the coded data underlying</w:t>
+      </w:r>
+      <w:r>
+        <w:t xml:space="preserve"> </w:t>
+      </w:r>
+      <w:r>
+        <w:t xml:space="preserve">every table and figure are available on request. The underlying corpus of scraped post text is not</w:t>
+      </w:r>
+      <w:r>
+        <w:t xml:space="preserve"> </w:t>
+      </w:r>
+      <w:r>
+        <w:t xml:space="preserve">redistributable.</w:t>
       </w:r>
     </w:p>
     <w:bookmarkEnd w:id="57"/>
@@ -7384,49 +6119,25 @@
         <w:pStyle w:val="FirstParagraph"/>
       </w:pPr>
       <w:r>
-        <w:t xml:space="preserve">Four axes (see Data and Methods). In held-out validation (n = 80), inter-annotator agreement was 0.975 for</w:t>
-      </w:r>
-      <w:r>
-        <w:t xml:space="preserve"> </w:t>
-      </w:r>
-      <w:r>
-        <w:t xml:space="preserve">inflation, 0.967 for linkage, 0.992 for foreign/domestic, and 0.46 for register. Classifier held-out precision</w:t>
-      </w:r>
-      <w:r>
-        <w:t xml:space="preserve"> </w:t>
-      </w:r>
-      <w:r>
-        <w:t xml:space="preserve">for domestic linkage was about 0.38 to 0.46, with a recall of about 0.89. Full-pool coding confirmed that 45% of</w:t>
-      </w:r>
-      <w:r>
-        <w:t xml:space="preserve"> </w:t>
-      </w:r>
-      <w:r>
-        <w:t xml:space="preserve">candidates were genuinely linked. Full log:</w:t>
-      </w:r>
-      <w:r>
-        <w:t xml:space="preserve"> </w:t>
-      </w:r>
-      <w:r>
-        <w:rPr>
-          <w:rStyle w:val="VerbatimChar"/>
-        </w:rPr>
-        <w:t xml:space="preserve">VALIDATION.md</w:t>
-      </w:r>
-      <w:r>
-        <w:t xml:space="preserve">,</w:t>
-      </w:r>
-      <w:r>
-        <w:t xml:space="preserve"> </w:t>
-      </w:r>
-      <w:r>
-        <w:rPr>
-          <w:rStyle w:val="VerbatimChar"/>
-        </w:rPr>
-        <w:t xml:space="preserve">REVIEW_RESPONSE.md</w:t>
-      </w:r>
-      <w:r>
-        <w:t xml:space="preserve">.</w:t>
+        <w:t xml:space="preserve">The four coding axes are described in the Data and Methods section. In held-out validation (n = 80),</w:t>
+      </w:r>
+      <w:r>
+        <w:t xml:space="preserve"> </w:t>
+      </w:r>
+      <w:r>
+        <w:t xml:space="preserve">inter-annotator agreement was 0.975 for inflation, 0.967 for linkage, 0.992 for foreign versus domestic, and</w:t>
+      </w:r>
+      <w:r>
+        <w:t xml:space="preserve"> </w:t>
+      </w:r>
+      <w:r>
+        <w:t xml:space="preserve">0.46 for register. The proximity filter’s held-out precision for domestic linkage was about 0.38 to 0.46, with</w:t>
+      </w:r>
+      <w:r>
+        <w:t xml:space="preserve"> </w:t>
+      </w:r>
+      <w:r>
+        <w:t xml:space="preserve">a recall of about 0.89. Full-pool coding confirmed that 45% of candidates were genuinely linked.</w:t>
       </w:r>
     </w:p>
     <w:bookmarkEnd w:id="58"/>
@@ -7560,17 +6271,7 @@
               <w:pStyle w:val="Compact"/>
             </w:pPr>
             <w:r>
-              <w:rPr>
-                <w:b/>
-                <w:bCs/>
-              </w:rPr>
-              <w:t xml:space="preserve">Partially supported</w:t>
-            </w:r>
-            <w:r>
-              <w:t xml:space="preserve"> </w:t>
-            </w:r>
-            <w:r>
-              <w:t xml:space="preserve">(r about 0.73, attention 0.49% to 1.17% across the threshold, food about equal to headline, but energy only weakly coupled at r = 0.44)</w:t>
+              <w:t xml:space="preserve">Partially supported (r about 0.73, attention 0.49% to 1.17% across the threshold, food about equal to headline, but energy only weakly coupled at r = 0.44)</w:t>
             </w:r>
           </w:p>
         </w:tc>
@@ -7616,14 +6317,7 @@
               <w:pStyle w:val="Compact"/>
             </w:pPr>
             <w:r>
-              <w:rPr>
-                <w:b/>
-                <w:bCs/>
-              </w:rPr>
-              <w:t xml:space="preserve">Provisionally consistent</w:t>
-            </w:r>
-            <w:r>
-              <w:t xml:space="preserve">, with a lead-lag test still pending</w:t>
+              <w:t xml:space="preserve">Provisionally consistent, with a lead-lag test still pending</w:t>
             </w:r>
           </w:p>
         </w:tc>
@@ -7669,17 +6363,7 @@
               <w:pStyle w:val="Compact"/>
             </w:pPr>
             <w:r>
-              <w:rPr>
-                <w:b/>
-                <w:bCs/>
-              </w:rPr>
-              <w:t xml:space="preserve">Not visible in the digital-news measure</w:t>
-            </w:r>
-            <w:r>
-              <w:t xml:space="preserve"> </w:t>
-            </w:r>
-            <w:r>
-              <w:t xml:space="preserve">(3% under strict coding, at most 8% broadly, with no rise over time), since the actor-level claim is not testable in a news corpus</w:t>
+              <w:t xml:space="preserve">Not visible in the digital-news measure (3% under strict coding, at most 8% broadly, with no rise over time), since the actor-level claim is not testable in a news corpus</w:t>
             </w:r>
           </w:p>
         </w:tc>
@@ -7725,17 +6409,7 @@
               <w:pStyle w:val="Compact"/>
             </w:pPr>
             <w:r>
-              <w:rPr>
-                <w:b/>
-                <w:bCs/>
-              </w:rPr>
-              <w:t xml:space="preserve">Supported</w:t>
-            </w:r>
-            <w:r>
-              <w:t xml:space="preserve"> </w:t>
-            </w:r>
-            <w:r>
-              <w:t xml:space="preserve">(episodic registers</w:t>
+              <w:t xml:space="preserve">Supported (episodic registers</w:t>
             </w:r>
             <w:r>
               <w:t xml:space="preserve"> </w:t>

</xml_diff>